<commit_message>
Ajustes na documentação 1
Adicionado calendário de atividades
</commit_message>
<xml_diff>
--- a/Projeto de Engenharia de Software (Documentação).docx
+++ b/Projeto de Engenharia de Software (Documentação).docx
@@ -474,6 +474,7 @@
         <w:t>Vinhato</w:t>
       </w:r>
       <w:proofErr w:type="spellEnd"/>
+      <w:proofErr w:type="gramStart"/>
       <w:r>
         <w:rPr>
           <w:rFonts w:eastAsia="Times New Roman" w:cstheme="minorHAnsi"/>
@@ -492,19 +493,18 @@
           <w:szCs w:val="36"/>
           <w:lang w:eastAsia="pt-BR"/>
         </w:rPr>
-        <w:t xml:space="preserve"> Ba</w:t>
-      </w:r>
-      <w:bookmarkStart w:id="0" w:name="_GoBack"/>
-      <w:bookmarkEnd w:id="0"/>
-      <w:r>
-        <w:rPr>
-          <w:rFonts w:eastAsia="Times New Roman" w:cstheme="minorHAnsi"/>
-          <w:color w:val="1F1F1F"/>
-          <w:sz w:val="36"/>
-          <w:szCs w:val="36"/>
-          <w:lang w:eastAsia="pt-BR"/>
-        </w:rPr>
-        <w:t>tista da Silva</w:t>
+        <w:t xml:space="preserve"> </w:t>
+      </w:r>
+      <w:proofErr w:type="gramEnd"/>
+      <w:r>
+        <w:rPr>
+          <w:rFonts w:eastAsia="Times New Roman" w:cstheme="minorHAnsi"/>
+          <w:color w:val="1F1F1F"/>
+          <w:sz w:val="36"/>
+          <w:szCs w:val="36"/>
+          <w:lang w:eastAsia="pt-BR"/>
+        </w:rPr>
+        <w:t>Batista da Silva</w:t>
       </w:r>
       <w:r>
         <w:rPr>
@@ -923,76 +923,8 @@
           <w:lang w:eastAsia="pt-BR"/>
         </w:rPr>
       </w:pPr>
-      <w:r>
-        <w:rPr>
-          <w:rFonts w:eastAsia="Times New Roman" w:cstheme="minorHAnsi"/>
-          <w:b/>
-          <w:bCs/>
-          <w:color w:val="1F1F1F"/>
-          <w:sz w:val="36"/>
-          <w:szCs w:val="36"/>
-          <w:bdr w:val="none" w:sz="0" w:space="0" w:color="auto" w:frame="1"/>
-          <w:lang w:eastAsia="pt-BR"/>
-        </w:rPr>
-        <w:t>Endereço:</w:t>
-      </w:r>
-      <w:r>
-        <w:rPr>
-          <w:rFonts w:eastAsia="Times New Roman" w:cstheme="minorHAnsi"/>
-          <w:color w:val="1F1F1F"/>
-          <w:sz w:val="36"/>
-          <w:szCs w:val="36"/>
-          <w:bdr w:val="none" w:sz="0" w:space="0" w:color="auto" w:frame="1"/>
-          <w:lang w:eastAsia="pt-BR"/>
-        </w:rPr>
-        <w:t xml:space="preserve"> Av. João </w:t>
-      </w:r>
-      <w:proofErr w:type="spellStart"/>
-      <w:r>
-        <w:rPr>
-          <w:rFonts w:eastAsia="Times New Roman" w:cstheme="minorHAnsi"/>
-          <w:color w:val="1F1F1F"/>
-          <w:sz w:val="36"/>
-          <w:szCs w:val="36"/>
-          <w:bdr w:val="none" w:sz="0" w:space="0" w:color="auto" w:frame="1"/>
-          <w:lang w:eastAsia="pt-BR"/>
-        </w:rPr>
-        <w:t>Flauzino</w:t>
-      </w:r>
-      <w:proofErr w:type="spellEnd"/>
-      <w:r>
-        <w:rPr>
-          <w:rFonts w:eastAsia="Times New Roman" w:cstheme="minorHAnsi"/>
-          <w:color w:val="1F1F1F"/>
-          <w:sz w:val="36"/>
-          <w:szCs w:val="36"/>
-          <w:bdr w:val="none" w:sz="0" w:space="0" w:color="auto" w:frame="1"/>
-          <w:lang w:eastAsia="pt-BR"/>
-        </w:rPr>
-        <w:t xml:space="preserve"> Barbosa, 139, Parque Prefeito Lourival José de Almeida, Cândido Mota - SP, CEP 19.885-554.</w:t>
-      </w:r>
-    </w:p>
-    <w:p>
-      <w:pPr>
-        <w:numPr>
-          <w:ilvl w:val="0"/>
-          <w:numId w:val="7"/>
-        </w:numPr>
-        <w:tabs>
-          <w:tab w:val="clear" w:pos="720"/>
-          <w:tab w:val="num" w:pos="0"/>
-        </w:tabs>
-        <w:spacing w:before="100" w:beforeAutospacing="1" w:after="0" w:line="240" w:lineRule="auto"/>
-        <w:ind w:left="0" w:firstLine="0"/>
-        <w:jc w:val="both"/>
-        <w:rPr>
-          <w:rFonts w:eastAsia="Times New Roman" w:cstheme="minorHAnsi"/>
-          <w:color w:val="1F1F1F"/>
-          <w:sz w:val="36"/>
-          <w:szCs w:val="36"/>
-          <w:lang w:eastAsia="pt-BR"/>
-        </w:rPr>
-      </w:pPr>
+      <w:bookmarkStart w:id="0" w:name="_GoBack"/>
+      <w:bookmarkEnd w:id="0"/>
       <w:r>
         <w:rPr>
           <w:rFonts w:eastAsia="Times New Roman" w:cstheme="minorHAnsi"/>
@@ -1291,7 +1223,6 @@
           <w:szCs w:val="36"/>
           <w:lang w:eastAsia="pt-BR"/>
         </w:rPr>
-        <w:lastRenderedPageBreak/>
         <w:pict w14:anchorId="5D114D34">
           <v:rect id="_x0000_i1027" style="width:0;height:1.5pt" o:hralign="center" o:hrstd="t" o:hrnoshade="t" o:hr="t" fillcolor="gray" stroked="f"/>
         </w:pict>
@@ -1345,6 +1276,7 @@
           <w:szCs w:val="36"/>
           <w:lang w:eastAsia="pt-BR"/>
         </w:rPr>
+        <w:lastRenderedPageBreak/>
         <w:t>As tecnologias selecionadas visam atender a escalabilidade, segurança e gratuidade de hospedagem para a fase de testes:</w:t>
       </w:r>
     </w:p>
@@ -2011,6 +1943,430 @@
           <w:szCs w:val="32"/>
         </w:rPr>
       </w:pPr>
+    </w:p>
+    <w:p>
+      <w:pPr>
+        <w:rPr>
+          <w:sz w:val="36"/>
+          <w:szCs w:val="36"/>
+        </w:rPr>
+      </w:pPr>
+      <w:r>
+        <w:rPr>
+          <w:sz w:val="36"/>
+          <w:szCs w:val="36"/>
+        </w:rPr>
+        <w:t xml:space="preserve">*Calendário de trabalho* </w:t>
+      </w:r>
+      <w:r>
+        <w:rPr>
+          <w:sz w:val="36"/>
+          <w:szCs w:val="36"/>
+        </w:rPr>
+        <w:br/>
+      </w:r>
+      <w:r>
+        <w:rPr>
+          <w:sz w:val="36"/>
+          <w:szCs w:val="36"/>
+        </w:rPr>
+        <w:t xml:space="preserve">*Semana 1 - 09/03 á 16/03* </w:t>
+      </w:r>
+    </w:p>
+    <w:p>
+      <w:pPr>
+        <w:rPr>
+          <w:sz w:val="36"/>
+          <w:szCs w:val="36"/>
+        </w:rPr>
+      </w:pPr>
+      <w:r>
+        <w:rPr>
+          <w:sz w:val="36"/>
+          <w:szCs w:val="36"/>
+        </w:rPr>
+        <w:t xml:space="preserve">- Captação de cliente </w:t>
+      </w:r>
+    </w:p>
+    <w:p>
+      <w:pPr>
+        <w:rPr>
+          <w:sz w:val="36"/>
+          <w:szCs w:val="36"/>
+        </w:rPr>
+      </w:pPr>
+      <w:r>
+        <w:rPr>
+          <w:sz w:val="36"/>
+          <w:szCs w:val="36"/>
+        </w:rPr>
+        <w:t xml:space="preserve">- Identificação de tecnologia necessária para o sistema </w:t>
+      </w:r>
+    </w:p>
+    <w:p>
+      <w:pPr>
+        <w:rPr>
+          <w:sz w:val="36"/>
+          <w:szCs w:val="36"/>
+        </w:rPr>
+      </w:pPr>
+      <w:r>
+        <w:rPr>
+          <w:sz w:val="36"/>
+          <w:szCs w:val="36"/>
+        </w:rPr>
+        <w:t xml:space="preserve">- </w:t>
+      </w:r>
+      <w:r>
+        <w:rPr>
+          <w:sz w:val="36"/>
+          <w:szCs w:val="36"/>
+        </w:rPr>
+        <w:t xml:space="preserve">Definição de </w:t>
+      </w:r>
+      <w:r>
+        <w:rPr>
+          <w:sz w:val="36"/>
+          <w:szCs w:val="36"/>
+        </w:rPr>
+        <w:t xml:space="preserve">Tipo de sistema </w:t>
+      </w:r>
+    </w:p>
+    <w:p>
+      <w:pPr>
+        <w:rPr>
+          <w:sz w:val="36"/>
+          <w:szCs w:val="36"/>
+        </w:rPr>
+      </w:pPr>
+      <w:r>
+        <w:rPr>
+          <w:sz w:val="36"/>
+          <w:szCs w:val="36"/>
+        </w:rPr>
+        <w:t>- Definição de equipe/integrantes</w:t>
+      </w:r>
+    </w:p>
+    <w:p>
+      <w:pPr>
+        <w:rPr>
+          <w:sz w:val="36"/>
+          <w:szCs w:val="36"/>
+        </w:rPr>
+      </w:pPr>
+    </w:p>
+    <w:p>
+      <w:pPr>
+        <w:rPr>
+          <w:sz w:val="36"/>
+          <w:szCs w:val="36"/>
+        </w:rPr>
+      </w:pPr>
+      <w:r>
+        <w:rPr>
+          <w:sz w:val="36"/>
+          <w:szCs w:val="36"/>
+        </w:rPr>
+        <w:t xml:space="preserve">*Semana 2 - 16/03 á 23/03* </w:t>
+      </w:r>
+    </w:p>
+    <w:p>
+      <w:pPr>
+        <w:rPr>
+          <w:sz w:val="36"/>
+          <w:szCs w:val="36"/>
+        </w:rPr>
+      </w:pPr>
+      <w:r>
+        <w:rPr>
+          <w:sz w:val="36"/>
+          <w:szCs w:val="36"/>
+        </w:rPr>
+        <w:t xml:space="preserve">- Levantamento de Requisitos do sistema </w:t>
+      </w:r>
+    </w:p>
+    <w:p>
+      <w:pPr>
+        <w:rPr>
+          <w:sz w:val="36"/>
+          <w:szCs w:val="36"/>
+        </w:rPr>
+      </w:pPr>
+      <w:r>
+        <w:rPr>
+          <w:sz w:val="36"/>
+          <w:szCs w:val="36"/>
+        </w:rPr>
+        <w:t xml:space="preserve">- Entrevista com o cliente para avaliar necessidade </w:t>
+      </w:r>
+    </w:p>
+    <w:p>
+      <w:pPr>
+        <w:rPr>
+          <w:sz w:val="36"/>
+          <w:szCs w:val="36"/>
+        </w:rPr>
+      </w:pPr>
+    </w:p>
+    <w:p>
+      <w:pPr>
+        <w:rPr>
+          <w:sz w:val="36"/>
+          <w:szCs w:val="36"/>
+        </w:rPr>
+      </w:pPr>
+      <w:r>
+        <w:rPr>
+          <w:sz w:val="36"/>
+          <w:szCs w:val="36"/>
+        </w:rPr>
+        <w:t xml:space="preserve">*Semana 3 - 23/03 á 30/03* </w:t>
+      </w:r>
+    </w:p>
+    <w:p>
+      <w:pPr>
+        <w:rPr>
+          <w:sz w:val="36"/>
+          <w:szCs w:val="36"/>
+        </w:rPr>
+      </w:pPr>
+      <w:r>
+        <w:rPr>
+          <w:sz w:val="36"/>
+          <w:szCs w:val="36"/>
+        </w:rPr>
+        <w:t xml:space="preserve">- Mapa mental do software </w:t>
+      </w:r>
+    </w:p>
+    <w:p>
+      <w:pPr>
+        <w:rPr>
+          <w:sz w:val="36"/>
+          <w:szCs w:val="36"/>
+        </w:rPr>
+      </w:pPr>
+    </w:p>
+    <w:p>
+      <w:pPr>
+        <w:rPr>
+          <w:sz w:val="36"/>
+          <w:szCs w:val="36"/>
+        </w:rPr>
+      </w:pPr>
+      <w:r>
+        <w:rPr>
+          <w:sz w:val="36"/>
+          <w:szCs w:val="36"/>
+        </w:rPr>
+        <w:t xml:space="preserve">*Semana 4 - 30/03 á 06/04* </w:t>
+      </w:r>
+    </w:p>
+    <w:p>
+      <w:pPr>
+        <w:rPr>
+          <w:sz w:val="36"/>
+          <w:szCs w:val="36"/>
+        </w:rPr>
+      </w:pPr>
+      <w:r>
+        <w:rPr>
+          <w:sz w:val="36"/>
+          <w:szCs w:val="36"/>
+        </w:rPr>
+        <w:t xml:space="preserve">- Criação de paradigma </w:t>
+      </w:r>
+    </w:p>
+    <w:p>
+      <w:pPr>
+        <w:rPr>
+          <w:sz w:val="36"/>
+          <w:szCs w:val="36"/>
+        </w:rPr>
+      </w:pPr>
+      <w:r>
+        <w:rPr>
+          <w:sz w:val="36"/>
+          <w:szCs w:val="36"/>
+        </w:rPr>
+        <w:t xml:space="preserve">- Diagrama de casos de uso </w:t>
+      </w:r>
+    </w:p>
+    <w:p>
+      <w:pPr>
+        <w:rPr>
+          <w:sz w:val="36"/>
+          <w:szCs w:val="36"/>
+        </w:rPr>
+      </w:pPr>
+    </w:p>
+    <w:p>
+      <w:pPr>
+        <w:rPr>
+          <w:sz w:val="36"/>
+          <w:szCs w:val="36"/>
+        </w:rPr>
+      </w:pPr>
+      <w:r>
+        <w:rPr>
+          <w:sz w:val="36"/>
+          <w:szCs w:val="36"/>
+        </w:rPr>
+        <w:t xml:space="preserve">*Semana 5 - 06/04 á 13/04* </w:t>
+      </w:r>
+    </w:p>
+    <w:p>
+      <w:pPr>
+        <w:rPr>
+          <w:sz w:val="36"/>
+          <w:szCs w:val="36"/>
+        </w:rPr>
+      </w:pPr>
+      <w:r>
+        <w:rPr>
+          <w:sz w:val="36"/>
+          <w:szCs w:val="36"/>
+        </w:rPr>
+        <w:t xml:space="preserve">- Diagrama de casos de uso </w:t>
+      </w:r>
+    </w:p>
+    <w:p>
+      <w:pPr>
+        <w:rPr>
+          <w:sz w:val="36"/>
+          <w:szCs w:val="36"/>
+        </w:rPr>
+      </w:pPr>
+      <w:r>
+        <w:rPr>
+          <w:sz w:val="36"/>
+          <w:szCs w:val="36"/>
+        </w:rPr>
+        <w:t>- Especificação dos casos de uso</w:t>
+      </w:r>
+    </w:p>
+    <w:p>
+      <w:pPr>
+        <w:rPr>
+          <w:sz w:val="36"/>
+          <w:szCs w:val="36"/>
+        </w:rPr>
+      </w:pPr>
+      <w:r>
+        <w:rPr>
+          <w:sz w:val="36"/>
+          <w:szCs w:val="36"/>
+        </w:rPr>
+        <w:t xml:space="preserve"> </w:t>
+      </w:r>
+    </w:p>
+    <w:p>
+      <w:pPr>
+        <w:rPr>
+          <w:sz w:val="36"/>
+          <w:szCs w:val="36"/>
+        </w:rPr>
+      </w:pPr>
+      <w:r>
+        <w:rPr>
+          <w:sz w:val="36"/>
+          <w:szCs w:val="36"/>
+        </w:rPr>
+        <w:t xml:space="preserve">*Semana 6 - 13/04 á 20/04* </w:t>
+      </w:r>
+    </w:p>
+    <w:p>
+      <w:pPr>
+        <w:rPr>
+          <w:sz w:val="36"/>
+          <w:szCs w:val="36"/>
+        </w:rPr>
+      </w:pPr>
+      <w:r>
+        <w:rPr>
+          <w:sz w:val="36"/>
+          <w:szCs w:val="36"/>
+        </w:rPr>
+        <w:t xml:space="preserve">- Especificação dos casos de uso - Modelagem do banco de dados </w:t>
+      </w:r>
+    </w:p>
+    <w:p>
+      <w:pPr>
+        <w:rPr>
+          <w:sz w:val="36"/>
+          <w:szCs w:val="36"/>
+        </w:rPr>
+      </w:pPr>
+    </w:p>
+    <w:p>
+      <w:pPr>
+        <w:rPr>
+          <w:sz w:val="36"/>
+          <w:szCs w:val="36"/>
+        </w:rPr>
+      </w:pPr>
+      <w:r>
+        <w:rPr>
+          <w:sz w:val="36"/>
+          <w:szCs w:val="36"/>
+        </w:rPr>
+        <w:t xml:space="preserve">*Semana </w:t>
+      </w:r>
+      <w:proofErr w:type="gramStart"/>
+      <w:r>
+        <w:rPr>
+          <w:sz w:val="36"/>
+          <w:szCs w:val="36"/>
+        </w:rPr>
+        <w:t>7</w:t>
+      </w:r>
+      <w:proofErr w:type="gramEnd"/>
+      <w:r>
+        <w:rPr>
+          <w:sz w:val="36"/>
+          <w:szCs w:val="36"/>
+        </w:rPr>
+        <w:t xml:space="preserve">... - 20/04 </w:t>
+      </w:r>
+      <w:proofErr w:type="gramStart"/>
+      <w:r>
+        <w:rPr>
+          <w:sz w:val="36"/>
+          <w:szCs w:val="36"/>
+        </w:rPr>
+        <w:t>á ...</w:t>
+      </w:r>
+      <w:proofErr w:type="gramEnd"/>
+      <w:r>
+        <w:rPr>
+          <w:sz w:val="36"/>
+          <w:szCs w:val="36"/>
+        </w:rPr>
+        <w:t xml:space="preserve">* </w:t>
+      </w:r>
+    </w:p>
+    <w:p>
+      <w:pPr>
+        <w:rPr>
+          <w:sz w:val="36"/>
+          <w:szCs w:val="36"/>
+        </w:rPr>
+      </w:pPr>
+      <w:r>
+        <w:rPr>
+          <w:sz w:val="36"/>
+          <w:szCs w:val="36"/>
+        </w:rPr>
+        <w:t>- Implementação do sistema (Programação, testes de segurança e uso com o usuário</w:t>
+      </w:r>
+      <w:proofErr w:type="gramStart"/>
+      <w:r>
+        <w:rPr>
+          <w:sz w:val="36"/>
+          <w:szCs w:val="36"/>
+        </w:rPr>
+        <w:t>)</w:t>
+      </w:r>
+      <w:proofErr w:type="gramEnd"/>
     </w:p>
     <w:p>
       <w:pPr>
@@ -2143,7 +2499,7 @@
         <w:noProof/>
         <w:color w:val="4472C4" w:themeColor="accent1"/>
       </w:rPr>
-      <w:t>3</w:t>
+      <w:t>2</w:t>
     </w:r>
     <w:r>
       <w:rPr>
@@ -2180,7 +2536,7 @@
         <w:noProof/>
         <w:color w:val="4472C4" w:themeColor="accent1"/>
       </w:rPr>
-      <w:t>3</w:t>
+      <w:t>4</w:t>
     </w:r>
     <w:r>
       <w:rPr>
@@ -4767,7 +5123,7 @@
 </file>
 
 <file path=customXml/itemProps1.xml><?xml version="1.0" encoding="utf-8"?>
-<ds:datastoreItem xmlns:ds="http://schemas.openxmlformats.org/officeDocument/2006/customXml" ds:itemID="{305CA421-AD46-434D-B917-EE0D666EDE7B}">
+<ds:datastoreItem xmlns:ds="http://schemas.openxmlformats.org/officeDocument/2006/customXml" ds:itemID="{27DF79F4-8D82-4C58-AB8E-3022EE37137D}">
   <ds:schemaRefs>
     <ds:schemaRef ds:uri="http://schemas.openxmlformats.org/officeDocument/2006/bibliography"/>
   </ds:schemaRefs>

</xml_diff>

<commit_message>
Adicionado o levantamento de requisitos+MapaMental
Adicionado o levantamento de requisitos+MapaMental
</commit_message>
<xml_diff>
--- a/Projeto de Engenharia de Software (Documentação).docx
+++ b/Projeto de Engenharia de Software (Documentação).docx
@@ -923,8 +923,6 @@
           <w:lang w:eastAsia="pt-BR"/>
         </w:rPr>
       </w:pPr>
-      <w:bookmarkStart w:id="0" w:name="_GoBack"/>
-      <w:bookmarkEnd w:id="0"/>
       <w:r>
         <w:rPr>
           <w:rFonts w:eastAsia="Times New Roman" w:cstheme="minorHAnsi"/>
@@ -1891,8 +1889,31 @@
           <w:szCs w:val="36"/>
           <w:lang w:eastAsia="pt-BR"/>
         </w:rPr>
-        <w:t>: Entrevistas ou simulação de necessidades da Cleonice.</w:t>
-      </w:r>
+        <w:t>: Entrevistas ou simulação de necessidades da Cleonice</w:t>
+      </w:r>
+      <w:r>
+        <w:rPr>
+          <w:rFonts w:eastAsia="Times New Roman" w:cstheme="minorHAnsi"/>
+          <w:color w:val="1F1F1F"/>
+          <w:sz w:val="36"/>
+          <w:szCs w:val="36"/>
+          <w:lang w:eastAsia="pt-BR"/>
+        </w:rPr>
+        <w:t xml:space="preserve"> (Cliente)</w:t>
+      </w:r>
+      <w:bookmarkStart w:id="0" w:name="_GoBack"/>
+      <w:bookmarkEnd w:id="0"/>
+      <w:r>
+        <w:rPr>
+          <w:rFonts w:eastAsia="Times New Roman" w:cstheme="minorHAnsi"/>
+          <w:color w:val="1F1F1F"/>
+          <w:sz w:val="36"/>
+          <w:szCs w:val="36"/>
+          <w:lang w:eastAsia="pt-BR"/>
+        </w:rPr>
+        <w:t>.</w:t>
+      </w:r>
+      <w:proofErr w:type="gramStart"/>
     </w:p>
     <w:p>
       <w:pPr>
@@ -1911,6 +1932,7 @@
           <w:lang w:eastAsia="pt-BR"/>
         </w:rPr>
       </w:pPr>
+      <w:proofErr w:type="gramEnd"/>
       <w:r>
         <w:rPr>
           <w:rFonts w:eastAsia="Times New Roman" w:cstheme="minorHAnsi"/>
@@ -2370,16 +2392,2743 @@
     </w:p>
     <w:p>
       <w:pPr>
-        <w:jc w:val="center"/>
+        <w:rPr>
+          <w:sz w:val="36"/>
+          <w:szCs w:val="36"/>
+        </w:rPr>
+      </w:pPr>
+      <w:r>
+        <w:rPr>
+          <w:sz w:val="36"/>
+          <w:szCs w:val="36"/>
+        </w:rPr>
+        <w:br w:type="page"/>
+      </w:r>
+    </w:p>
+    <w:p>
+      <w:pPr>
+        <w:spacing w:before="100" w:beforeAutospacing="1" w:after="120" w:line="240" w:lineRule="auto"/>
+        <w:jc w:val="both"/>
+        <w:outlineLvl w:val="1"/>
+        <w:rPr>
+          <w:rFonts w:eastAsia="Times New Roman" w:cstheme="minorHAnsi"/>
+          <w:b/>
+          <w:bCs/>
+          <w:color w:val="1F1F1F"/>
+          <w:sz w:val="36"/>
+          <w:szCs w:val="36"/>
+          <w:lang w:eastAsia="pt-BR"/>
+        </w:rPr>
+      </w:pPr>
+      <w:r>
+        <w:rPr>
+          <w:rFonts w:ascii="Segoe UI Symbol" w:eastAsia="Times New Roman" w:hAnsi="Segoe UI Symbol" w:cs="Segoe UI Symbol"/>
+          <w:b/>
+          <w:bCs/>
+          <w:color w:val="1F1F1F"/>
+          <w:sz w:val="36"/>
+          <w:szCs w:val="36"/>
+          <w:lang w:eastAsia="pt-BR"/>
+        </w:rPr>
+        <w:lastRenderedPageBreak/>
+        <w:t>📄</w:t>
+      </w:r>
+      <w:r>
+        <w:rPr>
+          <w:rFonts w:eastAsia="Times New Roman" w:cstheme="minorHAnsi"/>
+          <w:b/>
+          <w:bCs/>
+          <w:color w:val="1F1F1F"/>
+          <w:sz w:val="36"/>
+          <w:szCs w:val="36"/>
+          <w:lang w:eastAsia="pt-BR"/>
+        </w:rPr>
+        <w:t xml:space="preserve"> Documento de Concepção de Software (</w:t>
+      </w:r>
+      <w:r>
+        <w:rPr>
+          <w:rFonts w:eastAsia="Times New Roman" w:cstheme="minorHAnsi"/>
+          <w:b/>
+          <w:bCs/>
+          <w:color w:val="1F1F1F"/>
+          <w:sz w:val="36"/>
+          <w:szCs w:val="36"/>
+          <w:lang w:eastAsia="pt-BR"/>
+        </w:rPr>
+        <w:t>Semana</w:t>
+      </w:r>
+      <w:r>
+        <w:rPr>
+          <w:rFonts w:eastAsia="Times New Roman" w:cstheme="minorHAnsi"/>
+          <w:b/>
+          <w:bCs/>
+          <w:color w:val="1F1F1F"/>
+          <w:sz w:val="36"/>
+          <w:szCs w:val="36"/>
+          <w:lang w:eastAsia="pt-BR"/>
+        </w:rPr>
+        <w:t xml:space="preserve"> 2 – 16/03 á 23</w:t>
+      </w:r>
+      <w:r>
+        <w:rPr>
+          <w:rFonts w:eastAsia="Times New Roman" w:cstheme="minorHAnsi"/>
+          <w:b/>
+          <w:bCs/>
+          <w:color w:val="1F1F1F"/>
+          <w:sz w:val="36"/>
+          <w:szCs w:val="36"/>
+          <w:lang w:eastAsia="pt-BR"/>
+        </w:rPr>
+        <w:t>/03</w:t>
+      </w:r>
+      <w:r>
+        <w:rPr>
+          <w:rFonts w:eastAsia="Times New Roman" w:cstheme="minorHAnsi"/>
+          <w:b/>
+          <w:bCs/>
+          <w:color w:val="1F1F1F"/>
+          <w:sz w:val="36"/>
+          <w:szCs w:val="36"/>
+          <w:lang w:eastAsia="pt-BR"/>
+        </w:rPr>
+        <w:t>)</w:t>
+      </w:r>
+    </w:p>
+    <w:p>
+      <w:pPr>
+        <w:pStyle w:val="Legenda"/>
+        <w:rPr>
+          <w:rFonts w:cstheme="minorHAnsi"/>
+          <w:sz w:val="36"/>
+          <w:szCs w:val="36"/>
+        </w:rPr>
+      </w:pPr>
+      <w:r>
+        <w:rPr>
+          <w:rFonts w:cstheme="minorHAnsi"/>
+          <w:sz w:val="36"/>
+          <w:szCs w:val="36"/>
+        </w:rPr>
+        <w:t>Levantamento de Requisitos: Sistema de Vendas para Artesanato e Bordados</w:t>
+      </w:r>
+    </w:p>
+    <w:p>
+      <w:pPr>
+        <w:rPr>
+          <w:rFonts w:cstheme="minorHAnsi"/>
+          <w:b/>
+          <w:bCs/>
+          <w:sz w:val="36"/>
+          <w:szCs w:val="36"/>
+        </w:rPr>
+      </w:pPr>
+      <w:r>
+        <w:rPr>
+          <w:rFonts w:cstheme="minorHAnsi"/>
+          <w:b/>
+          <w:bCs/>
+          <w:sz w:val="36"/>
+          <w:szCs w:val="36"/>
+        </w:rPr>
+        <w:t>1. Visão Geral</w:t>
+      </w:r>
+    </w:p>
+    <w:p>
+      <w:pPr>
+        <w:jc w:val="both"/>
+        <w:rPr>
+          <w:rFonts w:cstheme="minorHAnsi"/>
+          <w:sz w:val="36"/>
+          <w:szCs w:val="36"/>
+        </w:rPr>
+      </w:pPr>
+      <w:r>
+        <w:rPr>
+          <w:rFonts w:cstheme="minorHAnsi"/>
+          <w:sz w:val="36"/>
+          <w:szCs w:val="36"/>
+        </w:rPr>
+        <w:t xml:space="preserve">O sistema visa automatizar os processos de uma unidade de produção artesanal, cobrindo desde a gestão de insumos e produção </w:t>
+      </w:r>
+      <w:proofErr w:type="gramStart"/>
+      <w:r>
+        <w:rPr>
+          <w:rFonts w:cstheme="minorHAnsi"/>
+          <w:sz w:val="36"/>
+          <w:szCs w:val="36"/>
+        </w:rPr>
+        <w:t>sob encomenda</w:t>
+      </w:r>
+      <w:proofErr w:type="gramEnd"/>
+      <w:r>
+        <w:rPr>
+          <w:rFonts w:cstheme="minorHAnsi"/>
+          <w:sz w:val="36"/>
+          <w:szCs w:val="36"/>
+        </w:rPr>
+        <w:t xml:space="preserve"> até a venda final e controle financeiro, garantindo a segurança dos dados dos clientes.</w:t>
+      </w:r>
+    </w:p>
+    <w:p>
+      <w:pPr>
+        <w:rPr>
+          <w:rFonts w:cstheme="minorHAnsi"/>
+          <w:b/>
+          <w:bCs/>
+          <w:sz w:val="36"/>
+          <w:szCs w:val="36"/>
+        </w:rPr>
+      </w:pPr>
+      <w:r>
+        <w:rPr>
+          <w:rFonts w:cstheme="minorHAnsi"/>
+          <w:b/>
+          <w:bCs/>
+          <w:sz w:val="36"/>
+          <w:szCs w:val="36"/>
+        </w:rPr>
+        <w:t>2. Requisitos Funcionais (RF)</w:t>
+      </w:r>
+    </w:p>
+    <w:p>
+      <w:pPr>
+        <w:rPr>
+          <w:rFonts w:cstheme="minorHAnsi"/>
+          <w:sz w:val="36"/>
+          <w:szCs w:val="36"/>
+        </w:rPr>
+      </w:pPr>
+      <w:r>
+        <w:rPr>
+          <w:rFonts w:cstheme="minorHAnsi"/>
+          <w:sz w:val="36"/>
+          <w:szCs w:val="36"/>
+        </w:rPr>
+        <w:t>Os requisitos funcionais descrevem as funcionalidades que o sistema deve oferecer.</w:t>
+      </w:r>
+    </w:p>
+    <w:p>
+      <w:pPr>
+        <w:numPr>
+          <w:ilvl w:val="0"/>
+          <w:numId w:val="10"/>
+        </w:numPr>
+        <w:suppressAutoHyphens/>
+        <w:rPr>
+          <w:rFonts w:cstheme="minorHAnsi"/>
+          <w:sz w:val="36"/>
+          <w:szCs w:val="36"/>
+        </w:rPr>
+      </w:pPr>
+      <w:r>
+        <w:rPr>
+          <w:rFonts w:cstheme="minorHAnsi"/>
+          <w:b/>
+          <w:bCs/>
+          <w:sz w:val="36"/>
+          <w:szCs w:val="36"/>
+        </w:rPr>
+        <w:t>RF01 - Gestão de Estoque Híbrido:</w:t>
+      </w:r>
+    </w:p>
+    <w:p>
+      <w:pPr>
+        <w:numPr>
+          <w:ilvl w:val="1"/>
+          <w:numId w:val="10"/>
+        </w:numPr>
+        <w:suppressAutoHyphens/>
+        <w:rPr>
+          <w:rFonts w:cstheme="minorHAnsi"/>
+          <w:sz w:val="36"/>
+          <w:szCs w:val="36"/>
+        </w:rPr>
+      </w:pPr>
+      <w:r>
+        <w:rPr>
+          <w:rFonts w:cstheme="minorHAnsi"/>
+          <w:sz w:val="36"/>
+          <w:szCs w:val="36"/>
+        </w:rPr>
+        <w:t xml:space="preserve">Controle de </w:t>
+      </w:r>
+      <w:r>
+        <w:rPr>
+          <w:rFonts w:cstheme="minorHAnsi"/>
+          <w:b/>
+          <w:bCs/>
+          <w:sz w:val="36"/>
+          <w:szCs w:val="36"/>
+        </w:rPr>
+        <w:t>Insumos</w:t>
+      </w:r>
+      <w:r>
+        <w:rPr>
+          <w:rFonts w:cstheme="minorHAnsi"/>
+          <w:sz w:val="36"/>
+          <w:szCs w:val="36"/>
+        </w:rPr>
+        <w:t xml:space="preserve"> (linhas, tecidos, bastidores).</w:t>
+      </w:r>
+    </w:p>
+    <w:p>
+      <w:pPr>
+        <w:numPr>
+          <w:ilvl w:val="1"/>
+          <w:numId w:val="10"/>
+        </w:numPr>
+        <w:suppressAutoHyphens/>
+        <w:rPr>
+          <w:rFonts w:cstheme="minorHAnsi"/>
+          <w:sz w:val="36"/>
+          <w:szCs w:val="36"/>
+        </w:rPr>
+      </w:pPr>
+      <w:r>
+        <w:rPr>
+          <w:rFonts w:cstheme="minorHAnsi"/>
+          <w:sz w:val="36"/>
+          <w:szCs w:val="36"/>
+        </w:rPr>
+        <w:t xml:space="preserve">Controle de </w:t>
+      </w:r>
+      <w:r>
+        <w:rPr>
+          <w:rFonts w:cstheme="minorHAnsi"/>
+          <w:b/>
+          <w:bCs/>
+          <w:sz w:val="36"/>
+          <w:szCs w:val="36"/>
+        </w:rPr>
+        <w:t>Produtos Acabados</w:t>
+      </w:r>
+      <w:r>
+        <w:rPr>
+          <w:rFonts w:cstheme="minorHAnsi"/>
+          <w:sz w:val="36"/>
+          <w:szCs w:val="36"/>
+        </w:rPr>
+        <w:t xml:space="preserve"> (pronta entrega).</w:t>
+      </w:r>
+    </w:p>
+    <w:p>
+      <w:pPr>
+        <w:numPr>
+          <w:ilvl w:val="1"/>
+          <w:numId w:val="10"/>
+        </w:numPr>
+        <w:suppressAutoHyphens/>
+        <w:rPr>
+          <w:rFonts w:cstheme="minorHAnsi"/>
+          <w:sz w:val="36"/>
+          <w:szCs w:val="36"/>
+        </w:rPr>
+      </w:pPr>
+      <w:r>
+        <w:rPr>
+          <w:rFonts w:cstheme="minorHAnsi"/>
+          <w:sz w:val="36"/>
+          <w:szCs w:val="36"/>
+        </w:rPr>
+        <w:t>Alerta de nível crítico de Materiais (estoque mínimo e máximo).</w:t>
+      </w:r>
+    </w:p>
+    <w:p>
+      <w:pPr>
+        <w:numPr>
+          <w:ilvl w:val="0"/>
+          <w:numId w:val="10"/>
+        </w:numPr>
+        <w:suppressAutoHyphens/>
+        <w:rPr>
+          <w:rFonts w:cstheme="minorHAnsi"/>
+          <w:sz w:val="36"/>
+          <w:szCs w:val="36"/>
+        </w:rPr>
+      </w:pPr>
+      <w:r>
+        <w:rPr>
+          <w:rFonts w:cstheme="minorHAnsi"/>
+          <w:b/>
+          <w:bCs/>
+          <w:sz w:val="36"/>
+          <w:szCs w:val="36"/>
+        </w:rPr>
+        <w:t>RF02 - Cadastro e Gestão de Clientes (CRM):</w:t>
+      </w:r>
+    </w:p>
+    <w:p>
+      <w:pPr>
+        <w:numPr>
+          <w:ilvl w:val="1"/>
+          <w:numId w:val="10"/>
+        </w:numPr>
+        <w:suppressAutoHyphens/>
+        <w:rPr>
+          <w:rFonts w:cstheme="minorHAnsi"/>
+          <w:sz w:val="36"/>
+          <w:szCs w:val="36"/>
+        </w:rPr>
+      </w:pPr>
+      <w:r>
+        <w:rPr>
+          <w:rFonts w:cstheme="minorHAnsi"/>
+          <w:sz w:val="36"/>
+          <w:szCs w:val="36"/>
+        </w:rPr>
+        <w:t>Registro de dados pessoais e histórico de compras.</w:t>
+      </w:r>
+    </w:p>
+    <w:p>
+      <w:pPr>
+        <w:numPr>
+          <w:ilvl w:val="1"/>
+          <w:numId w:val="10"/>
+        </w:numPr>
+        <w:suppressAutoHyphens/>
+        <w:rPr>
+          <w:rFonts w:cstheme="minorHAnsi"/>
+          <w:sz w:val="36"/>
+          <w:szCs w:val="36"/>
+        </w:rPr>
+      </w:pPr>
+      <w:r>
+        <w:rPr>
+          <w:rFonts w:cstheme="minorHAnsi"/>
+          <w:sz w:val="36"/>
+          <w:szCs w:val="36"/>
+        </w:rPr>
+        <w:t>Gestão de preferências (estilos de bordado favoritos).</w:t>
+      </w:r>
+    </w:p>
+    <w:p>
+      <w:pPr>
+        <w:numPr>
+          <w:ilvl w:val="0"/>
+          <w:numId w:val="10"/>
+        </w:numPr>
+        <w:suppressAutoHyphens/>
+        <w:rPr>
+          <w:rFonts w:cstheme="minorHAnsi"/>
+          <w:sz w:val="36"/>
+          <w:szCs w:val="36"/>
+        </w:rPr>
+      </w:pPr>
+      <w:r>
+        <w:rPr>
+          <w:rFonts w:cstheme="minorHAnsi"/>
+          <w:b/>
+          <w:bCs/>
+          <w:sz w:val="36"/>
+          <w:szCs w:val="36"/>
+        </w:rPr>
+        <w:t>RF03 - Catálogo de Produtos e Precificação:</w:t>
+      </w:r>
+    </w:p>
+    <w:p>
+      <w:pPr>
+        <w:numPr>
+          <w:ilvl w:val="1"/>
+          <w:numId w:val="10"/>
+        </w:numPr>
+        <w:suppressAutoHyphens/>
+        <w:rPr>
+          <w:rFonts w:cstheme="minorHAnsi"/>
+          <w:sz w:val="36"/>
+          <w:szCs w:val="36"/>
+        </w:rPr>
+      </w:pPr>
+      <w:r>
+        <w:rPr>
+          <w:rFonts w:cstheme="minorHAnsi"/>
+          <w:sz w:val="36"/>
+          <w:szCs w:val="36"/>
+        </w:rPr>
+        <w:t>Cadastro com fotos e categorias.</w:t>
+      </w:r>
+    </w:p>
+    <w:p>
+      <w:pPr>
+        <w:numPr>
+          <w:ilvl w:val="1"/>
+          <w:numId w:val="10"/>
+        </w:numPr>
+        <w:suppressAutoHyphens/>
+        <w:rPr>
+          <w:rFonts w:cstheme="minorHAnsi"/>
+          <w:sz w:val="36"/>
+          <w:szCs w:val="36"/>
+        </w:rPr>
+      </w:pPr>
+      <w:r>
+        <w:rPr>
+          <w:rFonts w:cstheme="minorHAnsi"/>
+          <w:sz w:val="36"/>
+          <w:szCs w:val="36"/>
+        </w:rPr>
+        <w:t>Módulo de cálculo de preço (Custo Material + Mão de Obra + Margem).</w:t>
+      </w:r>
+    </w:p>
+    <w:p>
+      <w:pPr>
+        <w:numPr>
+          <w:ilvl w:val="0"/>
+          <w:numId w:val="10"/>
+        </w:numPr>
+        <w:suppressAutoHyphens/>
+        <w:rPr>
+          <w:rFonts w:cstheme="minorHAnsi"/>
+          <w:sz w:val="36"/>
+          <w:szCs w:val="36"/>
+        </w:rPr>
+      </w:pPr>
+      <w:r>
+        <w:rPr>
+          <w:rFonts w:cstheme="minorHAnsi"/>
+          <w:b/>
+          <w:bCs/>
+          <w:sz w:val="36"/>
+          <w:szCs w:val="36"/>
+        </w:rPr>
+        <w:t>RF04 - Gestão de Pedidos e Encomendas:</w:t>
+      </w:r>
+    </w:p>
+    <w:p>
+      <w:pPr>
+        <w:numPr>
+          <w:ilvl w:val="1"/>
+          <w:numId w:val="10"/>
+        </w:numPr>
+        <w:suppressAutoHyphens/>
+        <w:rPr>
+          <w:rFonts w:cstheme="minorHAnsi"/>
+          <w:sz w:val="36"/>
+          <w:szCs w:val="36"/>
+        </w:rPr>
+      </w:pPr>
+      <w:r>
+        <w:rPr>
+          <w:rFonts w:cstheme="minorHAnsi"/>
+          <w:sz w:val="36"/>
+          <w:szCs w:val="36"/>
+        </w:rPr>
+        <w:lastRenderedPageBreak/>
+        <w:t>Status de produção (Pendente, Em Produção, Finalizado, Entregue).</w:t>
+      </w:r>
+    </w:p>
+    <w:p>
+      <w:pPr>
+        <w:numPr>
+          <w:ilvl w:val="1"/>
+          <w:numId w:val="10"/>
+        </w:numPr>
+        <w:suppressAutoHyphens/>
+        <w:rPr>
+          <w:rFonts w:cstheme="minorHAnsi"/>
+          <w:sz w:val="36"/>
+          <w:szCs w:val="36"/>
+        </w:rPr>
+      </w:pPr>
+      <w:r>
+        <w:rPr>
+          <w:rFonts w:cstheme="minorHAnsi"/>
+          <w:sz w:val="36"/>
+          <w:szCs w:val="36"/>
+        </w:rPr>
+        <w:t>Registro de sinal/entrada (pagamentos parciais).</w:t>
+      </w:r>
+    </w:p>
+    <w:p>
+      <w:pPr>
+        <w:numPr>
+          <w:ilvl w:val="0"/>
+          <w:numId w:val="10"/>
+        </w:numPr>
+        <w:suppressAutoHyphens/>
+        <w:rPr>
+          <w:rFonts w:cstheme="minorHAnsi"/>
+          <w:sz w:val="36"/>
+          <w:szCs w:val="36"/>
+        </w:rPr>
+      </w:pPr>
+      <w:r>
+        <w:rPr>
+          <w:rFonts w:cstheme="minorHAnsi"/>
+          <w:b/>
+          <w:bCs/>
+          <w:sz w:val="36"/>
+          <w:szCs w:val="36"/>
+        </w:rPr>
+        <w:t>RF05 - Controle Financeiro:</w:t>
+      </w:r>
+    </w:p>
+    <w:p>
+      <w:pPr>
+        <w:numPr>
+          <w:ilvl w:val="1"/>
+          <w:numId w:val="10"/>
+        </w:numPr>
+        <w:suppressAutoHyphens/>
+        <w:rPr>
+          <w:rFonts w:cstheme="minorHAnsi"/>
+          <w:sz w:val="36"/>
+          <w:szCs w:val="36"/>
+        </w:rPr>
+      </w:pPr>
+      <w:r>
+        <w:rPr>
+          <w:rFonts w:cstheme="minorHAnsi"/>
+          <w:sz w:val="36"/>
+          <w:szCs w:val="36"/>
+        </w:rPr>
+        <w:t>Fluxo de caixa (Entradas e Saídas).</w:t>
+      </w:r>
+    </w:p>
+    <w:p>
+      <w:pPr>
+        <w:numPr>
+          <w:ilvl w:val="1"/>
+          <w:numId w:val="10"/>
+        </w:numPr>
+        <w:suppressAutoHyphens/>
+        <w:rPr>
+          <w:rFonts w:cstheme="minorHAnsi"/>
+          <w:sz w:val="36"/>
+          <w:szCs w:val="36"/>
+        </w:rPr>
+      </w:pPr>
+      <w:r>
+        <w:rPr>
+          <w:rFonts w:cstheme="minorHAnsi"/>
+          <w:sz w:val="36"/>
+          <w:szCs w:val="36"/>
+        </w:rPr>
+        <w:t>Gestão de contas a pagar (fornecedores) e a receber.</w:t>
+      </w:r>
+    </w:p>
+    <w:p>
+      <w:pPr>
+        <w:numPr>
+          <w:ilvl w:val="0"/>
+          <w:numId w:val="10"/>
+        </w:numPr>
+        <w:suppressAutoHyphens/>
+        <w:rPr>
+          <w:rFonts w:cstheme="minorHAnsi"/>
+          <w:sz w:val="36"/>
+          <w:szCs w:val="36"/>
+        </w:rPr>
+      </w:pPr>
+      <w:r>
+        <w:rPr>
+          <w:rFonts w:cstheme="minorHAnsi"/>
+          <w:b/>
+          <w:bCs/>
+          <w:sz w:val="36"/>
+          <w:szCs w:val="36"/>
+        </w:rPr>
+        <w:t>RF06 - Relatórios Gerenciais:</w:t>
+      </w:r>
+    </w:p>
+    <w:p>
+      <w:pPr>
+        <w:numPr>
+          <w:ilvl w:val="1"/>
+          <w:numId w:val="10"/>
+        </w:numPr>
+        <w:suppressAutoHyphens/>
+        <w:rPr>
+          <w:rFonts w:cstheme="minorHAnsi"/>
+          <w:sz w:val="36"/>
+          <w:szCs w:val="36"/>
+        </w:rPr>
+      </w:pPr>
+      <w:r>
+        <w:rPr>
+          <w:rFonts w:cstheme="minorHAnsi"/>
+          <w:sz w:val="36"/>
+          <w:szCs w:val="36"/>
+        </w:rPr>
+        <w:t>Vendas por período, ticket médio e produtos mais vendidos (Curva ABC).</w:t>
+      </w:r>
+    </w:p>
+    <w:p>
+      <w:pPr>
+        <w:numPr>
+          <w:ilvl w:val="1"/>
+          <w:numId w:val="10"/>
+        </w:numPr>
+        <w:suppressAutoHyphens/>
+        <w:rPr>
+          <w:rFonts w:cstheme="minorHAnsi"/>
+          <w:sz w:val="36"/>
+          <w:szCs w:val="36"/>
+        </w:rPr>
+      </w:pPr>
+      <w:r>
+        <w:rPr>
+          <w:rFonts w:cstheme="minorHAnsi"/>
+          <w:sz w:val="36"/>
+          <w:szCs w:val="36"/>
+        </w:rPr>
+        <w:t>Relatório de lucro líquido e despesas fixas.</w:t>
+      </w:r>
+    </w:p>
+    <w:p>
+      <w:pPr>
+        <w:numPr>
+          <w:ilvl w:val="0"/>
+          <w:numId w:val="10"/>
+        </w:numPr>
+        <w:suppressAutoHyphens/>
+        <w:rPr>
+          <w:rFonts w:cstheme="minorHAnsi"/>
+          <w:sz w:val="36"/>
+          <w:szCs w:val="36"/>
+        </w:rPr>
+      </w:pPr>
+      <w:r>
+        <w:rPr>
+          <w:rFonts w:cstheme="minorHAnsi"/>
+          <w:b/>
+          <w:bCs/>
+          <w:sz w:val="36"/>
+          <w:szCs w:val="36"/>
+        </w:rPr>
+        <w:t>RF07 - Gestão de Acessos:</w:t>
+      </w:r>
+    </w:p>
+    <w:p>
+      <w:pPr>
+        <w:numPr>
+          <w:ilvl w:val="1"/>
+          <w:numId w:val="10"/>
+        </w:numPr>
+        <w:suppressAutoHyphens/>
+        <w:rPr>
+          <w:rFonts w:cstheme="minorHAnsi"/>
+          <w:sz w:val="36"/>
+          <w:szCs w:val="36"/>
+        </w:rPr>
+      </w:pPr>
+      <w:r>
+        <w:rPr>
+          <w:rFonts w:cstheme="minorHAnsi"/>
+          <w:sz w:val="36"/>
+          <w:szCs w:val="36"/>
+        </w:rPr>
+        <w:t>Níveis de permissão distintos para Administrador e Operador.</w:t>
+      </w:r>
+    </w:p>
+    <w:p>
+      <w:pPr>
+        <w:rPr>
+          <w:rFonts w:cstheme="minorHAnsi"/>
+          <w:b/>
+          <w:bCs/>
+          <w:sz w:val="36"/>
+          <w:szCs w:val="36"/>
+        </w:rPr>
+      </w:pPr>
+      <w:r>
+        <w:rPr>
+          <w:rFonts w:cstheme="minorHAnsi"/>
+          <w:b/>
+          <w:bCs/>
+          <w:sz w:val="36"/>
+          <w:szCs w:val="36"/>
+        </w:rPr>
+        <w:t>3. Requisitos Não Funcionais (RNF)</w:t>
+      </w:r>
+    </w:p>
+    <w:p>
+      <w:pPr>
+        <w:rPr>
+          <w:rFonts w:cstheme="minorHAnsi"/>
+          <w:sz w:val="36"/>
+          <w:szCs w:val="36"/>
+        </w:rPr>
+      </w:pPr>
+      <w:r>
+        <w:rPr>
+          <w:rFonts w:cstheme="minorHAnsi"/>
+          <w:sz w:val="36"/>
+          <w:szCs w:val="36"/>
+        </w:rPr>
+        <w:t>Os requisitos não funcionais descrevem as qualidades e restrições do sistema.</w:t>
+      </w:r>
+    </w:p>
+    <w:p>
+      <w:pPr>
+        <w:numPr>
+          <w:ilvl w:val="0"/>
+          <w:numId w:val="11"/>
+        </w:numPr>
+        <w:suppressAutoHyphens/>
+        <w:rPr>
+          <w:rFonts w:cstheme="minorHAnsi"/>
+          <w:sz w:val="36"/>
+          <w:szCs w:val="36"/>
+        </w:rPr>
+      </w:pPr>
+      <w:r>
+        <w:rPr>
+          <w:rFonts w:cstheme="minorHAnsi"/>
+          <w:b/>
+          <w:bCs/>
+          <w:sz w:val="36"/>
+          <w:szCs w:val="36"/>
+        </w:rPr>
+        <w:t>RNF01 - Segurança e Privacidade:</w:t>
+      </w:r>
+      <w:r>
+        <w:rPr>
+          <w:rFonts w:cstheme="minorHAnsi"/>
+          <w:sz w:val="36"/>
+          <w:szCs w:val="36"/>
+        </w:rPr>
+        <w:t xml:space="preserve"> Criptografia de dados sensíveis e conformidade com as diretrizes da LGPD.</w:t>
+      </w:r>
+    </w:p>
+    <w:p>
+      <w:pPr>
+        <w:numPr>
+          <w:ilvl w:val="0"/>
+          <w:numId w:val="11"/>
+        </w:numPr>
+        <w:suppressAutoHyphens/>
+        <w:rPr>
+          <w:rFonts w:cstheme="minorHAnsi"/>
+          <w:sz w:val="36"/>
+          <w:szCs w:val="36"/>
+        </w:rPr>
+      </w:pPr>
+      <w:r>
+        <w:rPr>
+          <w:rFonts w:cstheme="minorHAnsi"/>
+          <w:b/>
+          <w:bCs/>
+          <w:sz w:val="36"/>
+          <w:szCs w:val="36"/>
+        </w:rPr>
+        <w:t>RNF02 - Usabilidade:</w:t>
+      </w:r>
+      <w:r>
+        <w:rPr>
+          <w:rFonts w:cstheme="minorHAnsi"/>
+          <w:sz w:val="36"/>
+          <w:szCs w:val="36"/>
+        </w:rPr>
+        <w:t xml:space="preserve"> Interface intuitiva (</w:t>
+      </w:r>
+      <w:proofErr w:type="spellStart"/>
+      <w:r>
+        <w:rPr>
+          <w:rFonts w:cstheme="minorHAnsi"/>
+          <w:sz w:val="36"/>
+          <w:szCs w:val="36"/>
+        </w:rPr>
+        <w:t>Dashboard</w:t>
+      </w:r>
+      <w:proofErr w:type="spellEnd"/>
+      <w:r>
+        <w:rPr>
+          <w:rFonts w:cstheme="minorHAnsi"/>
+          <w:sz w:val="36"/>
+          <w:szCs w:val="36"/>
+        </w:rPr>
+        <w:t>) com visualização rápida dos pedidos do dia.</w:t>
+      </w:r>
+    </w:p>
+    <w:p>
+      <w:pPr>
+        <w:numPr>
+          <w:ilvl w:val="0"/>
+          <w:numId w:val="11"/>
+        </w:numPr>
+        <w:suppressAutoHyphens/>
+        <w:rPr>
+          <w:rFonts w:cstheme="minorHAnsi"/>
+          <w:sz w:val="36"/>
+          <w:szCs w:val="36"/>
+        </w:rPr>
+      </w:pPr>
+      <w:r>
+        <w:rPr>
+          <w:rFonts w:cstheme="minorHAnsi"/>
+          <w:b/>
+          <w:bCs/>
+          <w:sz w:val="36"/>
+          <w:szCs w:val="36"/>
+        </w:rPr>
+        <w:t>RNF03 - Disponibilidade:</w:t>
+      </w:r>
+      <w:r>
+        <w:rPr>
+          <w:rFonts w:cstheme="minorHAnsi"/>
+          <w:sz w:val="36"/>
+          <w:szCs w:val="36"/>
+        </w:rPr>
+        <w:t xml:space="preserve"> O sistema deve permitir consulta rápida ao catálogo (Portfólio) para exibição a clientes.</w:t>
+      </w:r>
+    </w:p>
+    <w:p>
+      <w:pPr>
+        <w:rPr>
+          <w:rFonts w:cstheme="minorHAnsi"/>
+          <w:sz w:val="36"/>
+          <w:szCs w:val="36"/>
+        </w:rPr>
+      </w:pPr>
+      <w:r>
+        <w:rPr>
+          <w:rFonts w:cstheme="minorHAnsi"/>
+          <w:noProof/>
+          <w:sz w:val="36"/>
+          <w:szCs w:val="36"/>
+          <w:lang w:eastAsia="pt-BR"/>
+        </w:rPr>
+        <mc:AlternateContent>
+          <mc:Choice Requires="wps">
+            <w:drawing>
+              <wp:inline distT="0" distB="0" distL="0" distR="0" wp14:anchorId="4E23A1FE" wp14:editId="480A781F">
+                <wp:extent cx="5400040" cy="19050"/>
+                <wp:effectExtent l="0" t="0" r="0" b="0"/>
+                <wp:docPr id="2" name="Retângulo 2"/>
+                <wp:cNvGraphicFramePr/>
+                <a:graphic xmlns:a="http://schemas.openxmlformats.org/drawingml/2006/main">
+                  <a:graphicData uri="http://schemas.microsoft.com/office/word/2010/wordprocessingShape">
+                    <wps:wsp>
+                      <wps:cNvSpPr/>
+                      <wps:spPr>
+                        <a:xfrm>
+                          <a:off x="0" y="0"/>
+                          <a:ext cx="5400000" cy="19080"/>
+                        </a:xfrm>
+                        <a:prstGeom prst="rect">
+                          <a:avLst/>
+                        </a:prstGeom>
+                        <a:solidFill>
+                          <a:srgbClr val="808080"/>
+                        </a:solidFill>
+                        <a:ln w="0">
+                          <a:noFill/>
+                        </a:ln>
+                      </wps:spPr>
+                      <wps:bodyPr/>
+                    </wps:wsp>
+                  </a:graphicData>
+                </a:graphic>
+              </wp:inline>
+            </w:drawing>
+          </mc:Choice>
+          <mc:Fallback>
+            <w:pict>
+              <v:rect id="Retângulo 2" o:spid="_x0000_s1026" style="width:425.2pt;height:1.5pt;visibility:visible;mso-wrap-style:square;mso-left-percent:-10001;mso-top-percent:-10001;mso-position-horizontal:absolute;mso-position-horizontal-relative:char;mso-position-vertical:absolute;mso-position-vertical-relative:line;mso-left-percent:-10001;mso-top-percent:-10001;v-text-anchor:top" o:gfxdata="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" fillcolor="gray" stroked="f" strokeweight="0">
+                <w10:anchorlock/>
+              </v:rect>
+            </w:pict>
+          </mc:Fallback>
+        </mc:AlternateContent>
+      </w:r>
+    </w:p>
+    <w:p>
+      <w:pPr>
+        <w:rPr>
+          <w:rFonts w:cstheme="minorHAnsi"/>
+          <w:b/>
+          <w:bCs/>
+          <w:sz w:val="36"/>
+          <w:szCs w:val="36"/>
+        </w:rPr>
+      </w:pPr>
+      <w:r>
+        <w:rPr>
+          <w:rFonts w:cstheme="minorHAnsi"/>
+          <w:b/>
+          <w:bCs/>
+          <w:sz w:val="36"/>
+          <w:szCs w:val="36"/>
+        </w:rPr>
+        <w:t xml:space="preserve">Mapa Mental </w:t>
+      </w:r>
+      <w:r>
+        <w:rPr>
+          <w:rFonts w:cstheme="minorHAnsi"/>
+          <w:b/>
+          <w:bCs/>
+          <w:sz w:val="36"/>
+          <w:szCs w:val="36"/>
+        </w:rPr>
+        <w:t>– Em ramos</w:t>
+      </w:r>
+    </w:p>
+    <w:p>
+      <w:pPr>
+        <w:rPr>
+          <w:rFonts w:cstheme="minorHAnsi"/>
+          <w:b/>
+          <w:bCs/>
+          <w:sz w:val="36"/>
+          <w:szCs w:val="36"/>
+        </w:rPr>
+      </w:pPr>
+      <w:r>
+        <w:rPr>
+          <w:rFonts w:cstheme="minorHAnsi"/>
+          <w:b/>
+          <w:bCs/>
+          <w:sz w:val="36"/>
+          <w:szCs w:val="36"/>
+        </w:rPr>
+        <w:br w:type="page"/>
+      </w:r>
+    </w:p>
+    <w:p>
+      <w:pPr>
+        <w:rPr>
+          <w:rFonts w:cstheme="minorHAnsi"/>
+          <w:b/>
+          <w:bCs/>
+          <w:sz w:val="36"/>
+          <w:szCs w:val="36"/>
+        </w:rPr>
+      </w:pPr>
+      <w:r>
+        <w:rPr>
+          <w:rFonts w:cstheme="minorHAnsi"/>
+          <w:b/>
+          <w:bCs/>
+          <w:sz w:val="36"/>
+          <w:szCs w:val="36"/>
+        </w:rPr>
+        <w:lastRenderedPageBreak/>
+        <w:t>1</w:t>
+      </w:r>
+      <w:r>
+        <w:rPr>
+          <w:rFonts w:cstheme="minorHAnsi"/>
+          <w:b/>
+          <w:bCs/>
+          <w:sz w:val="36"/>
+          <w:szCs w:val="36"/>
+        </w:rPr>
+        <w:tab/>
+        <w:t>Produção e Estoque</w:t>
+      </w:r>
+    </w:p>
+    <w:p>
+      <w:pPr>
+        <w:rPr>
+          <w:rFonts w:cstheme="minorHAnsi"/>
+          <w:bCs/>
+          <w:sz w:val="36"/>
+          <w:szCs w:val="36"/>
+        </w:rPr>
+      </w:pPr>
+      <w:r>
+        <w:rPr>
+          <w:rFonts w:cstheme="minorHAnsi"/>
+          <w:bCs/>
+          <w:sz w:val="36"/>
+          <w:szCs w:val="36"/>
+        </w:rPr>
+        <w:t>1.1</w:t>
+      </w:r>
+      <w:r>
+        <w:rPr>
+          <w:rFonts w:cstheme="minorHAnsi"/>
+          <w:bCs/>
+          <w:sz w:val="36"/>
+          <w:szCs w:val="36"/>
+        </w:rPr>
+        <w:tab/>
+        <w:t>Matéria-prima (Insumos)</w:t>
+      </w:r>
+    </w:p>
+    <w:p>
+      <w:pPr>
+        <w:rPr>
+          <w:rFonts w:cstheme="minorHAnsi"/>
+          <w:bCs/>
+          <w:sz w:val="36"/>
+          <w:szCs w:val="36"/>
+        </w:rPr>
+      </w:pPr>
+      <w:r>
+        <w:rPr>
+          <w:rFonts w:cstheme="minorHAnsi"/>
+          <w:bCs/>
+          <w:sz w:val="36"/>
+          <w:szCs w:val="36"/>
+        </w:rPr>
+        <w:t>1.2</w:t>
+      </w:r>
+      <w:r>
+        <w:rPr>
+          <w:rFonts w:cstheme="minorHAnsi"/>
+          <w:bCs/>
+          <w:sz w:val="36"/>
+          <w:szCs w:val="36"/>
+        </w:rPr>
+        <w:tab/>
+        <w:t>Produtos Acabados</w:t>
+      </w:r>
+    </w:p>
+    <w:p>
+      <w:pPr>
+        <w:rPr>
+          <w:rFonts w:cstheme="minorHAnsi"/>
+          <w:bCs/>
+          <w:sz w:val="36"/>
+          <w:szCs w:val="36"/>
+        </w:rPr>
+      </w:pPr>
+      <w:r>
+        <w:rPr>
+          <w:rFonts w:cstheme="minorHAnsi"/>
+          <w:bCs/>
+          <w:sz w:val="36"/>
+          <w:szCs w:val="36"/>
+        </w:rPr>
+        <w:t>1.3</w:t>
+      </w:r>
+      <w:r>
+        <w:rPr>
+          <w:rFonts w:cstheme="minorHAnsi"/>
+          <w:bCs/>
+          <w:sz w:val="36"/>
+          <w:szCs w:val="36"/>
+        </w:rPr>
+        <w:tab/>
+        <w:t>Alertas de Estoque Baixo</w:t>
+      </w:r>
+    </w:p>
+    <w:p>
+      <w:pPr>
+        <w:rPr>
+          <w:rFonts w:cstheme="minorHAnsi"/>
+          <w:bCs/>
+          <w:sz w:val="36"/>
+          <w:szCs w:val="36"/>
+        </w:rPr>
+      </w:pPr>
+      <w:r>
+        <w:rPr>
+          <w:rFonts w:cstheme="minorHAnsi"/>
+          <w:bCs/>
+          <w:sz w:val="36"/>
+          <w:szCs w:val="36"/>
+        </w:rPr>
+        <w:t>1.4</w:t>
+      </w:r>
+      <w:r>
+        <w:rPr>
+          <w:rFonts w:cstheme="minorHAnsi"/>
+          <w:bCs/>
+          <w:sz w:val="36"/>
+          <w:szCs w:val="36"/>
+        </w:rPr>
+        <w:tab/>
+        <w:t>Produtos em Estoque</w:t>
+      </w:r>
+    </w:p>
+    <w:p>
+      <w:pPr>
+        <w:rPr>
+          <w:rFonts w:cstheme="minorHAnsi"/>
+          <w:b/>
+          <w:bCs/>
+          <w:sz w:val="36"/>
+          <w:szCs w:val="36"/>
+        </w:rPr>
+      </w:pPr>
+      <w:r>
+        <w:rPr>
+          <w:rFonts w:cstheme="minorHAnsi"/>
+          <w:b/>
+          <w:bCs/>
+          <w:sz w:val="36"/>
+          <w:szCs w:val="36"/>
+        </w:rPr>
+        <w:t>2</w:t>
+      </w:r>
+      <w:r>
+        <w:rPr>
+          <w:rFonts w:cstheme="minorHAnsi"/>
+          <w:b/>
+          <w:bCs/>
+          <w:sz w:val="36"/>
+          <w:szCs w:val="36"/>
+        </w:rPr>
+        <w:tab/>
+        <w:t>Financeiro</w:t>
+      </w:r>
+    </w:p>
+    <w:p>
+      <w:pPr>
+        <w:rPr>
+          <w:rFonts w:cstheme="minorHAnsi"/>
+          <w:b/>
+          <w:bCs/>
+          <w:sz w:val="36"/>
+          <w:szCs w:val="36"/>
+        </w:rPr>
+      </w:pPr>
+      <w:r>
+        <w:rPr>
+          <w:rFonts w:cstheme="minorHAnsi"/>
+          <w:b/>
+          <w:bCs/>
+          <w:sz w:val="36"/>
+          <w:szCs w:val="36"/>
+        </w:rPr>
+        <w:t>2.1</w:t>
+      </w:r>
+      <w:r>
+        <w:rPr>
+          <w:rFonts w:cstheme="minorHAnsi"/>
+          <w:b/>
+          <w:bCs/>
+          <w:sz w:val="36"/>
+          <w:szCs w:val="36"/>
+        </w:rPr>
+        <w:tab/>
+        <w:t>Fluxo de Caixa</w:t>
+      </w:r>
+    </w:p>
+    <w:p>
+      <w:pPr>
+        <w:rPr>
+          <w:rFonts w:cstheme="minorHAnsi"/>
+          <w:bCs/>
+          <w:sz w:val="36"/>
+          <w:szCs w:val="36"/>
+        </w:rPr>
+      </w:pPr>
+      <w:r>
+        <w:rPr>
+          <w:rFonts w:cstheme="minorHAnsi"/>
+          <w:bCs/>
+          <w:sz w:val="36"/>
+          <w:szCs w:val="36"/>
+        </w:rPr>
+        <w:t>2.2</w:t>
+      </w:r>
+      <w:r>
+        <w:rPr>
+          <w:rFonts w:cstheme="minorHAnsi"/>
+          <w:bCs/>
+          <w:sz w:val="36"/>
+          <w:szCs w:val="36"/>
+        </w:rPr>
+        <w:tab/>
+        <w:t>Cálculo de Preço (Mão de Obra)</w:t>
+      </w:r>
+    </w:p>
+    <w:p>
+      <w:pPr>
+        <w:rPr>
+          <w:rFonts w:cstheme="minorHAnsi"/>
+          <w:bCs/>
+          <w:sz w:val="36"/>
+          <w:szCs w:val="36"/>
+        </w:rPr>
+      </w:pPr>
+      <w:r>
+        <w:rPr>
+          <w:rFonts w:cstheme="minorHAnsi"/>
+          <w:bCs/>
+          <w:sz w:val="36"/>
+          <w:szCs w:val="36"/>
+        </w:rPr>
+        <w:t>2.3</w:t>
+      </w:r>
+      <w:r>
+        <w:rPr>
+          <w:rFonts w:cstheme="minorHAnsi"/>
+          <w:bCs/>
+          <w:sz w:val="36"/>
+          <w:szCs w:val="36"/>
+        </w:rPr>
+        <w:tab/>
+        <w:t>Recebimentos de Clientes</w:t>
+      </w:r>
+    </w:p>
+    <w:p>
+      <w:pPr>
+        <w:rPr>
+          <w:rFonts w:cstheme="minorHAnsi"/>
+          <w:bCs/>
+          <w:sz w:val="36"/>
+          <w:szCs w:val="36"/>
+        </w:rPr>
+      </w:pPr>
+      <w:r>
+        <w:rPr>
+          <w:rFonts w:cstheme="minorHAnsi"/>
+          <w:bCs/>
+          <w:sz w:val="36"/>
+          <w:szCs w:val="36"/>
+        </w:rPr>
+        <w:t>2.4</w:t>
+      </w:r>
+      <w:r>
+        <w:rPr>
+          <w:rFonts w:cstheme="minorHAnsi"/>
+          <w:bCs/>
+          <w:sz w:val="36"/>
+          <w:szCs w:val="36"/>
+        </w:rPr>
+        <w:tab/>
+        <w:t>Pagamentos aos Fornecedores</w:t>
+      </w:r>
+    </w:p>
+    <w:p>
+      <w:pPr>
+        <w:rPr>
+          <w:rFonts w:cstheme="minorHAnsi"/>
+          <w:bCs/>
+          <w:sz w:val="36"/>
+          <w:szCs w:val="36"/>
+        </w:rPr>
+      </w:pPr>
+      <w:r>
+        <w:rPr>
+          <w:rFonts w:cstheme="minorHAnsi"/>
+          <w:bCs/>
+          <w:sz w:val="36"/>
+          <w:szCs w:val="36"/>
+        </w:rPr>
+        <w:t>2.5</w:t>
+      </w:r>
+      <w:r>
+        <w:rPr>
+          <w:rFonts w:cstheme="minorHAnsi"/>
+          <w:bCs/>
+          <w:sz w:val="36"/>
+          <w:szCs w:val="36"/>
+        </w:rPr>
+        <w:tab/>
+        <w:t>Margem de Lucro</w:t>
+      </w:r>
+    </w:p>
+    <w:p>
+      <w:pPr>
+        <w:rPr>
+          <w:rFonts w:cstheme="minorHAnsi"/>
+          <w:b/>
+          <w:bCs/>
+          <w:sz w:val="36"/>
+          <w:szCs w:val="36"/>
+        </w:rPr>
+      </w:pPr>
+      <w:r>
+        <w:rPr>
+          <w:rFonts w:cstheme="minorHAnsi"/>
+          <w:b/>
+          <w:bCs/>
+          <w:sz w:val="36"/>
+          <w:szCs w:val="36"/>
+        </w:rPr>
+        <w:t>3</w:t>
+      </w:r>
+      <w:r>
+        <w:rPr>
+          <w:rFonts w:cstheme="minorHAnsi"/>
+          <w:b/>
+          <w:bCs/>
+          <w:sz w:val="36"/>
+          <w:szCs w:val="36"/>
+        </w:rPr>
+        <w:tab/>
+        <w:t>Relatórios</w:t>
+      </w:r>
+    </w:p>
+    <w:p>
+      <w:pPr>
+        <w:rPr>
+          <w:rFonts w:cstheme="minorHAnsi"/>
+          <w:bCs/>
+          <w:sz w:val="36"/>
+          <w:szCs w:val="36"/>
+        </w:rPr>
+      </w:pPr>
+      <w:r>
+        <w:rPr>
+          <w:rFonts w:cstheme="minorHAnsi"/>
+          <w:bCs/>
+          <w:sz w:val="36"/>
+          <w:szCs w:val="36"/>
+        </w:rPr>
+        <w:t>3.1</w:t>
+      </w:r>
+      <w:r>
+        <w:rPr>
+          <w:rFonts w:cstheme="minorHAnsi"/>
+          <w:bCs/>
+          <w:sz w:val="36"/>
+          <w:szCs w:val="36"/>
+        </w:rPr>
+        <w:tab/>
+        <w:t>Vendas por Período</w:t>
+      </w:r>
+    </w:p>
+    <w:p>
+      <w:pPr>
+        <w:rPr>
+          <w:rFonts w:cstheme="minorHAnsi"/>
+          <w:bCs/>
+          <w:sz w:val="36"/>
+          <w:szCs w:val="36"/>
+        </w:rPr>
+      </w:pPr>
+      <w:r>
+        <w:rPr>
+          <w:rFonts w:cstheme="minorHAnsi"/>
+          <w:bCs/>
+          <w:sz w:val="36"/>
+          <w:szCs w:val="36"/>
+        </w:rPr>
+        <w:t>3.2</w:t>
+      </w:r>
+      <w:r>
+        <w:rPr>
+          <w:rFonts w:cstheme="minorHAnsi"/>
+          <w:bCs/>
+          <w:sz w:val="36"/>
+          <w:szCs w:val="36"/>
+        </w:rPr>
+        <w:tab/>
+        <w:t>Lucro por Produto</w:t>
+      </w:r>
+    </w:p>
+    <w:p>
+      <w:pPr>
+        <w:rPr>
+          <w:rFonts w:cstheme="minorHAnsi"/>
+          <w:bCs/>
+          <w:sz w:val="36"/>
+          <w:szCs w:val="36"/>
+        </w:rPr>
+      </w:pPr>
+      <w:r>
+        <w:rPr>
+          <w:rFonts w:cstheme="minorHAnsi"/>
+          <w:bCs/>
+          <w:sz w:val="36"/>
+          <w:szCs w:val="36"/>
+        </w:rPr>
+        <w:t>3.3</w:t>
+      </w:r>
+      <w:r>
+        <w:rPr>
+          <w:rFonts w:cstheme="minorHAnsi"/>
+          <w:bCs/>
+          <w:sz w:val="36"/>
+          <w:szCs w:val="36"/>
+        </w:rPr>
+        <w:tab/>
+        <w:t>Produtos mais Vendidos</w:t>
+      </w:r>
+    </w:p>
+    <w:p>
+      <w:pPr>
+        <w:rPr>
+          <w:rFonts w:cstheme="minorHAnsi"/>
+          <w:bCs/>
+          <w:sz w:val="36"/>
+          <w:szCs w:val="36"/>
+        </w:rPr>
+      </w:pPr>
+      <w:r>
+        <w:rPr>
+          <w:rFonts w:cstheme="minorHAnsi"/>
+          <w:bCs/>
+          <w:sz w:val="36"/>
+          <w:szCs w:val="36"/>
+        </w:rPr>
+        <w:t>3.4</w:t>
+      </w:r>
+      <w:r>
+        <w:rPr>
+          <w:rFonts w:cstheme="minorHAnsi"/>
+          <w:bCs/>
+          <w:sz w:val="36"/>
+          <w:szCs w:val="36"/>
+        </w:rPr>
+        <w:tab/>
+        <w:t>Vendas por Cliente</w:t>
+      </w:r>
+    </w:p>
+    <w:p>
+      <w:pPr>
+        <w:rPr>
+          <w:rFonts w:cstheme="minorHAnsi"/>
+          <w:bCs/>
+          <w:sz w:val="36"/>
+          <w:szCs w:val="36"/>
+        </w:rPr>
+      </w:pPr>
+      <w:r>
+        <w:rPr>
+          <w:rFonts w:cstheme="minorHAnsi"/>
+          <w:bCs/>
+          <w:sz w:val="36"/>
+          <w:szCs w:val="36"/>
+        </w:rPr>
+        <w:t>3.5</w:t>
+      </w:r>
+      <w:r>
+        <w:rPr>
+          <w:rFonts w:cstheme="minorHAnsi"/>
+          <w:bCs/>
+          <w:sz w:val="36"/>
+          <w:szCs w:val="36"/>
+        </w:rPr>
+        <w:tab/>
+        <w:t>Clientes Aniversariantes</w:t>
+      </w:r>
+    </w:p>
+    <w:p>
+      <w:pPr>
+        <w:rPr>
+          <w:rFonts w:cstheme="minorHAnsi"/>
+          <w:b/>
+          <w:bCs/>
+          <w:sz w:val="36"/>
+          <w:szCs w:val="36"/>
+        </w:rPr>
+      </w:pPr>
+      <w:r>
+        <w:rPr>
+          <w:rFonts w:cstheme="minorHAnsi"/>
+          <w:b/>
+          <w:bCs/>
+          <w:sz w:val="36"/>
+          <w:szCs w:val="36"/>
+        </w:rPr>
+        <w:t>4</w:t>
+      </w:r>
+      <w:r>
+        <w:rPr>
+          <w:rFonts w:cstheme="minorHAnsi"/>
+          <w:b/>
+          <w:bCs/>
+          <w:sz w:val="36"/>
+          <w:szCs w:val="36"/>
+        </w:rPr>
+        <w:tab/>
+        <w:t>Módulo de Cadastros</w:t>
+      </w:r>
+    </w:p>
+    <w:p>
+      <w:pPr>
+        <w:rPr>
+          <w:rFonts w:cstheme="minorHAnsi"/>
+          <w:bCs/>
+          <w:sz w:val="36"/>
+          <w:szCs w:val="36"/>
+        </w:rPr>
+      </w:pPr>
+      <w:r>
+        <w:rPr>
+          <w:rFonts w:cstheme="minorHAnsi"/>
+          <w:bCs/>
+          <w:sz w:val="36"/>
+          <w:szCs w:val="36"/>
+        </w:rPr>
+        <w:t>4.1</w:t>
+      </w:r>
+      <w:r>
+        <w:rPr>
+          <w:rFonts w:cstheme="minorHAnsi"/>
+          <w:bCs/>
+          <w:sz w:val="36"/>
+          <w:szCs w:val="36"/>
+        </w:rPr>
+        <w:tab/>
+        <w:t>Clientes (Foco LGPD)</w:t>
+      </w:r>
+    </w:p>
+    <w:p>
+      <w:pPr>
+        <w:rPr>
+          <w:rFonts w:cstheme="minorHAnsi"/>
+          <w:bCs/>
+          <w:sz w:val="36"/>
+          <w:szCs w:val="36"/>
+        </w:rPr>
+      </w:pPr>
+      <w:r>
+        <w:rPr>
+          <w:rFonts w:cstheme="minorHAnsi"/>
+          <w:bCs/>
+          <w:sz w:val="36"/>
+          <w:szCs w:val="36"/>
+        </w:rPr>
+        <w:t>4.2</w:t>
+      </w:r>
+      <w:r>
+        <w:rPr>
+          <w:rFonts w:cstheme="minorHAnsi"/>
+          <w:bCs/>
+          <w:sz w:val="36"/>
+          <w:szCs w:val="36"/>
+        </w:rPr>
+        <w:tab/>
+        <w:t>Fornecedores</w:t>
+      </w:r>
+    </w:p>
+    <w:p>
+      <w:pPr>
+        <w:rPr>
+          <w:rFonts w:cstheme="minorHAnsi"/>
+          <w:bCs/>
+          <w:sz w:val="36"/>
+          <w:szCs w:val="36"/>
+        </w:rPr>
+      </w:pPr>
+      <w:r>
+        <w:rPr>
+          <w:rFonts w:cstheme="minorHAnsi"/>
+          <w:bCs/>
+          <w:sz w:val="36"/>
+          <w:szCs w:val="36"/>
+        </w:rPr>
+        <w:t>4.3</w:t>
+      </w:r>
+      <w:r>
+        <w:rPr>
+          <w:rFonts w:cstheme="minorHAnsi"/>
+          <w:bCs/>
+          <w:sz w:val="36"/>
+          <w:szCs w:val="36"/>
+        </w:rPr>
+        <w:tab/>
+        <w:t>Produtos (Ficha Técnica)</w:t>
+      </w:r>
+    </w:p>
+    <w:p>
+      <w:pPr>
+        <w:rPr>
+          <w:rFonts w:cstheme="minorHAnsi"/>
+          <w:bCs/>
+          <w:sz w:val="36"/>
+          <w:szCs w:val="36"/>
+        </w:rPr>
+      </w:pPr>
+      <w:r>
+        <w:rPr>
+          <w:rFonts w:cstheme="minorHAnsi"/>
+          <w:bCs/>
+          <w:sz w:val="36"/>
+          <w:szCs w:val="36"/>
+        </w:rPr>
+        <w:t>4.4</w:t>
+      </w:r>
+      <w:r>
+        <w:rPr>
+          <w:rFonts w:cstheme="minorHAnsi"/>
+          <w:bCs/>
+          <w:sz w:val="36"/>
+          <w:szCs w:val="36"/>
+        </w:rPr>
+        <w:tab/>
+        <w:t>Funcionários</w:t>
+      </w:r>
+    </w:p>
+    <w:p>
+      <w:pPr>
+        <w:rPr>
+          <w:rFonts w:cstheme="minorHAnsi"/>
+          <w:bCs/>
+          <w:sz w:val="36"/>
+          <w:szCs w:val="36"/>
+        </w:rPr>
+      </w:pPr>
+      <w:r>
+        <w:rPr>
+          <w:rFonts w:cstheme="minorHAnsi"/>
+          <w:bCs/>
+          <w:sz w:val="36"/>
+          <w:szCs w:val="36"/>
+        </w:rPr>
+        <w:t>4.5</w:t>
+      </w:r>
+      <w:r>
+        <w:rPr>
+          <w:rFonts w:cstheme="minorHAnsi"/>
+          <w:bCs/>
+          <w:sz w:val="36"/>
+          <w:szCs w:val="36"/>
+        </w:rPr>
+        <w:tab/>
+        <w:t>Tipos de Produtos</w:t>
+      </w:r>
+    </w:p>
+    <w:p>
+      <w:pPr>
+        <w:rPr>
+          <w:rFonts w:cstheme="minorHAnsi"/>
+          <w:b/>
+          <w:bCs/>
+          <w:sz w:val="36"/>
+          <w:szCs w:val="36"/>
+        </w:rPr>
+      </w:pPr>
+      <w:r>
+        <w:rPr>
+          <w:rFonts w:cstheme="minorHAnsi"/>
+          <w:b/>
+          <w:bCs/>
+          <w:sz w:val="36"/>
+          <w:szCs w:val="36"/>
+        </w:rPr>
+        <w:lastRenderedPageBreak/>
+        <w:t>5</w:t>
+      </w:r>
+      <w:r>
+        <w:rPr>
+          <w:rFonts w:cstheme="minorHAnsi"/>
+          <w:b/>
+          <w:bCs/>
+          <w:sz w:val="36"/>
+          <w:szCs w:val="36"/>
+        </w:rPr>
+        <w:tab/>
+        <w:t>Vendas e Encomendas</w:t>
+      </w:r>
+    </w:p>
+    <w:p>
+      <w:pPr>
+        <w:rPr>
+          <w:rFonts w:cstheme="minorHAnsi"/>
+          <w:bCs/>
+          <w:sz w:val="36"/>
+          <w:szCs w:val="36"/>
+        </w:rPr>
+      </w:pPr>
+      <w:r>
+        <w:rPr>
+          <w:rFonts w:cstheme="minorHAnsi"/>
+          <w:bCs/>
+          <w:sz w:val="36"/>
+          <w:szCs w:val="36"/>
+        </w:rPr>
+        <w:t>5.1</w:t>
+      </w:r>
+      <w:r>
+        <w:rPr>
+          <w:rFonts w:cstheme="minorHAnsi"/>
+          <w:bCs/>
+          <w:sz w:val="36"/>
+          <w:szCs w:val="36"/>
+        </w:rPr>
+        <w:tab/>
+        <w:t>Status do Pedido (Produção)</w:t>
+      </w:r>
+    </w:p>
+    <w:p>
+      <w:pPr>
+        <w:rPr>
+          <w:rFonts w:cstheme="minorHAnsi"/>
+          <w:bCs/>
+          <w:sz w:val="36"/>
+          <w:szCs w:val="36"/>
+        </w:rPr>
+      </w:pPr>
+      <w:r>
+        <w:rPr>
+          <w:rFonts w:cstheme="minorHAnsi"/>
+          <w:bCs/>
+          <w:sz w:val="36"/>
+          <w:szCs w:val="36"/>
+        </w:rPr>
+        <w:t>5.2</w:t>
+      </w:r>
+      <w:r>
+        <w:rPr>
+          <w:rFonts w:cstheme="minorHAnsi"/>
+          <w:bCs/>
+          <w:sz w:val="36"/>
+          <w:szCs w:val="36"/>
+        </w:rPr>
+        <w:tab/>
+        <w:t>Portfólio de Serviços</w:t>
+      </w:r>
+    </w:p>
+    <w:p>
+      <w:pPr>
+        <w:rPr>
+          <w:rFonts w:cstheme="minorHAnsi"/>
+          <w:bCs/>
+          <w:sz w:val="36"/>
+          <w:szCs w:val="36"/>
+        </w:rPr>
+      </w:pPr>
+      <w:r>
+        <w:rPr>
+          <w:rFonts w:cstheme="minorHAnsi"/>
+          <w:bCs/>
+          <w:sz w:val="36"/>
+          <w:szCs w:val="36"/>
+        </w:rPr>
+        <w:t>5.3</w:t>
+      </w:r>
+      <w:r>
+        <w:rPr>
+          <w:rFonts w:cstheme="minorHAnsi"/>
+          <w:bCs/>
+          <w:sz w:val="36"/>
+          <w:szCs w:val="36"/>
+        </w:rPr>
+        <w:tab/>
+        <w:t>Pagamentos Parciais (Sinal)</w:t>
+      </w:r>
+    </w:p>
+    <w:p>
+      <w:pPr>
+        <w:rPr>
+          <w:rFonts w:cstheme="minorHAnsi"/>
+          <w:b/>
+          <w:bCs/>
+          <w:sz w:val="36"/>
+          <w:szCs w:val="36"/>
+        </w:rPr>
+      </w:pPr>
+      <w:r>
+        <w:rPr>
+          <w:rFonts w:cstheme="minorHAnsi"/>
+          <w:b/>
+          <w:bCs/>
+          <w:sz w:val="36"/>
+          <w:szCs w:val="36"/>
+        </w:rPr>
+        <w:t>6</w:t>
+      </w:r>
+      <w:r>
+        <w:rPr>
+          <w:rFonts w:cstheme="minorHAnsi"/>
+          <w:b/>
+          <w:bCs/>
+          <w:sz w:val="36"/>
+          <w:szCs w:val="36"/>
+        </w:rPr>
+        <w:tab/>
+        <w:t>Movimentações</w:t>
+      </w:r>
+    </w:p>
+    <w:p>
+      <w:pPr>
+        <w:rPr>
+          <w:rFonts w:cstheme="minorHAnsi"/>
+          <w:bCs/>
+          <w:sz w:val="36"/>
+          <w:szCs w:val="36"/>
+        </w:rPr>
+      </w:pPr>
+      <w:r>
+        <w:rPr>
+          <w:rFonts w:cstheme="minorHAnsi"/>
+          <w:bCs/>
+          <w:sz w:val="36"/>
+          <w:szCs w:val="36"/>
+        </w:rPr>
+        <w:t>6.1</w:t>
+      </w:r>
+      <w:r>
+        <w:rPr>
+          <w:rFonts w:cstheme="minorHAnsi"/>
+          <w:bCs/>
+          <w:sz w:val="36"/>
+          <w:szCs w:val="36"/>
+        </w:rPr>
+        <w:tab/>
+        <w:t>Compras de Produtos</w:t>
+      </w:r>
+    </w:p>
+    <w:p>
+      <w:pPr>
+        <w:rPr>
+          <w:rFonts w:cstheme="minorHAnsi"/>
+          <w:bCs/>
+          <w:sz w:val="36"/>
+          <w:szCs w:val="36"/>
+        </w:rPr>
+      </w:pPr>
+      <w:r>
+        <w:rPr>
+          <w:rFonts w:cstheme="minorHAnsi"/>
+          <w:bCs/>
+          <w:sz w:val="36"/>
+          <w:szCs w:val="36"/>
+        </w:rPr>
+        <w:t>6.2</w:t>
+      </w:r>
+      <w:r>
+        <w:rPr>
+          <w:rFonts w:cstheme="minorHAnsi"/>
+          <w:bCs/>
+          <w:sz w:val="36"/>
+          <w:szCs w:val="36"/>
+        </w:rPr>
+        <w:tab/>
+        <w:t>Vendas de Produtos</w:t>
+      </w:r>
+    </w:p>
+    <w:p>
+      <w:pPr>
+        <w:rPr>
+          <w:rFonts w:cstheme="minorHAnsi"/>
+          <w:bCs/>
+          <w:sz w:val="36"/>
+          <w:szCs w:val="36"/>
+        </w:rPr>
+      </w:pPr>
+      <w:r>
+        <w:rPr>
+          <w:rFonts w:cstheme="minorHAnsi"/>
+          <w:bCs/>
+          <w:sz w:val="36"/>
+          <w:szCs w:val="36"/>
+        </w:rPr>
+        <w:t>6.3</w:t>
+      </w:r>
+      <w:r>
+        <w:rPr>
+          <w:rFonts w:cstheme="minorHAnsi"/>
+          <w:bCs/>
+          <w:sz w:val="36"/>
+          <w:szCs w:val="36"/>
+        </w:rPr>
+        <w:tab/>
+        <w:t>Devolução de Produtos</w:t>
+      </w:r>
+    </w:p>
+    <w:p>
+      <w:pPr>
+        <w:rPr>
+          <w:rFonts w:cstheme="minorHAnsi"/>
+          <w:b/>
+          <w:bCs/>
+          <w:sz w:val="36"/>
+          <w:szCs w:val="36"/>
+        </w:rPr>
+      </w:pPr>
+      <w:r>
+        <w:rPr>
+          <w:rFonts w:cstheme="minorHAnsi"/>
+          <w:b/>
+          <w:bCs/>
+          <w:sz w:val="36"/>
+          <w:szCs w:val="36"/>
+        </w:rPr>
+        <w:t>7</w:t>
+      </w:r>
+      <w:r>
+        <w:rPr>
+          <w:rFonts w:cstheme="minorHAnsi"/>
+          <w:b/>
+          <w:bCs/>
+          <w:sz w:val="36"/>
+          <w:szCs w:val="36"/>
+        </w:rPr>
+        <w:tab/>
+        <w:t>Configurações e Segurança</w:t>
+      </w:r>
+    </w:p>
+    <w:p>
+      <w:pPr>
+        <w:rPr>
+          <w:rFonts w:cstheme="minorHAnsi"/>
+          <w:bCs/>
+          <w:sz w:val="36"/>
+          <w:szCs w:val="36"/>
+        </w:rPr>
+      </w:pPr>
+      <w:r>
+        <w:rPr>
+          <w:rFonts w:cstheme="minorHAnsi"/>
+          <w:bCs/>
+          <w:sz w:val="36"/>
+          <w:szCs w:val="36"/>
+        </w:rPr>
+        <w:t>7.1</w:t>
+      </w:r>
+      <w:r>
+        <w:rPr>
+          <w:rFonts w:cstheme="minorHAnsi"/>
+          <w:bCs/>
+          <w:sz w:val="36"/>
+          <w:szCs w:val="36"/>
+        </w:rPr>
+        <w:tab/>
+        <w:t>Níveis de Usuário (RBAC)</w:t>
+      </w:r>
+    </w:p>
+    <w:p>
+      <w:pPr>
+        <w:rPr>
+          <w:rFonts w:cstheme="minorHAnsi"/>
+          <w:bCs/>
+          <w:sz w:val="36"/>
+          <w:szCs w:val="36"/>
+        </w:rPr>
+      </w:pPr>
+      <w:r>
+        <w:rPr>
+          <w:rFonts w:cstheme="minorHAnsi"/>
+          <w:bCs/>
+          <w:sz w:val="36"/>
+          <w:szCs w:val="36"/>
+        </w:rPr>
+        <w:t>7.1.1</w:t>
+      </w:r>
+      <w:r>
+        <w:rPr>
+          <w:rFonts w:cstheme="minorHAnsi"/>
+          <w:bCs/>
+          <w:sz w:val="36"/>
+          <w:szCs w:val="36"/>
+        </w:rPr>
+        <w:tab/>
+      </w:r>
+      <w:proofErr w:type="spellStart"/>
+      <w:r>
+        <w:rPr>
+          <w:rFonts w:cstheme="minorHAnsi"/>
+          <w:bCs/>
+          <w:sz w:val="36"/>
+          <w:szCs w:val="36"/>
+        </w:rPr>
+        <w:t>Admin</w:t>
+      </w:r>
+      <w:proofErr w:type="spellEnd"/>
+    </w:p>
+    <w:p>
+      <w:pPr>
+        <w:rPr>
+          <w:rFonts w:cstheme="minorHAnsi"/>
+          <w:bCs/>
+          <w:sz w:val="36"/>
+          <w:szCs w:val="36"/>
+        </w:rPr>
+      </w:pPr>
+      <w:r>
+        <w:rPr>
+          <w:rFonts w:cstheme="minorHAnsi"/>
+          <w:bCs/>
+          <w:sz w:val="36"/>
+          <w:szCs w:val="36"/>
+        </w:rPr>
+        <w:t>7.1.2</w:t>
+      </w:r>
+      <w:r>
+        <w:rPr>
+          <w:rFonts w:cstheme="minorHAnsi"/>
+          <w:bCs/>
+          <w:sz w:val="36"/>
+          <w:szCs w:val="36"/>
+        </w:rPr>
+        <w:tab/>
+        <w:t>Normal</w:t>
+      </w:r>
+    </w:p>
+    <w:p>
+      <w:pPr>
+        <w:rPr>
+          <w:rFonts w:cstheme="minorHAnsi"/>
+          <w:bCs/>
+          <w:sz w:val="36"/>
+          <w:szCs w:val="36"/>
+        </w:rPr>
+      </w:pPr>
+      <w:r>
+        <w:rPr>
+          <w:rFonts w:cstheme="minorHAnsi"/>
+          <w:bCs/>
+          <w:sz w:val="36"/>
+          <w:szCs w:val="36"/>
+        </w:rPr>
+        <w:t>7.2</w:t>
+      </w:r>
+      <w:r>
+        <w:rPr>
+          <w:rFonts w:cstheme="minorHAnsi"/>
+          <w:bCs/>
+          <w:sz w:val="36"/>
+          <w:szCs w:val="36"/>
+        </w:rPr>
+        <w:tab/>
+        <w:t>Logs de Sistema (Segurança)</w:t>
+      </w:r>
+    </w:p>
+    <w:p>
+      <w:pPr>
+        <w:rPr>
+          <w:rFonts w:cstheme="minorHAnsi"/>
+          <w:bCs/>
+          <w:sz w:val="36"/>
+          <w:szCs w:val="36"/>
+        </w:rPr>
+      </w:pPr>
+      <w:r>
+        <w:rPr>
+          <w:rFonts w:cstheme="minorHAnsi"/>
+          <w:bCs/>
+          <w:sz w:val="36"/>
+          <w:szCs w:val="36"/>
+        </w:rPr>
+        <w:t>7.3</w:t>
+      </w:r>
+      <w:r>
+        <w:rPr>
+          <w:rFonts w:cstheme="minorHAnsi"/>
+          <w:bCs/>
+          <w:sz w:val="36"/>
+          <w:szCs w:val="36"/>
+        </w:rPr>
+        <w:tab/>
+        <w:t>Tela de Contato / Suporte</w:t>
+      </w:r>
+    </w:p>
+    <w:p>
+      <w:pPr>
+        <w:rPr>
+          <w:rFonts w:cstheme="minorHAnsi"/>
+          <w:sz w:val="36"/>
+          <w:szCs w:val="36"/>
+        </w:rPr>
+      </w:pPr>
+      <w:r>
+        <w:rPr>
+          <w:rFonts w:cstheme="minorHAnsi"/>
+          <w:noProof/>
+          <w:sz w:val="36"/>
+          <w:szCs w:val="36"/>
+          <w:lang w:eastAsia="pt-BR"/>
+        </w:rPr>
+        <mc:AlternateContent>
+          <mc:Choice Requires="wps">
+            <w:drawing>
+              <wp:inline distT="0" distB="0" distL="0" distR="0" wp14:anchorId="13C1CED8" wp14:editId="0D28EC25">
+                <wp:extent cx="5400040" cy="19050"/>
+                <wp:effectExtent l="0" t="0" r="0" b="0"/>
+                <wp:docPr id="3" name="Retângulo 3"/>
+                <wp:cNvGraphicFramePr/>
+                <a:graphic xmlns:a="http://schemas.openxmlformats.org/drawingml/2006/main">
+                  <a:graphicData uri="http://schemas.microsoft.com/office/word/2010/wordprocessingShape">
+                    <wps:wsp>
+                      <wps:cNvSpPr/>
+                      <wps:spPr>
+                        <a:xfrm>
+                          <a:off x="0" y="0"/>
+                          <a:ext cx="5400000" cy="19080"/>
+                        </a:xfrm>
+                        <a:prstGeom prst="rect">
+                          <a:avLst/>
+                        </a:prstGeom>
+                        <a:solidFill>
+                          <a:srgbClr val="808080"/>
+                        </a:solidFill>
+                        <a:ln w="0">
+                          <a:noFill/>
+                        </a:ln>
+                      </wps:spPr>
+                      <wps:bodyPr/>
+                    </wps:wsp>
+                  </a:graphicData>
+                </a:graphic>
+              </wp:inline>
+            </w:drawing>
+          </mc:Choice>
+          <mc:Fallback>
+            <w:pict>
+              <v:rect id="Retângulo 3" o:spid="_x0000_s1026" style="width:425.2pt;height:1.5pt;visibility:visible;mso-wrap-style:square;mso-left-percent:-10001;mso-top-percent:-10001;mso-position-horizontal:absolute;mso-position-horizontal-relative:char;mso-position-vertical:absolute;mso-position-vertical-relative:line;mso-left-percent:-10001;mso-top-percent:-10001;v-text-anchor:top" o:gfxdata="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" fillcolor="gray" stroked="f" strokeweight="0">
+                <w10:anchorlock/>
+              </v:rect>
+            </w:pict>
+          </mc:Fallback>
+        </mc:AlternateContent>
+      </w:r>
+    </w:p>
+    <w:p>
+      <w:pPr>
+        <w:rPr>
+          <w:rFonts w:cstheme="minorHAnsi"/>
+          <w:b/>
+          <w:bCs/>
+          <w:sz w:val="36"/>
+          <w:szCs w:val="36"/>
+        </w:rPr>
+      </w:pPr>
+      <w:r>
+        <w:rPr>
+          <w:rFonts w:cstheme="minorHAnsi"/>
+          <w:b/>
+          <w:bCs/>
+          <w:sz w:val="36"/>
+          <w:szCs w:val="36"/>
+        </w:rPr>
+        <w:t xml:space="preserve">Mapa Mental </w:t>
+      </w:r>
+      <w:r>
+        <w:rPr>
+          <w:rFonts w:cstheme="minorHAnsi"/>
+          <w:b/>
+          <w:bCs/>
+          <w:sz w:val="36"/>
+          <w:szCs w:val="36"/>
+        </w:rPr>
+        <w:t xml:space="preserve">– </w:t>
+      </w:r>
+      <w:r>
+        <w:rPr>
+          <w:rFonts w:cstheme="minorHAnsi"/>
+          <w:b/>
+          <w:bCs/>
+          <w:sz w:val="36"/>
+          <w:szCs w:val="36"/>
+        </w:rPr>
+        <w:t>Visual</w:t>
+      </w:r>
+    </w:p>
+    <w:p>
+      <w:pPr>
+        <w:rPr>
+          <w:rFonts w:cstheme="minorHAnsi"/>
+          <w:b/>
+          <w:bCs/>
+          <w:sz w:val="36"/>
+          <w:szCs w:val="36"/>
+        </w:rPr>
+      </w:pPr>
+      <w:r>
+        <w:rPr>
+          <w:rFonts w:cstheme="minorHAnsi"/>
+          <w:b/>
+          <w:bCs/>
+          <w:noProof/>
+          <w:sz w:val="36"/>
+          <w:szCs w:val="36"/>
+          <w:lang w:eastAsia="pt-BR"/>
+        </w:rPr>
+        <w:drawing>
+          <wp:inline distT="0" distB="0" distL="0" distR="0" wp14:anchorId="4E884972" wp14:editId="53EE11AD">
+            <wp:extent cx="6645910" cy="2396490"/>
+            <wp:effectExtent l="19050" t="19050" r="21590" b="22860"/>
+            <wp:docPr id="4" name="Imagem 4"/>
+            <wp:cNvGraphicFramePr>
+              <a:graphicFrameLocks xmlns:a="http://schemas.openxmlformats.org/drawingml/2006/main" noChangeAspect="1"/>
+            </wp:cNvGraphicFramePr>
+            <a:graphic xmlns:a="http://schemas.openxmlformats.org/drawingml/2006/main">
+              <a:graphicData uri="http://schemas.openxmlformats.org/drawingml/2006/picture">
+                <pic:pic xmlns:pic="http://schemas.openxmlformats.org/drawingml/2006/picture">
+                  <pic:nvPicPr>
+                    <pic:cNvPr id="0" name="Sistema de Gestão-vendas - Bordados.png"/>
+                    <pic:cNvPicPr/>
+                  </pic:nvPicPr>
+                  <pic:blipFill>
+                    <a:blip r:embed="rId9">
+                      <a:extLst>
+                        <a:ext uri="{BEBA8EAE-BF5A-486C-A8C5-ECC9F3942E4B}">
+                          <a14:imgProps xmlns:a14="http://schemas.microsoft.com/office/drawing/2010/main">
+                            <a14:imgLayer r:embed="rId10">
+                              <a14:imgEffect>
+                                <a14:sharpenSoften amount="50000"/>
+                              </a14:imgEffect>
+                            </a14:imgLayer>
+                          </a14:imgProps>
+                        </a:ext>
+                        <a:ext uri="{28A0092B-C50C-407E-A947-70E740481C1C}">
+                          <a14:useLocalDpi xmlns:a14="http://schemas.microsoft.com/office/drawing/2010/main" val="0"/>
+                        </a:ext>
+                      </a:extLst>
+                    </a:blip>
+                    <a:stretch>
+                      <a:fillRect/>
+                    </a:stretch>
+                  </pic:blipFill>
+                  <pic:spPr>
+                    <a:xfrm>
+                      <a:off x="0" y="0"/>
+                      <a:ext cx="6645910" cy="2396490"/>
+                    </a:xfrm>
+                    <a:prstGeom prst="rect">
+                      <a:avLst/>
+                    </a:prstGeom>
+                    <a:ln>
+                      <a:solidFill>
+                        <a:schemeClr val="accent1"/>
+                      </a:solidFill>
+                    </a:ln>
+                  </pic:spPr>
+                </pic:pic>
+              </a:graphicData>
+            </a:graphic>
+          </wp:inline>
+        </w:drawing>
+      </w:r>
+    </w:p>
+    <w:p>
+      <w:pPr>
+        <w:spacing w:after="120" w:line="240" w:lineRule="auto"/>
+        <w:jc w:val="both"/>
+        <w:rPr>
+          <w:rFonts w:eastAsia="Times New Roman" w:cstheme="minorHAnsi"/>
+          <w:color w:val="1F1F1F"/>
+          <w:sz w:val="36"/>
+          <w:szCs w:val="36"/>
+          <w:lang w:eastAsia="pt-BR"/>
+        </w:rPr>
+      </w:pPr>
+      <w:r>
+        <w:rPr>
+          <w:rFonts w:eastAsia="Times New Roman" w:cstheme="minorHAnsi"/>
+          <w:color w:val="1F1F1F"/>
+          <w:sz w:val="36"/>
+          <w:szCs w:val="36"/>
+          <w:lang w:eastAsia="pt-BR"/>
+        </w:rPr>
+        <w:lastRenderedPageBreak/>
+        <w:pict w14:anchorId="5D8ED514">
+          <v:rect id="_x0000_i1029" style="width:0;height:1.5pt" o:hralign="center" o:hrstd="t" o:hrnoshade="t" o:hr="t" fillcolor="gray" stroked="f"/>
+        </w:pict>
+      </w:r>
+    </w:p>
+    <w:p>
+      <w:pPr>
+        <w:spacing w:before="100" w:beforeAutospacing="1" w:after="120" w:line="240" w:lineRule="auto"/>
+        <w:jc w:val="both"/>
+        <w:outlineLvl w:val="2"/>
+        <w:rPr>
+          <w:rFonts w:eastAsia="Times New Roman" w:cstheme="minorHAnsi"/>
+          <w:b/>
+          <w:bCs/>
+          <w:color w:val="1F1F1F"/>
+          <w:sz w:val="36"/>
+          <w:szCs w:val="36"/>
+          <w:lang w:eastAsia="pt-BR"/>
+        </w:rPr>
+      </w:pPr>
+      <w:proofErr w:type="gramStart"/>
+      <w:r>
+        <w:rPr>
+          <w:rFonts w:eastAsia="Times New Roman" w:cstheme="minorHAnsi"/>
+          <w:b/>
+          <w:bCs/>
+          <w:color w:val="1F1F1F"/>
+          <w:sz w:val="36"/>
+          <w:szCs w:val="36"/>
+          <w:lang w:eastAsia="pt-BR"/>
+        </w:rPr>
+        <w:t>Próximos Passos</w:t>
+      </w:r>
+      <w:proofErr w:type="gramEnd"/>
+      <w:r>
+        <w:rPr>
+          <w:rFonts w:eastAsia="Times New Roman" w:cstheme="minorHAnsi"/>
+          <w:b/>
+          <w:bCs/>
+          <w:color w:val="1F1F1F"/>
+          <w:sz w:val="36"/>
+          <w:szCs w:val="36"/>
+          <w:lang w:eastAsia="pt-BR"/>
+        </w:rPr>
+        <w:t xml:space="preserve"> (Semana 3 – 23/03 á 06/04</w:t>
+      </w:r>
+      <w:r>
+        <w:rPr>
+          <w:rFonts w:eastAsia="Times New Roman" w:cstheme="minorHAnsi"/>
+          <w:b/>
+          <w:bCs/>
+          <w:color w:val="1F1F1F"/>
+          <w:sz w:val="36"/>
+          <w:szCs w:val="36"/>
+          <w:lang w:eastAsia="pt-BR"/>
+        </w:rPr>
+        <w:t>)</w:t>
+      </w:r>
+    </w:p>
+    <w:p>
+      <w:pPr>
+        <w:spacing w:before="100" w:beforeAutospacing="1" w:after="120" w:line="240" w:lineRule="auto"/>
+        <w:jc w:val="both"/>
+        <w:rPr>
+          <w:rFonts w:eastAsia="Times New Roman" w:cstheme="minorHAnsi"/>
+          <w:color w:val="1F1F1F"/>
+          <w:sz w:val="36"/>
+          <w:szCs w:val="36"/>
+          <w:lang w:eastAsia="pt-BR"/>
+        </w:rPr>
+      </w:pPr>
+      <w:r>
+        <w:rPr>
+          <w:rFonts w:eastAsia="Times New Roman" w:cstheme="minorHAnsi"/>
+          <w:color w:val="1F1F1F"/>
+          <w:sz w:val="36"/>
+          <w:szCs w:val="36"/>
+          <w:lang w:eastAsia="pt-BR"/>
+        </w:rPr>
+        <w:t>Com este documento pronto, estamos aptos a avançar para:</w:t>
+      </w:r>
+    </w:p>
+    <w:p>
+      <w:pPr>
+        <w:numPr>
+          <w:ilvl w:val="0"/>
+          <w:numId w:val="13"/>
+        </w:numPr>
+        <w:spacing w:before="100" w:beforeAutospacing="1" w:after="0" w:line="240" w:lineRule="auto"/>
+        <w:jc w:val="both"/>
+        <w:rPr>
+          <w:rFonts w:eastAsia="Times New Roman" w:cstheme="minorHAnsi"/>
+          <w:color w:val="1F1F1F"/>
+          <w:sz w:val="36"/>
+          <w:szCs w:val="36"/>
+          <w:lang w:eastAsia="pt-BR"/>
+        </w:rPr>
+      </w:pPr>
+      <w:r>
+        <w:rPr>
+          <w:rFonts w:eastAsia="Times New Roman" w:cstheme="minorHAnsi"/>
+          <w:b/>
+          <w:bCs/>
+          <w:color w:val="1F1F1F"/>
+          <w:sz w:val="36"/>
+          <w:szCs w:val="36"/>
+          <w:bdr w:val="none" w:sz="0" w:space="0" w:color="auto" w:frame="1"/>
+          <w:lang w:eastAsia="pt-BR"/>
+        </w:rPr>
+        <w:t>Protótipos das Interfaces</w:t>
+      </w:r>
+      <w:r>
+        <w:rPr>
+          <w:rFonts w:eastAsia="Times New Roman" w:cstheme="minorHAnsi"/>
+          <w:color w:val="1F1F1F"/>
+          <w:sz w:val="36"/>
+          <w:szCs w:val="36"/>
+          <w:lang w:eastAsia="pt-BR"/>
+        </w:rPr>
+        <w:t>:</w:t>
+      </w:r>
+      <w:r>
+        <w:rPr>
+          <w:rFonts w:eastAsia="Times New Roman" w:cstheme="minorHAnsi"/>
+          <w:color w:val="1F1F1F"/>
+          <w:sz w:val="36"/>
+          <w:szCs w:val="36"/>
+          <w:lang w:eastAsia="pt-BR"/>
+        </w:rPr>
+        <w:t xml:space="preserve"> </w:t>
+      </w:r>
+    </w:p>
+    <w:p>
+      <w:pPr>
+        <w:jc w:val="both"/>
         <w:rPr>
           <w:sz w:val="32"/>
           <w:szCs w:val="32"/>
         </w:rPr>
       </w:pPr>
     </w:p>
+    <w:p>
+      <w:pPr>
+        <w:rPr>
+          <w:sz w:val="36"/>
+          <w:szCs w:val="36"/>
+        </w:rPr>
+      </w:pPr>
+      <w:r>
+        <w:rPr>
+          <w:sz w:val="36"/>
+          <w:szCs w:val="36"/>
+        </w:rPr>
+        <w:t xml:space="preserve">*Calendário de trabalho* </w:t>
+      </w:r>
+      <w:r>
+        <w:rPr>
+          <w:sz w:val="36"/>
+          <w:szCs w:val="36"/>
+        </w:rPr>
+        <w:br/>
+      </w:r>
+    </w:p>
+    <w:p>
+      <w:pPr>
+        <w:rPr>
+          <w:sz w:val="36"/>
+          <w:szCs w:val="36"/>
+        </w:rPr>
+      </w:pPr>
+      <w:r>
+        <w:rPr>
+          <w:sz w:val="36"/>
+          <w:szCs w:val="36"/>
+        </w:rPr>
+        <w:t>*Semana 3 - 23/03 á 06/04</w:t>
+      </w:r>
+      <w:r>
+        <w:rPr>
+          <w:sz w:val="36"/>
+          <w:szCs w:val="36"/>
+        </w:rPr>
+        <w:t xml:space="preserve">* </w:t>
+      </w:r>
+    </w:p>
+    <w:p>
+      <w:pPr>
+        <w:rPr>
+          <w:sz w:val="36"/>
+          <w:szCs w:val="36"/>
+        </w:rPr>
+      </w:pPr>
+      <w:r>
+        <w:rPr>
+          <w:sz w:val="36"/>
+          <w:szCs w:val="36"/>
+        </w:rPr>
+        <w:t xml:space="preserve">- Mapa mental do software </w:t>
+      </w:r>
+    </w:p>
+    <w:p>
+      <w:pPr>
+        <w:rPr>
+          <w:sz w:val="36"/>
+          <w:szCs w:val="36"/>
+        </w:rPr>
+      </w:pPr>
+    </w:p>
+    <w:p>
+      <w:pPr>
+        <w:rPr>
+          <w:sz w:val="36"/>
+          <w:szCs w:val="36"/>
+        </w:rPr>
+      </w:pPr>
+      <w:r>
+        <w:rPr>
+          <w:sz w:val="36"/>
+          <w:szCs w:val="36"/>
+        </w:rPr>
+        <w:t xml:space="preserve">*Semana 4 - 30/03 á 06/04* </w:t>
+      </w:r>
+    </w:p>
+    <w:p>
+      <w:pPr>
+        <w:rPr>
+          <w:sz w:val="36"/>
+          <w:szCs w:val="36"/>
+        </w:rPr>
+      </w:pPr>
+      <w:r>
+        <w:rPr>
+          <w:sz w:val="36"/>
+          <w:szCs w:val="36"/>
+        </w:rPr>
+        <w:t xml:space="preserve">- Criação de paradigma </w:t>
+      </w:r>
+    </w:p>
+    <w:p>
+      <w:pPr>
+        <w:rPr>
+          <w:sz w:val="36"/>
+          <w:szCs w:val="36"/>
+        </w:rPr>
+      </w:pPr>
+      <w:r>
+        <w:rPr>
+          <w:sz w:val="36"/>
+          <w:szCs w:val="36"/>
+        </w:rPr>
+        <w:t xml:space="preserve">- Diagrama de casos de uso </w:t>
+      </w:r>
+    </w:p>
+    <w:p>
+      <w:pPr>
+        <w:rPr>
+          <w:sz w:val="36"/>
+          <w:szCs w:val="36"/>
+        </w:rPr>
+      </w:pPr>
+    </w:p>
+    <w:p>
+      <w:pPr>
+        <w:rPr>
+          <w:sz w:val="36"/>
+          <w:szCs w:val="36"/>
+        </w:rPr>
+      </w:pPr>
+      <w:r>
+        <w:rPr>
+          <w:sz w:val="36"/>
+          <w:szCs w:val="36"/>
+        </w:rPr>
+        <w:t xml:space="preserve">*Semana 5 - 06/04 á 13/04* </w:t>
+      </w:r>
+    </w:p>
+    <w:p>
+      <w:pPr>
+        <w:rPr>
+          <w:sz w:val="36"/>
+          <w:szCs w:val="36"/>
+        </w:rPr>
+      </w:pPr>
+      <w:r>
+        <w:rPr>
+          <w:sz w:val="36"/>
+          <w:szCs w:val="36"/>
+        </w:rPr>
+        <w:t xml:space="preserve">- Diagrama de casos de uso </w:t>
+      </w:r>
+    </w:p>
+    <w:p>
+      <w:pPr>
+        <w:rPr>
+          <w:sz w:val="36"/>
+          <w:szCs w:val="36"/>
+        </w:rPr>
+      </w:pPr>
+      <w:r>
+        <w:rPr>
+          <w:sz w:val="36"/>
+          <w:szCs w:val="36"/>
+        </w:rPr>
+        <w:t>- Especificação dos casos de uso</w:t>
+      </w:r>
+    </w:p>
+    <w:p>
+      <w:pPr>
+        <w:rPr>
+          <w:sz w:val="36"/>
+          <w:szCs w:val="36"/>
+        </w:rPr>
+      </w:pPr>
+      <w:r>
+        <w:rPr>
+          <w:sz w:val="36"/>
+          <w:szCs w:val="36"/>
+        </w:rPr>
+        <w:t xml:space="preserve"> </w:t>
+      </w:r>
+    </w:p>
+    <w:p>
+      <w:pPr>
+        <w:rPr>
+          <w:sz w:val="36"/>
+          <w:szCs w:val="36"/>
+        </w:rPr>
+      </w:pPr>
+      <w:r>
+        <w:rPr>
+          <w:sz w:val="36"/>
+          <w:szCs w:val="36"/>
+        </w:rPr>
+        <w:t xml:space="preserve">*Semana 6 - 13/04 á 20/04* </w:t>
+      </w:r>
+    </w:p>
+    <w:p>
+      <w:pPr>
+        <w:rPr>
+          <w:sz w:val="36"/>
+          <w:szCs w:val="36"/>
+        </w:rPr>
+      </w:pPr>
+      <w:r>
+        <w:rPr>
+          <w:sz w:val="36"/>
+          <w:szCs w:val="36"/>
+        </w:rPr>
+        <w:t xml:space="preserve">- Especificação dos casos de uso - Modelagem do banco de dados </w:t>
+      </w:r>
+    </w:p>
+    <w:p>
+      <w:pPr>
+        <w:rPr>
+          <w:sz w:val="36"/>
+          <w:szCs w:val="36"/>
+        </w:rPr>
+      </w:pPr>
+    </w:p>
+    <w:p>
+      <w:pPr>
+        <w:rPr>
+          <w:sz w:val="36"/>
+          <w:szCs w:val="36"/>
+        </w:rPr>
+      </w:pPr>
+      <w:r>
+        <w:rPr>
+          <w:sz w:val="36"/>
+          <w:szCs w:val="36"/>
+        </w:rPr>
+        <w:t xml:space="preserve">*Semana </w:t>
+      </w:r>
+      <w:proofErr w:type="gramStart"/>
+      <w:r>
+        <w:rPr>
+          <w:sz w:val="36"/>
+          <w:szCs w:val="36"/>
+        </w:rPr>
+        <w:t>7</w:t>
+      </w:r>
+      <w:proofErr w:type="gramEnd"/>
+      <w:r>
+        <w:rPr>
+          <w:sz w:val="36"/>
+          <w:szCs w:val="36"/>
+        </w:rPr>
+        <w:t xml:space="preserve">... - 20/04 </w:t>
+      </w:r>
+      <w:proofErr w:type="gramStart"/>
+      <w:r>
+        <w:rPr>
+          <w:sz w:val="36"/>
+          <w:szCs w:val="36"/>
+        </w:rPr>
+        <w:t>á ...</w:t>
+      </w:r>
+      <w:proofErr w:type="gramEnd"/>
+      <w:r>
+        <w:rPr>
+          <w:sz w:val="36"/>
+          <w:szCs w:val="36"/>
+        </w:rPr>
+        <w:t xml:space="preserve">* </w:t>
+      </w:r>
+    </w:p>
+    <w:p>
+      <w:pPr>
+        <w:rPr>
+          <w:rFonts w:cstheme="minorHAnsi"/>
+          <w:b/>
+          <w:bCs/>
+          <w:sz w:val="36"/>
+          <w:szCs w:val="36"/>
+        </w:rPr>
+      </w:pPr>
+      <w:r>
+        <w:rPr>
+          <w:sz w:val="36"/>
+          <w:szCs w:val="36"/>
+        </w:rPr>
+        <w:lastRenderedPageBreak/>
+        <w:t>- Implementação do sistema (Programação, testes de segurança e uso com o usuário</w:t>
+      </w:r>
+      <w:proofErr w:type="gramStart"/>
+      <w:r>
+        <w:rPr>
+          <w:sz w:val="36"/>
+          <w:szCs w:val="36"/>
+        </w:rPr>
+        <w:t>)</w:t>
+      </w:r>
+      <w:proofErr w:type="gramEnd"/>
+    </w:p>
     <w:sectPr>
-      <w:headerReference w:type="default" r:id="rId9"/>
-      <w:footerReference w:type="default" r:id="rId10"/>
+      <w:headerReference w:type="default" r:id="rId11"/>
+      <w:footerReference w:type="default" r:id="rId12"/>
       <w:pgSz w:w="11906" w:h="16838"/>
       <w:pgMar w:top="1560" w:right="720" w:bottom="720" w:left="720" w:header="283" w:footer="0" w:gutter="0"/>
       <w:cols w:space="708"/>
@@ -2499,7 +5248,7 @@
         <w:noProof/>
         <w:color w:val="4472C4" w:themeColor="accent1"/>
       </w:rPr>
-      <w:t>2</w:t>
+      <w:t>3</w:t>
     </w:r>
     <w:r>
       <w:rPr>
@@ -2536,7 +5285,7 @@
         <w:noProof/>
         <w:color w:val="4472C4" w:themeColor="accent1"/>
       </w:rPr>
-      <w:t>4</w:t>
+      <w:t>10</w:t>
     </w:r>
     <w:r>
       <w:rPr>
@@ -2640,6 +5389,304 @@
 <file path=word/numbering.xml><?xml version="1.0" encoding="utf-8"?>
 <w:numbering xmlns:wpc="http://schemas.microsoft.com/office/word/2010/wordprocessingCanvas" xmlns:mc="http://schemas.openxmlformats.org/markup-compatibility/2006" xmlns:o="urn:schemas-microsoft-com:office:office" xmlns:r="http://schemas.openxmlformats.org/officeDocument/2006/relationships" xmlns:m="http://schemas.openxmlformats.org/officeDocument/2006/math" xmlns:v="urn:schemas-microsoft-com:vml" xmlns:wp14="http://schemas.microsoft.com/office/word/2010/wordprocessingDrawing" xmlns:wp="http://schemas.openxmlformats.org/drawingml/2006/wordprocessingDrawing" xmlns:w10="urn:schemas-microsoft-com:office:word" xmlns:w="http://schemas.openxmlformats.org/wordprocessingml/2006/main" xmlns:w14="http://schemas.microsoft.com/office/word/2010/wordml" xmlns:wpg="http://schemas.microsoft.com/office/word/2010/wordprocessingGroup" xmlns:wpi="http://schemas.microsoft.com/office/word/2010/wordprocessingInk" xmlns:wne="http://schemas.microsoft.com/office/word/2006/wordml" xmlns:wps="http://schemas.microsoft.com/office/word/2010/wordprocessingShape" mc:Ignorable="w14 wp14">
   <w:abstractNum w:abstractNumId="0">
+    <w:nsid w:val="03E75A20"/>
+    <w:multiLevelType w:val="multilevel"/>
+    <w:tmpl w:val="97843E0E"/>
+    <w:lvl w:ilvl="0">
+      <w:start w:val="1"/>
+      <w:numFmt w:val="bullet"/>
+      <w:lvlText w:val=""/>
+      <w:lvlJc w:val="left"/>
+      <w:pPr>
+        <w:tabs>
+          <w:tab w:val="num" w:pos="720"/>
+        </w:tabs>
+        <w:ind w:left="720" w:hanging="360"/>
+      </w:pPr>
+      <w:rPr>
+        <w:rFonts w:ascii="Symbol" w:hAnsi="Symbol" w:cs="Symbol" w:hint="default"/>
+        <w:sz w:val="20"/>
+      </w:rPr>
+    </w:lvl>
+    <w:lvl w:ilvl="1">
+      <w:start w:val="1"/>
+      <w:numFmt w:val="bullet"/>
+      <w:lvlText w:val="o"/>
+      <w:lvlJc w:val="left"/>
+      <w:pPr>
+        <w:tabs>
+          <w:tab w:val="num" w:pos="1440"/>
+        </w:tabs>
+        <w:ind w:left="1440" w:hanging="360"/>
+      </w:pPr>
+      <w:rPr>
+        <w:rFonts w:ascii="Courier New" w:hAnsi="Courier New" w:cs="Courier New" w:hint="default"/>
+        <w:sz w:val="20"/>
+      </w:rPr>
+    </w:lvl>
+    <w:lvl w:ilvl="2">
+      <w:start w:val="1"/>
+      <w:numFmt w:val="bullet"/>
+      <w:lvlText w:val=""/>
+      <w:lvlJc w:val="left"/>
+      <w:pPr>
+        <w:tabs>
+          <w:tab w:val="num" w:pos="2160"/>
+        </w:tabs>
+        <w:ind w:left="2160" w:hanging="360"/>
+      </w:pPr>
+      <w:rPr>
+        <w:rFonts w:ascii="Wingdings" w:hAnsi="Wingdings" w:cs="Wingdings" w:hint="default"/>
+        <w:sz w:val="20"/>
+      </w:rPr>
+    </w:lvl>
+    <w:lvl w:ilvl="3">
+      <w:start w:val="1"/>
+      <w:numFmt w:val="bullet"/>
+      <w:lvlText w:val=""/>
+      <w:lvlJc w:val="left"/>
+      <w:pPr>
+        <w:tabs>
+          <w:tab w:val="num" w:pos="2880"/>
+        </w:tabs>
+        <w:ind w:left="2880" w:hanging="360"/>
+      </w:pPr>
+      <w:rPr>
+        <w:rFonts w:ascii="Wingdings" w:hAnsi="Wingdings" w:cs="Wingdings" w:hint="default"/>
+        <w:sz w:val="20"/>
+      </w:rPr>
+    </w:lvl>
+    <w:lvl w:ilvl="4">
+      <w:start w:val="1"/>
+      <w:numFmt w:val="bullet"/>
+      <w:lvlText w:val=""/>
+      <w:lvlJc w:val="left"/>
+      <w:pPr>
+        <w:tabs>
+          <w:tab w:val="num" w:pos="3600"/>
+        </w:tabs>
+        <w:ind w:left="3600" w:hanging="360"/>
+      </w:pPr>
+      <w:rPr>
+        <w:rFonts w:ascii="Wingdings" w:hAnsi="Wingdings" w:cs="Wingdings" w:hint="default"/>
+        <w:sz w:val="20"/>
+      </w:rPr>
+    </w:lvl>
+    <w:lvl w:ilvl="5">
+      <w:start w:val="1"/>
+      <w:numFmt w:val="bullet"/>
+      <w:lvlText w:val=""/>
+      <w:lvlJc w:val="left"/>
+      <w:pPr>
+        <w:tabs>
+          <w:tab w:val="num" w:pos="4320"/>
+        </w:tabs>
+        <w:ind w:left="4320" w:hanging="360"/>
+      </w:pPr>
+      <w:rPr>
+        <w:rFonts w:ascii="Wingdings" w:hAnsi="Wingdings" w:cs="Wingdings" w:hint="default"/>
+        <w:sz w:val="20"/>
+      </w:rPr>
+    </w:lvl>
+    <w:lvl w:ilvl="6">
+      <w:start w:val="1"/>
+      <w:numFmt w:val="bullet"/>
+      <w:lvlText w:val=""/>
+      <w:lvlJc w:val="left"/>
+      <w:pPr>
+        <w:tabs>
+          <w:tab w:val="num" w:pos="5040"/>
+        </w:tabs>
+        <w:ind w:left="5040" w:hanging="360"/>
+      </w:pPr>
+      <w:rPr>
+        <w:rFonts w:ascii="Wingdings" w:hAnsi="Wingdings" w:cs="Wingdings" w:hint="default"/>
+        <w:sz w:val="20"/>
+      </w:rPr>
+    </w:lvl>
+    <w:lvl w:ilvl="7">
+      <w:start w:val="1"/>
+      <w:numFmt w:val="bullet"/>
+      <w:lvlText w:val=""/>
+      <w:lvlJc w:val="left"/>
+      <w:pPr>
+        <w:tabs>
+          <w:tab w:val="num" w:pos="5760"/>
+        </w:tabs>
+        <w:ind w:left="5760" w:hanging="360"/>
+      </w:pPr>
+      <w:rPr>
+        <w:rFonts w:ascii="Wingdings" w:hAnsi="Wingdings" w:cs="Wingdings" w:hint="default"/>
+        <w:sz w:val="20"/>
+      </w:rPr>
+    </w:lvl>
+    <w:lvl w:ilvl="8">
+      <w:start w:val="1"/>
+      <w:numFmt w:val="bullet"/>
+      <w:lvlText w:val=""/>
+      <w:lvlJc w:val="left"/>
+      <w:pPr>
+        <w:tabs>
+          <w:tab w:val="num" w:pos="6480"/>
+        </w:tabs>
+        <w:ind w:left="6480" w:hanging="360"/>
+      </w:pPr>
+      <w:rPr>
+        <w:rFonts w:ascii="Wingdings" w:hAnsi="Wingdings" w:cs="Wingdings" w:hint="default"/>
+        <w:sz w:val="20"/>
+      </w:rPr>
+    </w:lvl>
+  </w:abstractNum>
+  <w:abstractNum w:abstractNumId="1">
+    <w:nsid w:val="0CC16E09"/>
+    <w:multiLevelType w:val="multilevel"/>
+    <w:tmpl w:val="37F63952"/>
+    <w:lvl w:ilvl="0">
+      <w:start w:val="1"/>
+      <w:numFmt w:val="bullet"/>
+      <w:lvlText w:val=""/>
+      <w:lvlJc w:val="left"/>
+      <w:pPr>
+        <w:tabs>
+          <w:tab w:val="num" w:pos="720"/>
+        </w:tabs>
+        <w:ind w:left="720" w:hanging="360"/>
+      </w:pPr>
+      <w:rPr>
+        <w:rFonts w:ascii="Symbol" w:hAnsi="Symbol" w:cs="Symbol" w:hint="default"/>
+        <w:sz w:val="20"/>
+      </w:rPr>
+    </w:lvl>
+    <w:lvl w:ilvl="1">
+      <w:start w:val="1"/>
+      <w:numFmt w:val="bullet"/>
+      <w:lvlText w:val="o"/>
+      <w:lvlJc w:val="left"/>
+      <w:pPr>
+        <w:tabs>
+          <w:tab w:val="num" w:pos="1440"/>
+        </w:tabs>
+        <w:ind w:left="1440" w:hanging="360"/>
+      </w:pPr>
+      <w:rPr>
+        <w:rFonts w:ascii="Courier New" w:hAnsi="Courier New" w:cs="Courier New" w:hint="default"/>
+        <w:sz w:val="20"/>
+      </w:rPr>
+    </w:lvl>
+    <w:lvl w:ilvl="2">
+      <w:start w:val="1"/>
+      <w:numFmt w:val="bullet"/>
+      <w:lvlText w:val=""/>
+      <w:lvlJc w:val="left"/>
+      <w:pPr>
+        <w:tabs>
+          <w:tab w:val="num" w:pos="2160"/>
+        </w:tabs>
+        <w:ind w:left="2160" w:hanging="360"/>
+      </w:pPr>
+      <w:rPr>
+        <w:rFonts w:ascii="Wingdings" w:hAnsi="Wingdings" w:cs="Wingdings" w:hint="default"/>
+        <w:sz w:val="20"/>
+      </w:rPr>
+    </w:lvl>
+    <w:lvl w:ilvl="3">
+      <w:start w:val="1"/>
+      <w:numFmt w:val="bullet"/>
+      <w:lvlText w:val=""/>
+      <w:lvlJc w:val="left"/>
+      <w:pPr>
+        <w:tabs>
+          <w:tab w:val="num" w:pos="2880"/>
+        </w:tabs>
+        <w:ind w:left="2880" w:hanging="360"/>
+      </w:pPr>
+      <w:rPr>
+        <w:rFonts w:ascii="Wingdings" w:hAnsi="Wingdings" w:cs="Wingdings" w:hint="default"/>
+        <w:sz w:val="20"/>
+      </w:rPr>
+    </w:lvl>
+    <w:lvl w:ilvl="4">
+      <w:start w:val="1"/>
+      <w:numFmt w:val="bullet"/>
+      <w:lvlText w:val=""/>
+      <w:lvlJc w:val="left"/>
+      <w:pPr>
+        <w:tabs>
+          <w:tab w:val="num" w:pos="3600"/>
+        </w:tabs>
+        <w:ind w:left="3600" w:hanging="360"/>
+      </w:pPr>
+      <w:rPr>
+        <w:rFonts w:ascii="Wingdings" w:hAnsi="Wingdings" w:cs="Wingdings" w:hint="default"/>
+        <w:sz w:val="20"/>
+      </w:rPr>
+    </w:lvl>
+    <w:lvl w:ilvl="5">
+      <w:start w:val="1"/>
+      <w:numFmt w:val="bullet"/>
+      <w:lvlText w:val=""/>
+      <w:lvlJc w:val="left"/>
+      <w:pPr>
+        <w:tabs>
+          <w:tab w:val="num" w:pos="4320"/>
+        </w:tabs>
+        <w:ind w:left="4320" w:hanging="360"/>
+      </w:pPr>
+      <w:rPr>
+        <w:rFonts w:ascii="Wingdings" w:hAnsi="Wingdings" w:cs="Wingdings" w:hint="default"/>
+        <w:sz w:val="20"/>
+      </w:rPr>
+    </w:lvl>
+    <w:lvl w:ilvl="6">
+      <w:start w:val="1"/>
+      <w:numFmt w:val="bullet"/>
+      <w:lvlText w:val=""/>
+      <w:lvlJc w:val="left"/>
+      <w:pPr>
+        <w:tabs>
+          <w:tab w:val="num" w:pos="5040"/>
+        </w:tabs>
+        <w:ind w:left="5040" w:hanging="360"/>
+      </w:pPr>
+      <w:rPr>
+        <w:rFonts w:ascii="Wingdings" w:hAnsi="Wingdings" w:cs="Wingdings" w:hint="default"/>
+        <w:sz w:val="20"/>
+      </w:rPr>
+    </w:lvl>
+    <w:lvl w:ilvl="7">
+      <w:start w:val="1"/>
+      <w:numFmt w:val="bullet"/>
+      <w:lvlText w:val=""/>
+      <w:lvlJc w:val="left"/>
+      <w:pPr>
+        <w:tabs>
+          <w:tab w:val="num" w:pos="5760"/>
+        </w:tabs>
+        <w:ind w:left="5760" w:hanging="360"/>
+      </w:pPr>
+      <w:rPr>
+        <w:rFonts w:ascii="Wingdings" w:hAnsi="Wingdings" w:cs="Wingdings" w:hint="default"/>
+        <w:sz w:val="20"/>
+      </w:rPr>
+    </w:lvl>
+    <w:lvl w:ilvl="8">
+      <w:start w:val="1"/>
+      <w:numFmt w:val="bullet"/>
+      <w:lvlText w:val=""/>
+      <w:lvlJc w:val="left"/>
+      <w:pPr>
+        <w:tabs>
+          <w:tab w:val="num" w:pos="6480"/>
+        </w:tabs>
+        <w:ind w:left="6480" w:hanging="360"/>
+      </w:pPr>
+      <w:rPr>
+        <w:rFonts w:ascii="Wingdings" w:hAnsi="Wingdings" w:cs="Wingdings" w:hint="default"/>
+        <w:sz w:val="20"/>
+      </w:rPr>
+    </w:lvl>
+  </w:abstractNum>
+  <w:abstractNum w:abstractNumId="2">
     <w:nsid w:val="1608709F"/>
     <w:multiLevelType w:val="multilevel"/>
     <w:tmpl w:val="8D6C07E0"/>
@@ -2756,7 +5803,147 @@
       </w:pPr>
     </w:lvl>
   </w:abstractNum>
-  <w:abstractNum w:abstractNumId="1">
+  <w:abstractNum w:abstractNumId="3">
+    <w:nsid w:val="1A1D0AC6"/>
+    <w:multiLevelType w:val="multilevel"/>
+    <w:tmpl w:val="72685B90"/>
+    <w:lvl w:ilvl="0">
+      <w:start w:val="5"/>
+      <w:numFmt w:val="decimal"/>
+      <w:lvlText w:val="%1."/>
+      <w:lvlJc w:val="left"/>
+      <w:pPr>
+        <w:tabs>
+          <w:tab w:val="num" w:pos="720"/>
+        </w:tabs>
+        <w:ind w:left="720" w:hanging="360"/>
+      </w:pPr>
+      <w:rPr>
+        <w:rFonts w:hint="default"/>
+      </w:rPr>
+    </w:lvl>
+    <w:lvl w:ilvl="1">
+      <w:start w:val="1"/>
+      <w:numFmt w:val="decimal"/>
+      <w:lvlText w:val="%2."/>
+      <w:lvlJc w:val="left"/>
+      <w:pPr>
+        <w:tabs>
+          <w:tab w:val="num" w:pos="1440"/>
+        </w:tabs>
+        <w:ind w:left="1440" w:hanging="360"/>
+      </w:pPr>
+      <w:rPr>
+        <w:rFonts w:hint="default"/>
+      </w:rPr>
+    </w:lvl>
+    <w:lvl w:ilvl="2">
+      <w:start w:val="1"/>
+      <w:numFmt w:val="decimal"/>
+      <w:lvlText w:val="%3."/>
+      <w:lvlJc w:val="left"/>
+      <w:pPr>
+        <w:tabs>
+          <w:tab w:val="num" w:pos="2160"/>
+        </w:tabs>
+        <w:ind w:left="2160" w:hanging="360"/>
+      </w:pPr>
+      <w:rPr>
+        <w:rFonts w:hint="default"/>
+      </w:rPr>
+    </w:lvl>
+    <w:lvl w:ilvl="3">
+      <w:start w:val="1"/>
+      <w:numFmt w:val="decimal"/>
+      <w:lvlText w:val="%4."/>
+      <w:lvlJc w:val="left"/>
+      <w:pPr>
+        <w:tabs>
+          <w:tab w:val="num" w:pos="2880"/>
+        </w:tabs>
+        <w:ind w:left="2880" w:hanging="360"/>
+      </w:pPr>
+      <w:rPr>
+        <w:rFonts w:hint="default"/>
+      </w:rPr>
+    </w:lvl>
+    <w:lvl w:ilvl="4">
+      <w:start w:val="1"/>
+      <w:numFmt w:val="decimal"/>
+      <w:lvlText w:val="%5."/>
+      <w:lvlJc w:val="left"/>
+      <w:pPr>
+        <w:tabs>
+          <w:tab w:val="num" w:pos="3600"/>
+        </w:tabs>
+        <w:ind w:left="3600" w:hanging="360"/>
+      </w:pPr>
+      <w:rPr>
+        <w:rFonts w:hint="default"/>
+      </w:rPr>
+    </w:lvl>
+    <w:lvl w:ilvl="5">
+      <w:start w:val="1"/>
+      <w:numFmt w:val="decimal"/>
+      <w:lvlText w:val="%6."/>
+      <w:lvlJc w:val="left"/>
+      <w:pPr>
+        <w:tabs>
+          <w:tab w:val="num" w:pos="4320"/>
+        </w:tabs>
+        <w:ind w:left="4320" w:hanging="360"/>
+      </w:pPr>
+      <w:rPr>
+        <w:rFonts w:hint="default"/>
+      </w:rPr>
+    </w:lvl>
+    <w:lvl w:ilvl="6">
+      <w:start w:val="1"/>
+      <w:numFmt w:val="decimal"/>
+      <w:lvlText w:val="%7."/>
+      <w:lvlJc w:val="left"/>
+      <w:pPr>
+        <w:tabs>
+          <w:tab w:val="num" w:pos="5040"/>
+        </w:tabs>
+        <w:ind w:left="5040" w:hanging="360"/>
+      </w:pPr>
+      <w:rPr>
+        <w:rFonts w:hint="default"/>
+      </w:rPr>
+    </w:lvl>
+    <w:lvl w:ilvl="7">
+      <w:start w:val="1"/>
+      <w:numFmt w:val="decimal"/>
+      <w:lvlText w:val="%8."/>
+      <w:lvlJc w:val="left"/>
+      <w:pPr>
+        <w:tabs>
+          <w:tab w:val="num" w:pos="5760"/>
+        </w:tabs>
+        <w:ind w:left="5760" w:hanging="360"/>
+      </w:pPr>
+      <w:rPr>
+        <w:rFonts w:hint="default"/>
+      </w:rPr>
+    </w:lvl>
+    <w:lvl w:ilvl="8">
+      <w:start w:val="1"/>
+      <w:numFmt w:val="decimal"/>
+      <w:lvlText w:val="%9."/>
+      <w:lvlJc w:val="left"/>
+      <w:pPr>
+        <w:tabs>
+          <w:tab w:val="num" w:pos="6480"/>
+        </w:tabs>
+        <w:ind w:left="6480" w:hanging="360"/>
+      </w:pPr>
+      <w:rPr>
+        <w:rFonts w:hint="default"/>
+      </w:rPr>
+    </w:lvl>
+  </w:abstractNum>
+  <w:abstractNum w:abstractNumId="4">
     <w:nsid w:val="34A60AA7"/>
     <w:multiLevelType w:val="multilevel"/>
     <w:tmpl w:val="9386E452"/>
@@ -2905,7 +6092,124 @@
       </w:rPr>
     </w:lvl>
   </w:abstractNum>
-  <w:abstractNum w:abstractNumId="2">
+  <w:abstractNum w:abstractNumId="5">
+    <w:nsid w:val="39EC620A"/>
+    <w:multiLevelType w:val="multilevel"/>
+    <w:tmpl w:val="BB30AD72"/>
+    <w:lvl w:ilvl="0">
+      <w:start w:val="1"/>
+      <w:numFmt w:val="decimal"/>
+      <w:lvlText w:val="%1."/>
+      <w:lvlJc w:val="left"/>
+      <w:pPr>
+        <w:tabs>
+          <w:tab w:val="num" w:pos="720"/>
+        </w:tabs>
+        <w:ind w:left="720" w:hanging="360"/>
+      </w:pPr>
+    </w:lvl>
+    <w:lvl w:ilvl="1">
+      <w:start w:val="1"/>
+      <w:numFmt w:val="bullet"/>
+      <w:lvlText w:val="o"/>
+      <w:lvlJc w:val="left"/>
+      <w:pPr>
+        <w:tabs>
+          <w:tab w:val="num" w:pos="1440"/>
+        </w:tabs>
+        <w:ind w:left="1440" w:hanging="360"/>
+      </w:pPr>
+      <w:rPr>
+        <w:rFonts w:ascii="Courier New" w:hAnsi="Courier New" w:cs="Courier New" w:hint="default"/>
+        <w:sz w:val="20"/>
+      </w:rPr>
+    </w:lvl>
+    <w:lvl w:ilvl="2">
+      <w:start w:val="1"/>
+      <w:numFmt w:val="decimal"/>
+      <w:lvlText w:val="%3."/>
+      <w:lvlJc w:val="left"/>
+      <w:pPr>
+        <w:tabs>
+          <w:tab w:val="num" w:pos="2160"/>
+        </w:tabs>
+        <w:ind w:left="2160" w:hanging="360"/>
+      </w:pPr>
+    </w:lvl>
+    <w:lvl w:ilvl="3">
+      <w:start w:val="1"/>
+      <w:numFmt w:val="decimal"/>
+      <w:lvlText w:val="%4."/>
+      <w:lvlJc w:val="left"/>
+      <w:pPr>
+        <w:tabs>
+          <w:tab w:val="num" w:pos="2880"/>
+        </w:tabs>
+        <w:ind w:left="2880" w:hanging="360"/>
+      </w:pPr>
+    </w:lvl>
+    <w:lvl w:ilvl="4">
+      <w:start w:val="1"/>
+      <w:numFmt w:val="decimal"/>
+      <w:lvlText w:val="%5."/>
+      <w:lvlJc w:val="left"/>
+      <w:pPr>
+        <w:tabs>
+          <w:tab w:val="num" w:pos="3600"/>
+        </w:tabs>
+        <w:ind w:left="3600" w:hanging="360"/>
+      </w:pPr>
+    </w:lvl>
+    <w:lvl w:ilvl="5">
+      <w:start w:val="1"/>
+      <w:numFmt w:val="decimal"/>
+      <w:lvlText w:val="%6."/>
+      <w:lvlJc w:val="left"/>
+      <w:pPr>
+        <w:tabs>
+          <w:tab w:val="num" w:pos="4320"/>
+        </w:tabs>
+        <w:ind w:left="4320" w:hanging="360"/>
+      </w:pPr>
+    </w:lvl>
+    <w:lvl w:ilvl="6">
+      <w:start w:val="1"/>
+      <w:numFmt w:val="decimal"/>
+      <w:lvlText w:val="%7."/>
+      <w:lvlJc w:val="left"/>
+      <w:pPr>
+        <w:tabs>
+          <w:tab w:val="num" w:pos="5040"/>
+        </w:tabs>
+        <w:ind w:left="5040" w:hanging="360"/>
+      </w:pPr>
+    </w:lvl>
+    <w:lvl w:ilvl="7">
+      <w:start w:val="1"/>
+      <w:numFmt w:val="decimal"/>
+      <w:lvlText w:val="%8."/>
+      <w:lvlJc w:val="left"/>
+      <w:pPr>
+        <w:tabs>
+          <w:tab w:val="num" w:pos="5760"/>
+        </w:tabs>
+        <w:ind w:left="5760" w:hanging="360"/>
+      </w:pPr>
+    </w:lvl>
+    <w:lvl w:ilvl="8">
+      <w:start w:val="1"/>
+      <w:numFmt w:val="decimal"/>
+      <w:lvlText w:val="%9."/>
+      <w:lvlJc w:val="left"/>
+      <w:pPr>
+        <w:tabs>
+          <w:tab w:val="num" w:pos="6480"/>
+        </w:tabs>
+        <w:ind w:left="6480" w:hanging="360"/>
+      </w:pPr>
+    </w:lvl>
+  </w:abstractNum>
+  <w:abstractNum w:abstractNumId="6">
     <w:nsid w:val="42DF15C9"/>
     <w:multiLevelType w:val="multilevel"/>
     <w:tmpl w:val="C572636C"/>
@@ -3054,7 +6358,7 @@
       </w:rPr>
     </w:lvl>
   </w:abstractNum>
-  <w:abstractNum w:abstractNumId="3">
+  <w:abstractNum w:abstractNumId="7">
     <w:nsid w:val="4A1970A5"/>
     <w:multiLevelType w:val="multilevel"/>
     <w:tmpl w:val="7DBAB4AE"/>
@@ -3171,7 +6475,7 @@
       </w:pPr>
     </w:lvl>
   </w:abstractNum>
-  <w:abstractNum w:abstractNumId="4">
+  <w:abstractNum w:abstractNumId="8">
     <w:nsid w:val="4A530E11"/>
     <w:multiLevelType w:val="multilevel"/>
     <w:tmpl w:val="8A08C1C2"/>
@@ -3320,7 +6624,7 @@
       </w:rPr>
     </w:lvl>
   </w:abstractNum>
-  <w:abstractNum w:abstractNumId="5">
+  <w:abstractNum w:abstractNumId="9">
     <w:nsid w:val="4ACA67C9"/>
     <w:multiLevelType w:val="multilevel"/>
     <w:tmpl w:val="8A461EA2"/>
@@ -3469,7 +6773,7 @@
       </w:rPr>
     </w:lvl>
   </w:abstractNum>
-  <w:abstractNum w:abstractNumId="6">
+  <w:abstractNum w:abstractNumId="10">
     <w:nsid w:val="5B1C02C2"/>
     <w:multiLevelType w:val="multilevel"/>
     <w:tmpl w:val="EA16FBD6"/>
@@ -3582,7 +6886,7 @@
       </w:pPr>
     </w:lvl>
   </w:abstractNum>
-  <w:abstractNum w:abstractNumId="7">
+  <w:abstractNum w:abstractNumId="11">
     <w:nsid w:val="650A6B51"/>
     <w:multiLevelType w:val="multilevel"/>
     <w:tmpl w:val="9CBAF5B4"/>
@@ -3695,7 +6999,7 @@
       </w:pPr>
     </w:lvl>
   </w:abstractNum>
-  <w:abstractNum w:abstractNumId="8">
+  <w:abstractNum w:abstractNumId="12">
     <w:nsid w:val="70FC3677"/>
     <w:multiLevelType w:val="multilevel"/>
     <w:tmpl w:val="7488FEB4"/>
@@ -3845,31 +7149,43 @@
     </w:lvl>
   </w:abstractNum>
   <w:num w:numId="1">
+    <w:abstractNumId w:val="11"/>
+  </w:num>
+  <w:num w:numId="2">
+    <w:abstractNumId w:val="6"/>
+  </w:num>
+  <w:num w:numId="3">
     <w:abstractNumId w:val="7"/>
   </w:num>
-  <w:num w:numId="2">
+  <w:num w:numId="4">
     <w:abstractNumId w:val="2"/>
   </w:num>
-  <w:num w:numId="3">
-    <w:abstractNumId w:val="3"/>
+  <w:num w:numId="5">
+    <w:abstractNumId w:val="4"/>
   </w:num>
-  <w:num w:numId="4">
+  <w:num w:numId="6">
+    <w:abstractNumId w:val="9"/>
+  </w:num>
+  <w:num w:numId="7">
+    <w:abstractNumId w:val="8"/>
+  </w:num>
+  <w:num w:numId="8">
+    <w:abstractNumId w:val="12"/>
+  </w:num>
+  <w:num w:numId="9">
+    <w:abstractNumId w:val="10"/>
+  </w:num>
+  <w:num w:numId="10">
     <w:abstractNumId w:val="0"/>
   </w:num>
-  <w:num w:numId="5">
+  <w:num w:numId="11">
     <w:abstractNumId w:val="1"/>
   </w:num>
-  <w:num w:numId="6">
+  <w:num w:numId="12">
     <w:abstractNumId w:val="5"/>
   </w:num>
-  <w:num w:numId="7">
-    <w:abstractNumId w:val="4"/>
-  </w:num>
-  <w:num w:numId="8">
-    <w:abstractNumId w:val="8"/>
-  </w:num>
-  <w:num w:numId="9">
-    <w:abstractNumId w:val="6"/>
+  <w:num w:numId="13">
+    <w:abstractNumId w:val="3"/>
   </w:num>
   <w:numIdMacAtCleanup w:val="5"/>
 </w:numbering>
@@ -3912,7 +7228,7 @@
     <w:lsdException w:name="toc 7" w:uiPriority="39"/>
     <w:lsdException w:name="toc 8" w:uiPriority="39"/>
     <w:lsdException w:name="toc 9" w:uiPriority="39"/>
-    <w:lsdException w:name="caption" w:uiPriority="35" w:qFormat="1"/>
+    <w:lsdException w:name="caption" w:uiPriority="0" w:qFormat="1"/>
     <w:lsdException w:name="Title" w:semiHidden="0" w:uiPriority="10" w:unhideWhenUsed="0" w:qFormat="1"/>
     <w:lsdException w:name="Default Paragraph Font" w:uiPriority="1"/>
     <w:lsdException w:name="Subtitle" w:semiHidden="0" w:uiPriority="11" w:unhideWhenUsed="0" w:qFormat="1"/>
@@ -4346,6 +7662,26 @@
     <w:basedOn w:val="Fontepargpadro"/>
     <w:rsid w:val="0028702F"/>
   </w:style>
+  <w:style w:type="paragraph" w:styleId="Legenda">
+    <w:name w:val="caption"/>
+    <w:basedOn w:val="Normal"/>
+    <w:qFormat/>
+    <w:rsid w:val="000404B1"/>
+    <w:pPr>
+      <w:suppressLineNumbers/>
+      <w:suppressAutoHyphens/>
+      <w:spacing w:before="120" w:after="120"/>
+    </w:pPr>
+    <w:rPr>
+      <w:rFonts w:cs="Arial"/>
+      <w:i/>
+      <w:iCs/>
+      <w:kern w:val="2"/>
+      <w:sz w:val="24"/>
+      <w:szCs w:val="24"/>
+      <w14:ligatures w14:val="standardContextual"/>
+    </w:rPr>
+  </w:style>
 </w:styles>
 </file>
 
@@ -4386,7 +7722,7 @@
     <w:lsdException w:name="toc 7" w:uiPriority="39"/>
     <w:lsdException w:name="toc 8" w:uiPriority="39"/>
     <w:lsdException w:name="toc 9" w:uiPriority="39"/>
-    <w:lsdException w:name="caption" w:uiPriority="35" w:qFormat="1"/>
+    <w:lsdException w:name="caption" w:uiPriority="0" w:qFormat="1"/>
     <w:lsdException w:name="Title" w:semiHidden="0" w:uiPriority="10" w:unhideWhenUsed="0" w:qFormat="1"/>
     <w:lsdException w:name="Default Paragraph Font" w:uiPriority="1"/>
     <w:lsdException w:name="Subtitle" w:semiHidden="0" w:uiPriority="11" w:unhideWhenUsed="0" w:qFormat="1"/>
@@ -4820,6 +8156,26 @@
     <w:basedOn w:val="Fontepargpadro"/>
     <w:rsid w:val="0028702F"/>
   </w:style>
+  <w:style w:type="paragraph" w:styleId="Legenda">
+    <w:name w:val="caption"/>
+    <w:basedOn w:val="Normal"/>
+    <w:qFormat/>
+    <w:rsid w:val="000404B1"/>
+    <w:pPr>
+      <w:suppressLineNumbers/>
+      <w:suppressAutoHyphens/>
+      <w:spacing w:before="120" w:after="120"/>
+    </w:pPr>
+    <w:rPr>
+      <w:rFonts w:cs="Arial"/>
+      <w:i/>
+      <w:iCs/>
+      <w:kern w:val="2"/>
+      <w:sz w:val="24"/>
+      <w:szCs w:val="24"/>
+      <w14:ligatures w14:val="standardContextual"/>
+    </w:rPr>
+  </w:style>
 </w:styles>
 </file>
 
@@ -5112,7 +8468,7 @@
   <a:extraClrSchemeLst/>
   <a:extLst>
     <a:ext uri="{05A4C25C-085E-4340-85A3-A5531E510DB2}">
-      <thm15:themeFamily xmlns:thm15="http://schemas.microsoft.com/office/thememl/2012/main" xmlns="" name="Office Theme" id="{62F939B6-93AF-4DB8-9C6B-D6C7DFDC589F}" vid="{4A3C46E8-61CC-4603-A589-7422A47A8E4A}"/>
+      <thm15:themeFamily xmlns="" xmlns:thm15="http://schemas.microsoft.com/office/thememl/2012/main" name="Office Theme" id="{62F939B6-93AF-4DB8-9C6B-D6C7DFDC589F}" vid="{4A3C46E8-61CC-4603-A589-7422A47A8E4A}"/>
     </a:ext>
   </a:extLst>
 </a:theme>
@@ -5123,7 +8479,7 @@
 </file>
 
 <file path=customXml/itemProps1.xml><?xml version="1.0" encoding="utf-8"?>
-<ds:datastoreItem xmlns:ds="http://schemas.openxmlformats.org/officeDocument/2006/customXml" ds:itemID="{27DF79F4-8D82-4C58-AB8E-3022EE37137D}">
+<ds:datastoreItem xmlns:ds="http://schemas.openxmlformats.org/officeDocument/2006/customXml" ds:itemID="{7B1D7620-27FE-455A-BF0E-009DADECEFD5}">
   <ds:schemaRefs>
     <ds:schemaRef ds:uri="http://schemas.openxmlformats.org/officeDocument/2006/bibliography"/>
   </ds:schemaRefs>

</xml_diff>

<commit_message>
Correção do levantamento de requisitos
Correção do levantamento de requisitos (Corrigido o calendário)
</commit_message>
<xml_diff>
--- a/Projeto de Engenharia de Software (Documentação).docx
+++ b/Projeto de Engenharia de Software (Documentação).docx
@@ -1901,8 +1901,6 @@
         </w:rPr>
         <w:t xml:space="preserve"> (Cliente)</w:t>
       </w:r>
-      <w:bookmarkStart w:id="0" w:name="_GoBack"/>
-      <w:bookmarkEnd w:id="0"/>
       <w:r>
         <w:rPr>
           <w:rFonts w:eastAsia="Times New Roman" w:cstheme="minorHAnsi"/>
@@ -1978,430 +1976,6 @@
           <w:sz w:val="36"/>
           <w:szCs w:val="36"/>
         </w:rPr>
-        <w:t xml:space="preserve">*Calendário de trabalho* </w:t>
-      </w:r>
-      <w:r>
-        <w:rPr>
-          <w:sz w:val="36"/>
-          <w:szCs w:val="36"/>
-        </w:rPr>
-        <w:br/>
-      </w:r>
-      <w:r>
-        <w:rPr>
-          <w:sz w:val="36"/>
-          <w:szCs w:val="36"/>
-        </w:rPr>
-        <w:t xml:space="preserve">*Semana 1 - 09/03 á 16/03* </w:t>
-      </w:r>
-    </w:p>
-    <w:p>
-      <w:pPr>
-        <w:rPr>
-          <w:sz w:val="36"/>
-          <w:szCs w:val="36"/>
-        </w:rPr>
-      </w:pPr>
-      <w:r>
-        <w:rPr>
-          <w:sz w:val="36"/>
-          <w:szCs w:val="36"/>
-        </w:rPr>
-        <w:t xml:space="preserve">- Captação de cliente </w:t>
-      </w:r>
-    </w:p>
-    <w:p>
-      <w:pPr>
-        <w:rPr>
-          <w:sz w:val="36"/>
-          <w:szCs w:val="36"/>
-        </w:rPr>
-      </w:pPr>
-      <w:r>
-        <w:rPr>
-          <w:sz w:val="36"/>
-          <w:szCs w:val="36"/>
-        </w:rPr>
-        <w:t xml:space="preserve">- Identificação de tecnologia necessária para o sistema </w:t>
-      </w:r>
-    </w:p>
-    <w:p>
-      <w:pPr>
-        <w:rPr>
-          <w:sz w:val="36"/>
-          <w:szCs w:val="36"/>
-        </w:rPr>
-      </w:pPr>
-      <w:r>
-        <w:rPr>
-          <w:sz w:val="36"/>
-          <w:szCs w:val="36"/>
-        </w:rPr>
-        <w:t xml:space="preserve">- </w:t>
-      </w:r>
-      <w:r>
-        <w:rPr>
-          <w:sz w:val="36"/>
-          <w:szCs w:val="36"/>
-        </w:rPr>
-        <w:t xml:space="preserve">Definição de </w:t>
-      </w:r>
-      <w:r>
-        <w:rPr>
-          <w:sz w:val="36"/>
-          <w:szCs w:val="36"/>
-        </w:rPr>
-        <w:t xml:space="preserve">Tipo de sistema </w:t>
-      </w:r>
-    </w:p>
-    <w:p>
-      <w:pPr>
-        <w:rPr>
-          <w:sz w:val="36"/>
-          <w:szCs w:val="36"/>
-        </w:rPr>
-      </w:pPr>
-      <w:r>
-        <w:rPr>
-          <w:sz w:val="36"/>
-          <w:szCs w:val="36"/>
-        </w:rPr>
-        <w:t>- Definição de equipe/integrantes</w:t>
-      </w:r>
-    </w:p>
-    <w:p>
-      <w:pPr>
-        <w:rPr>
-          <w:sz w:val="36"/>
-          <w:szCs w:val="36"/>
-        </w:rPr>
-      </w:pPr>
-    </w:p>
-    <w:p>
-      <w:pPr>
-        <w:rPr>
-          <w:sz w:val="36"/>
-          <w:szCs w:val="36"/>
-        </w:rPr>
-      </w:pPr>
-      <w:r>
-        <w:rPr>
-          <w:sz w:val="36"/>
-          <w:szCs w:val="36"/>
-        </w:rPr>
-        <w:t xml:space="preserve">*Semana 2 - 16/03 á 23/03* </w:t>
-      </w:r>
-    </w:p>
-    <w:p>
-      <w:pPr>
-        <w:rPr>
-          <w:sz w:val="36"/>
-          <w:szCs w:val="36"/>
-        </w:rPr>
-      </w:pPr>
-      <w:r>
-        <w:rPr>
-          <w:sz w:val="36"/>
-          <w:szCs w:val="36"/>
-        </w:rPr>
-        <w:t xml:space="preserve">- Levantamento de Requisitos do sistema </w:t>
-      </w:r>
-    </w:p>
-    <w:p>
-      <w:pPr>
-        <w:rPr>
-          <w:sz w:val="36"/>
-          <w:szCs w:val="36"/>
-        </w:rPr>
-      </w:pPr>
-      <w:r>
-        <w:rPr>
-          <w:sz w:val="36"/>
-          <w:szCs w:val="36"/>
-        </w:rPr>
-        <w:t xml:space="preserve">- Entrevista com o cliente para avaliar necessidade </w:t>
-      </w:r>
-    </w:p>
-    <w:p>
-      <w:pPr>
-        <w:rPr>
-          <w:sz w:val="36"/>
-          <w:szCs w:val="36"/>
-        </w:rPr>
-      </w:pPr>
-    </w:p>
-    <w:p>
-      <w:pPr>
-        <w:rPr>
-          <w:sz w:val="36"/>
-          <w:szCs w:val="36"/>
-        </w:rPr>
-      </w:pPr>
-      <w:r>
-        <w:rPr>
-          <w:sz w:val="36"/>
-          <w:szCs w:val="36"/>
-        </w:rPr>
-        <w:t xml:space="preserve">*Semana 3 - 23/03 á 30/03* </w:t>
-      </w:r>
-    </w:p>
-    <w:p>
-      <w:pPr>
-        <w:rPr>
-          <w:sz w:val="36"/>
-          <w:szCs w:val="36"/>
-        </w:rPr>
-      </w:pPr>
-      <w:r>
-        <w:rPr>
-          <w:sz w:val="36"/>
-          <w:szCs w:val="36"/>
-        </w:rPr>
-        <w:t xml:space="preserve">- Mapa mental do software </w:t>
-      </w:r>
-    </w:p>
-    <w:p>
-      <w:pPr>
-        <w:rPr>
-          <w:sz w:val="36"/>
-          <w:szCs w:val="36"/>
-        </w:rPr>
-      </w:pPr>
-    </w:p>
-    <w:p>
-      <w:pPr>
-        <w:rPr>
-          <w:sz w:val="36"/>
-          <w:szCs w:val="36"/>
-        </w:rPr>
-      </w:pPr>
-      <w:r>
-        <w:rPr>
-          <w:sz w:val="36"/>
-          <w:szCs w:val="36"/>
-        </w:rPr>
-        <w:t xml:space="preserve">*Semana 4 - 30/03 á 06/04* </w:t>
-      </w:r>
-    </w:p>
-    <w:p>
-      <w:pPr>
-        <w:rPr>
-          <w:sz w:val="36"/>
-          <w:szCs w:val="36"/>
-        </w:rPr>
-      </w:pPr>
-      <w:r>
-        <w:rPr>
-          <w:sz w:val="36"/>
-          <w:szCs w:val="36"/>
-        </w:rPr>
-        <w:t xml:space="preserve">- Criação de paradigma </w:t>
-      </w:r>
-    </w:p>
-    <w:p>
-      <w:pPr>
-        <w:rPr>
-          <w:sz w:val="36"/>
-          <w:szCs w:val="36"/>
-        </w:rPr>
-      </w:pPr>
-      <w:r>
-        <w:rPr>
-          <w:sz w:val="36"/>
-          <w:szCs w:val="36"/>
-        </w:rPr>
-        <w:t xml:space="preserve">- Diagrama de casos de uso </w:t>
-      </w:r>
-    </w:p>
-    <w:p>
-      <w:pPr>
-        <w:rPr>
-          <w:sz w:val="36"/>
-          <w:szCs w:val="36"/>
-        </w:rPr>
-      </w:pPr>
-    </w:p>
-    <w:p>
-      <w:pPr>
-        <w:rPr>
-          <w:sz w:val="36"/>
-          <w:szCs w:val="36"/>
-        </w:rPr>
-      </w:pPr>
-      <w:r>
-        <w:rPr>
-          <w:sz w:val="36"/>
-          <w:szCs w:val="36"/>
-        </w:rPr>
-        <w:t xml:space="preserve">*Semana 5 - 06/04 á 13/04* </w:t>
-      </w:r>
-    </w:p>
-    <w:p>
-      <w:pPr>
-        <w:rPr>
-          <w:sz w:val="36"/>
-          <w:szCs w:val="36"/>
-        </w:rPr>
-      </w:pPr>
-      <w:r>
-        <w:rPr>
-          <w:sz w:val="36"/>
-          <w:szCs w:val="36"/>
-        </w:rPr>
-        <w:t xml:space="preserve">- Diagrama de casos de uso </w:t>
-      </w:r>
-    </w:p>
-    <w:p>
-      <w:pPr>
-        <w:rPr>
-          <w:sz w:val="36"/>
-          <w:szCs w:val="36"/>
-        </w:rPr>
-      </w:pPr>
-      <w:r>
-        <w:rPr>
-          <w:sz w:val="36"/>
-          <w:szCs w:val="36"/>
-        </w:rPr>
-        <w:t>- Especificação dos casos de uso</w:t>
-      </w:r>
-    </w:p>
-    <w:p>
-      <w:pPr>
-        <w:rPr>
-          <w:sz w:val="36"/>
-          <w:szCs w:val="36"/>
-        </w:rPr>
-      </w:pPr>
-      <w:r>
-        <w:rPr>
-          <w:sz w:val="36"/>
-          <w:szCs w:val="36"/>
-        </w:rPr>
-        <w:t xml:space="preserve"> </w:t>
-      </w:r>
-    </w:p>
-    <w:p>
-      <w:pPr>
-        <w:rPr>
-          <w:sz w:val="36"/>
-          <w:szCs w:val="36"/>
-        </w:rPr>
-      </w:pPr>
-      <w:r>
-        <w:rPr>
-          <w:sz w:val="36"/>
-          <w:szCs w:val="36"/>
-        </w:rPr>
-        <w:t xml:space="preserve">*Semana 6 - 13/04 á 20/04* </w:t>
-      </w:r>
-    </w:p>
-    <w:p>
-      <w:pPr>
-        <w:rPr>
-          <w:sz w:val="36"/>
-          <w:szCs w:val="36"/>
-        </w:rPr>
-      </w:pPr>
-      <w:r>
-        <w:rPr>
-          <w:sz w:val="36"/>
-          <w:szCs w:val="36"/>
-        </w:rPr>
-        <w:t xml:space="preserve">- Especificação dos casos de uso - Modelagem do banco de dados </w:t>
-      </w:r>
-    </w:p>
-    <w:p>
-      <w:pPr>
-        <w:rPr>
-          <w:sz w:val="36"/>
-          <w:szCs w:val="36"/>
-        </w:rPr>
-      </w:pPr>
-    </w:p>
-    <w:p>
-      <w:pPr>
-        <w:rPr>
-          <w:sz w:val="36"/>
-          <w:szCs w:val="36"/>
-        </w:rPr>
-      </w:pPr>
-      <w:r>
-        <w:rPr>
-          <w:sz w:val="36"/>
-          <w:szCs w:val="36"/>
-        </w:rPr>
-        <w:t xml:space="preserve">*Semana </w:t>
-      </w:r>
-      <w:proofErr w:type="gramStart"/>
-      <w:r>
-        <w:rPr>
-          <w:sz w:val="36"/>
-          <w:szCs w:val="36"/>
-        </w:rPr>
-        <w:t>7</w:t>
-      </w:r>
-      <w:proofErr w:type="gramEnd"/>
-      <w:r>
-        <w:rPr>
-          <w:sz w:val="36"/>
-          <w:szCs w:val="36"/>
-        </w:rPr>
-        <w:t xml:space="preserve">... - 20/04 </w:t>
-      </w:r>
-      <w:proofErr w:type="gramStart"/>
-      <w:r>
-        <w:rPr>
-          <w:sz w:val="36"/>
-          <w:szCs w:val="36"/>
-        </w:rPr>
-        <w:t>á ...</w:t>
-      </w:r>
-      <w:proofErr w:type="gramEnd"/>
-      <w:r>
-        <w:rPr>
-          <w:sz w:val="36"/>
-          <w:szCs w:val="36"/>
-        </w:rPr>
-        <w:t xml:space="preserve">* </w:t>
-      </w:r>
-    </w:p>
-    <w:p>
-      <w:pPr>
-        <w:rPr>
-          <w:sz w:val="36"/>
-          <w:szCs w:val="36"/>
-        </w:rPr>
-      </w:pPr>
-      <w:r>
-        <w:rPr>
-          <w:sz w:val="36"/>
-          <w:szCs w:val="36"/>
-        </w:rPr>
-        <w:t>- Implementação do sistema (Programação, testes de segurança e uso com o usuário</w:t>
-      </w:r>
-      <w:proofErr w:type="gramStart"/>
-      <w:r>
-        <w:rPr>
-          <w:sz w:val="36"/>
-          <w:szCs w:val="36"/>
-        </w:rPr>
-        <w:t>)</w:t>
-      </w:r>
-      <w:proofErr w:type="gramEnd"/>
-    </w:p>
-    <w:p>
-      <w:pPr>
-        <w:rPr>
-          <w:sz w:val="36"/>
-          <w:szCs w:val="36"/>
-        </w:rPr>
-      </w:pPr>
-      <w:r>
-        <w:rPr>
-          <w:sz w:val="36"/>
-          <w:szCs w:val="36"/>
-        </w:rPr>
         <w:br w:type="page"/>
       </w:r>
     </w:p>
@@ -2443,7 +2017,19 @@
           <w:szCs w:val="36"/>
           <w:lang w:eastAsia="pt-BR"/>
         </w:rPr>
-        <w:t xml:space="preserve"> Documento de Concepção de Software (</w:t>
+        <w:t xml:space="preserve"> Documento de Concepção de Software </w:t>
+      </w:r>
+      <w:r>
+        <w:rPr>
+          <w:rFonts w:eastAsia="Times New Roman" w:cstheme="minorHAnsi"/>
+          <w:b/>
+          <w:bCs/>
+          <w:color w:val="1F1F1F"/>
+          <w:sz w:val="36"/>
+          <w:szCs w:val="36"/>
+          <w:lang w:eastAsia="pt-BR"/>
+        </w:rPr>
+        <w:t>(</w:t>
       </w:r>
       <w:r>
         <w:rPr>
@@ -2497,15 +2083,18 @@
     <w:p>
       <w:pPr>
         <w:pStyle w:val="Legenda"/>
-        <w:rPr>
-          <w:rFonts w:cstheme="minorHAnsi"/>
-          <w:sz w:val="36"/>
-          <w:szCs w:val="36"/>
-        </w:rPr>
-      </w:pPr>
-      <w:r>
-        <w:rPr>
-          <w:rFonts w:cstheme="minorHAnsi"/>
+        <w:jc w:val="both"/>
+        <w:rPr>
+          <w:rFonts w:cstheme="minorHAnsi"/>
+          <w:i w:val="0"/>
+          <w:sz w:val="36"/>
+          <w:szCs w:val="36"/>
+        </w:rPr>
+      </w:pPr>
+      <w:r>
+        <w:rPr>
+          <w:rFonts w:cstheme="minorHAnsi"/>
+          <w:i w:val="0"/>
           <w:sz w:val="36"/>
           <w:szCs w:val="36"/>
         </w:rPr>
@@ -2638,6 +2227,7 @@
           <w:numId w:val="10"/>
         </w:numPr>
         <w:suppressAutoHyphens/>
+        <w:jc w:val="both"/>
         <w:rPr>
           <w:rFonts w:cstheme="minorHAnsi"/>
           <w:sz w:val="36"/>
@@ -2678,6 +2268,7 @@
           <w:numId w:val="10"/>
         </w:numPr>
         <w:suppressAutoHyphens/>
+        <w:jc w:val="both"/>
         <w:rPr>
           <w:rFonts w:cstheme="minorHAnsi"/>
           <w:sz w:val="36"/>
@@ -2718,6 +2309,7 @@
           <w:numId w:val="10"/>
         </w:numPr>
         <w:suppressAutoHyphens/>
+        <w:jc w:val="both"/>
         <w:rPr>
           <w:rFonts w:cstheme="minorHAnsi"/>
           <w:sz w:val="36"/>
@@ -2854,6 +2446,7 @@
           <w:numId w:val="10"/>
         </w:numPr>
         <w:suppressAutoHyphens/>
+        <w:jc w:val="both"/>
         <w:rPr>
           <w:rFonts w:cstheme="minorHAnsi"/>
           <w:sz w:val="36"/>
@@ -2900,6 +2493,7 @@
           <w:numId w:val="10"/>
         </w:numPr>
         <w:suppressAutoHyphens/>
+        <w:jc w:val="both"/>
         <w:rPr>
           <w:rFonts w:cstheme="minorHAnsi"/>
           <w:sz w:val="36"/>
@@ -2923,6 +2517,7 @@
           <w:numId w:val="10"/>
         </w:numPr>
         <w:suppressAutoHyphens/>
+        <w:jc w:val="both"/>
         <w:rPr>
           <w:rFonts w:cstheme="minorHAnsi"/>
           <w:sz w:val="36"/>
@@ -2945,6 +2540,7 @@
           <w:numId w:val="10"/>
         </w:numPr>
         <w:suppressAutoHyphens/>
+        <w:jc w:val="both"/>
         <w:rPr>
           <w:rFonts w:cstheme="minorHAnsi"/>
           <w:sz w:val="36"/>
@@ -2969,6 +2565,7 @@
           <w:numId w:val="10"/>
         </w:numPr>
         <w:suppressAutoHyphens/>
+        <w:jc w:val="both"/>
         <w:rPr>
           <w:rFonts w:cstheme="minorHAnsi"/>
           <w:sz w:val="36"/>
@@ -2991,6 +2588,7 @@
           <w:numId w:val="10"/>
         </w:numPr>
         <w:suppressAutoHyphens/>
+        <w:jc w:val="both"/>
         <w:rPr>
           <w:rFonts w:cstheme="minorHAnsi"/>
           <w:sz w:val="36"/>
@@ -3013,6 +2611,7 @@
           <w:numId w:val="10"/>
         </w:numPr>
         <w:suppressAutoHyphens/>
+        <w:jc w:val="both"/>
         <w:rPr>
           <w:rFonts w:cstheme="minorHAnsi"/>
           <w:sz w:val="36"/>
@@ -3037,6 +2636,7 @@
           <w:numId w:val="10"/>
         </w:numPr>
         <w:suppressAutoHyphens/>
+        <w:jc w:val="both"/>
         <w:rPr>
           <w:rFonts w:cstheme="minorHAnsi"/>
           <w:sz w:val="36"/>
@@ -3059,6 +2659,7 @@
           <w:numId w:val="10"/>
         </w:numPr>
         <w:suppressAutoHyphens/>
+        <w:jc w:val="both"/>
         <w:rPr>
           <w:rFonts w:cstheme="minorHAnsi"/>
           <w:sz w:val="36"/>
@@ -3081,6 +2682,7 @@
           <w:numId w:val="10"/>
         </w:numPr>
         <w:suppressAutoHyphens/>
+        <w:jc w:val="both"/>
         <w:rPr>
           <w:rFonts w:cstheme="minorHAnsi"/>
           <w:sz w:val="36"/>
@@ -3105,6 +2707,7 @@
           <w:numId w:val="10"/>
         </w:numPr>
         <w:suppressAutoHyphens/>
+        <w:jc w:val="both"/>
         <w:rPr>
           <w:rFonts w:cstheme="minorHAnsi"/>
           <w:sz w:val="36"/>
@@ -3122,6 +2725,7 @@
     </w:p>
     <w:p>
       <w:pPr>
+        <w:jc w:val="both"/>
         <w:rPr>
           <w:rFonts w:cstheme="minorHAnsi"/>
           <w:b/>
@@ -3143,6 +2747,7 @@
     </w:p>
     <w:p>
       <w:pPr>
+        <w:jc w:val="both"/>
         <w:rPr>
           <w:rFonts w:cstheme="minorHAnsi"/>
           <w:sz w:val="36"/>
@@ -3165,6 +2770,7 @@
           <w:numId w:val="11"/>
         </w:numPr>
         <w:suppressAutoHyphens/>
+        <w:jc w:val="both"/>
         <w:rPr>
           <w:rFonts w:cstheme="minorHAnsi"/>
           <w:sz w:val="36"/>
@@ -3197,6 +2803,7 @@
           <w:numId w:val="11"/>
         </w:numPr>
         <w:suppressAutoHyphens/>
+        <w:jc w:val="both"/>
         <w:rPr>
           <w:rFonts w:cstheme="minorHAnsi"/>
           <w:sz w:val="36"/>
@@ -3247,6 +2854,7 @@
           <w:numId w:val="11"/>
         </w:numPr>
         <w:suppressAutoHyphens/>
+        <w:jc w:val="both"/>
         <w:rPr>
           <w:rFonts w:cstheme="minorHAnsi"/>
           <w:sz w:val="36"/>
@@ -3291,8 +2899,8 @@
         <mc:AlternateContent>
           <mc:Choice Requires="wps">
             <w:drawing>
-              <wp:inline distT="0" distB="0" distL="0" distR="0" wp14:anchorId="4E23A1FE" wp14:editId="480A781F">
-                <wp:extent cx="5400040" cy="19050"/>
+              <wp:inline distT="0" distB="0" distL="0" distR="0" wp14:anchorId="4E23A1FE" wp14:editId="37F06DAA">
+                <wp:extent cx="6804000" cy="19050"/>
                 <wp:effectExtent l="0" t="0" r="0" b="0"/>
                 <wp:docPr id="2" name="Retângulo 2"/>
                 <wp:cNvGraphicFramePr/>
@@ -3303,7 +2911,7 @@
                       <wps:spPr>
                         <a:xfrm>
                           <a:off x="0" y="0"/>
-                          <a:ext cx="5400000" cy="19080"/>
+                          <a:ext cx="6804000" cy="19050"/>
                         </a:xfrm>
                         <a:prstGeom prst="rect">
                           <a:avLst/>
@@ -3324,7 +2932,7 @@
           </mc:Choice>
           <mc:Fallback>
             <w:pict>
-              <v:rect id="Retângulo 2" o:spid="_x0000_s1026" style="width:425.2pt;height:1.5pt;visibility:visible;mso-wrap-style:square;mso-left-percent:-10001;mso-top-percent:-10001;mso-position-horizontal:absolute;mso-position-horizontal-relative:char;mso-position-vertical:absolute;mso-position-vertical-relative:line;mso-left-percent:-10001;mso-top-percent:-10001;v-text-anchor:top" o:gfxdata="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" fillcolor="gray" stroked="f" strokeweight="0">
+              <v:rect id="Retângulo 2" o:spid="_x0000_s1026" style="width:535.75pt;height:1.5pt;visibility:visible;mso-wrap-style:square;mso-left-percent:-10001;mso-top-percent:-10001;mso-position-horizontal:absolute;mso-position-horizontal-relative:char;mso-position-vertical:absolute;mso-position-vertical-relative:line;mso-left-percent:-10001;mso-top-percent:-10001;v-text-anchor:top" o:gfxdata="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" fillcolor="gray" stroked="f" strokeweight="0">
                 <w10:anchorlock/>
               </v:rect>
             </w:pict>
@@ -4512,9 +4120,9 @@
         <mc:AlternateContent>
           <mc:Choice Requires="wps">
             <w:drawing>
-              <wp:inline distT="0" distB="0" distL="0" distR="0" wp14:anchorId="13C1CED8" wp14:editId="0D28EC25">
-                <wp:extent cx="5400040" cy="19050"/>
-                <wp:effectExtent l="0" t="0" r="0" b="0"/>
+              <wp:inline distT="0" distB="0" distL="0" distR="0" wp14:anchorId="13C1CED8" wp14:editId="00EDC653">
+                <wp:extent cx="6660000" cy="19050"/>
+                <wp:effectExtent l="0" t="0" r="7620" b="0"/>
                 <wp:docPr id="3" name="Retângulo 3"/>
                 <wp:cNvGraphicFramePr/>
                 <a:graphic xmlns:a="http://schemas.openxmlformats.org/drawingml/2006/main">
@@ -4524,7 +4132,7 @@
                       <wps:spPr>
                         <a:xfrm>
                           <a:off x="0" y="0"/>
-                          <a:ext cx="5400000" cy="19080"/>
+                          <a:ext cx="6660000" cy="19050"/>
                         </a:xfrm>
                         <a:prstGeom prst="rect">
                           <a:avLst/>
@@ -4545,7 +4153,7 @@
           </mc:Choice>
           <mc:Fallback>
             <w:pict>
-              <v:rect id="Retângulo 3" o:spid="_x0000_s1026" style="width:425.2pt;height:1.5pt;visibility:visible;mso-wrap-style:square;mso-left-percent:-10001;mso-top-percent:-10001;mso-position-horizontal:absolute;mso-position-horizontal-relative:char;mso-position-vertical:absolute;mso-position-vertical-relative:line;mso-left-percent:-10001;mso-top-percent:-10001;v-text-anchor:top" o:gfxdata="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" fillcolor="gray" stroked="f" strokeweight="0">
+              <v:rect id="Retângulo 3" o:spid="_x0000_s1026" style="width:524.4pt;height:1.5pt;visibility:visible;mso-wrap-style:square;mso-left-percent:-10001;mso-top-percent:-10001;mso-position-horizontal:absolute;mso-position-horizontal-relative:char;mso-position-vertical:absolute;mso-position-vertical-relative:line;mso-left-percent:-10001;mso-top-percent:-10001;v-text-anchor:top" o:gfxdata="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" fillcolor="gray" stroked="f" strokeweight="0">
                 <w10:anchorlock/>
               </v:rect>
             </w:pict>
@@ -4823,6 +4431,14 @@
         </w:rPr>
         <w:t xml:space="preserve"> </w:t>
       </w:r>
+      <w:r>
+        <w:rPr>
+          <w:rFonts w:cstheme="minorHAnsi"/>
+          <w:sz w:val="36"/>
+          <w:szCs w:val="36"/>
+        </w:rPr>
+        <w:t>versão inicial de um sistema de software, usado para demonstrar conceitos, experimentar opções de projeto e descobrir mais sobre o problema e suas possíveis soluções.</w:t>
+      </w:r>
     </w:p>
     <w:p>
       <w:pPr>
@@ -4842,10 +4458,18 @@
       </w:pPr>
       <w:r>
         <w:rPr>
-          <w:sz w:val="36"/>
-          <w:szCs w:val="36"/>
-        </w:rPr>
-        <w:t xml:space="preserve">*Calendário de trabalho* </w:t>
+          <w:b/>
+          <w:sz w:val="36"/>
+          <w:szCs w:val="36"/>
+        </w:rPr>
+        <w:t>*Calendário de trabalho*</w:t>
+      </w:r>
+      <w:r>
+        <w:rPr>
+          <w:sz w:val="36"/>
+          <w:szCs w:val="36"/>
+        </w:rPr>
+        <w:t xml:space="preserve"> </w:t>
       </w:r>
       <w:r>
         <w:rPr>
@@ -4854,14 +4478,6 @@
         </w:rPr>
         <w:br/>
       </w:r>
-    </w:p>
-    <w:p>
-      <w:pPr>
-        <w:rPr>
-          <w:sz w:val="36"/>
-          <w:szCs w:val="36"/>
-        </w:rPr>
-      </w:pPr>
       <w:r>
         <w:rPr>
           <w:sz w:val="36"/>
@@ -4889,45 +4505,96 @@
           <w:sz w:val="36"/>
           <w:szCs w:val="36"/>
         </w:rPr>
-        <w:t xml:space="preserve">- Mapa mental do software </w:t>
-      </w:r>
-    </w:p>
-    <w:p>
-      <w:pPr>
-        <w:rPr>
-          <w:sz w:val="36"/>
-          <w:szCs w:val="36"/>
-        </w:rPr>
-      </w:pPr>
-    </w:p>
-    <w:p>
-      <w:pPr>
-        <w:rPr>
-          <w:sz w:val="36"/>
-          <w:szCs w:val="36"/>
-        </w:rPr>
-      </w:pPr>
-      <w:r>
-        <w:rPr>
-          <w:sz w:val="36"/>
-          <w:szCs w:val="36"/>
-        </w:rPr>
-        <w:t xml:space="preserve">*Semana 4 - 30/03 á 06/04* </w:t>
-      </w:r>
-    </w:p>
-    <w:p>
-      <w:pPr>
-        <w:rPr>
-          <w:sz w:val="36"/>
-          <w:szCs w:val="36"/>
-        </w:rPr>
-      </w:pPr>
-      <w:r>
-        <w:rPr>
-          <w:sz w:val="36"/>
-          <w:szCs w:val="36"/>
-        </w:rPr>
-        <w:t xml:space="preserve">- Criação de paradigma </w:t>
+        <w:t xml:space="preserve">- </w:t>
+      </w:r>
+      <w:r>
+        <w:rPr>
+          <w:sz w:val="36"/>
+          <w:szCs w:val="36"/>
+        </w:rPr>
+        <w:t>Prototipação das interfaces</w:t>
+      </w:r>
+      <w:r>
+        <w:rPr>
+          <w:sz w:val="36"/>
+          <w:szCs w:val="36"/>
+        </w:rPr>
+        <w:t xml:space="preserve"> </w:t>
+      </w:r>
+    </w:p>
+    <w:p>
+      <w:pPr>
+        <w:rPr>
+          <w:sz w:val="36"/>
+          <w:szCs w:val="36"/>
+        </w:rPr>
+      </w:pPr>
+    </w:p>
+    <w:p>
+      <w:pPr>
+        <w:rPr>
+          <w:sz w:val="36"/>
+          <w:szCs w:val="36"/>
+        </w:rPr>
+      </w:pPr>
+      <w:r>
+        <w:rPr>
+          <w:sz w:val="36"/>
+          <w:szCs w:val="36"/>
+        </w:rPr>
+        <w:t>*Semana 4 - 06/04 á 13</w:t>
+      </w:r>
+      <w:r>
+        <w:rPr>
+          <w:sz w:val="36"/>
+          <w:szCs w:val="36"/>
+        </w:rPr>
+        <w:t xml:space="preserve">/04* </w:t>
+      </w:r>
+    </w:p>
+    <w:p>
+      <w:pPr>
+        <w:rPr>
+          <w:sz w:val="36"/>
+          <w:szCs w:val="36"/>
+        </w:rPr>
+      </w:pPr>
+      <w:r>
+        <w:rPr>
+          <w:sz w:val="36"/>
+          <w:szCs w:val="36"/>
+        </w:rPr>
+        <w:t>- Modelagem do banco de dados</w:t>
+      </w:r>
+    </w:p>
+    <w:p>
+      <w:pPr>
+        <w:rPr>
+          <w:sz w:val="36"/>
+          <w:szCs w:val="36"/>
+        </w:rPr>
+      </w:pPr>
+    </w:p>
+    <w:p>
+      <w:pPr>
+        <w:rPr>
+          <w:sz w:val="36"/>
+          <w:szCs w:val="36"/>
+        </w:rPr>
+      </w:pPr>
+      <w:r>
+        <w:rPr>
+          <w:sz w:val="36"/>
+          <w:szCs w:val="36"/>
+        </w:rPr>
+        <w:t>*Semana 5 - 13/04 á 20</w:t>
+      </w:r>
+      <w:r>
+        <w:rPr>
+          <w:sz w:val="36"/>
+          <w:szCs w:val="36"/>
+        </w:rPr>
+        <w:t xml:space="preserve">/04* </w:t>
       </w:r>
     </w:p>
     <w:p>
@@ -4965,105 +4632,77 @@
           <w:sz w:val="36"/>
           <w:szCs w:val="36"/>
         </w:rPr>
-        <w:t xml:space="preserve">*Semana 5 - 06/04 á 13/04* </w:t>
-      </w:r>
-    </w:p>
-    <w:p>
-      <w:pPr>
-        <w:rPr>
-          <w:sz w:val="36"/>
-          <w:szCs w:val="36"/>
-        </w:rPr>
-      </w:pPr>
-      <w:r>
-        <w:rPr>
-          <w:sz w:val="36"/>
-          <w:szCs w:val="36"/>
-        </w:rPr>
-        <w:t xml:space="preserve">- Diagrama de casos de uso </w:t>
-      </w:r>
-    </w:p>
-    <w:p>
-      <w:pPr>
-        <w:rPr>
-          <w:sz w:val="36"/>
-          <w:szCs w:val="36"/>
-        </w:rPr>
-      </w:pPr>
-      <w:r>
-        <w:rPr>
-          <w:sz w:val="36"/>
-          <w:szCs w:val="36"/>
-        </w:rPr>
-        <w:t>- Especificação dos casos de uso</w:t>
-      </w:r>
-    </w:p>
-    <w:p>
-      <w:pPr>
-        <w:rPr>
-          <w:sz w:val="36"/>
-          <w:szCs w:val="36"/>
-        </w:rPr>
-      </w:pPr>
-      <w:r>
-        <w:rPr>
-          <w:sz w:val="36"/>
-          <w:szCs w:val="36"/>
-        </w:rPr>
-        <w:t xml:space="preserve"> </w:t>
-      </w:r>
-    </w:p>
-    <w:p>
-      <w:pPr>
-        <w:rPr>
-          <w:sz w:val="36"/>
-          <w:szCs w:val="36"/>
-        </w:rPr>
-      </w:pPr>
-      <w:r>
-        <w:rPr>
-          <w:sz w:val="36"/>
-          <w:szCs w:val="36"/>
-        </w:rPr>
-        <w:t xml:space="preserve">*Semana 6 - 13/04 á 20/04* </w:t>
-      </w:r>
-    </w:p>
-    <w:p>
-      <w:pPr>
-        <w:rPr>
-          <w:sz w:val="36"/>
-          <w:szCs w:val="36"/>
-        </w:rPr>
-      </w:pPr>
-      <w:r>
-        <w:rPr>
-          <w:sz w:val="36"/>
-          <w:szCs w:val="36"/>
-        </w:rPr>
-        <w:t xml:space="preserve">- Especificação dos casos de uso - Modelagem do banco de dados </w:t>
-      </w:r>
-    </w:p>
-    <w:p>
-      <w:pPr>
-        <w:rPr>
-          <w:sz w:val="36"/>
-          <w:szCs w:val="36"/>
-        </w:rPr>
-      </w:pPr>
-    </w:p>
-    <w:p>
-      <w:pPr>
-        <w:rPr>
-          <w:sz w:val="36"/>
-          <w:szCs w:val="36"/>
-        </w:rPr>
-      </w:pPr>
-      <w:r>
-        <w:rPr>
-          <w:sz w:val="36"/>
-          <w:szCs w:val="36"/>
-        </w:rPr>
-        <w:t xml:space="preserve">*Semana </w:t>
+        <w:t>*Semana 6 - 20/04 á 27</w:t>
+      </w:r>
+      <w:r>
+        <w:rPr>
+          <w:sz w:val="36"/>
+          <w:szCs w:val="36"/>
+        </w:rPr>
+        <w:t xml:space="preserve">/04* </w:t>
+      </w:r>
+    </w:p>
+    <w:p>
+      <w:pPr>
+        <w:rPr>
+          <w:sz w:val="36"/>
+          <w:szCs w:val="36"/>
+        </w:rPr>
+      </w:pPr>
+      <w:r>
+        <w:rPr>
+          <w:sz w:val="36"/>
+          <w:szCs w:val="36"/>
+        </w:rPr>
+        <w:t xml:space="preserve">- Especificação dos casos de uso </w:t>
+      </w:r>
+    </w:p>
+    <w:p>
+      <w:pPr>
+        <w:rPr>
+          <w:sz w:val="36"/>
+          <w:szCs w:val="36"/>
+        </w:rPr>
+      </w:pPr>
+    </w:p>
+    <w:p>
+      <w:pPr>
+        <w:rPr>
+          <w:sz w:val="36"/>
+          <w:szCs w:val="36"/>
+        </w:rPr>
+      </w:pPr>
+      <w:r>
+        <w:rPr>
+          <w:sz w:val="36"/>
+          <w:szCs w:val="36"/>
+        </w:rPr>
+        <w:t>*Semana 7 - 27/04 á 08/06</w:t>
+      </w:r>
+      <w:r>
+        <w:rPr>
+          <w:sz w:val="36"/>
+          <w:szCs w:val="36"/>
+        </w:rPr>
+        <w:t xml:space="preserve">* </w:t>
+      </w:r>
+    </w:p>
+    <w:p>
+      <w:pPr>
+        <w:rPr>
+          <w:rFonts w:cstheme="minorHAnsi"/>
+          <w:b/>
+          <w:bCs/>
+          <w:sz w:val="36"/>
+          <w:szCs w:val="36"/>
+        </w:rPr>
+      </w:pPr>
+      <w:r>
+        <w:rPr>
+          <w:sz w:val="36"/>
+          <w:szCs w:val="36"/>
+        </w:rPr>
+        <w:t xml:space="preserve">- </w:t>
       </w:r>
       <w:proofErr w:type="gramStart"/>
       <w:r>
@@ -5071,7 +4710,16 @@
           <w:sz w:val="36"/>
           <w:szCs w:val="36"/>
         </w:rPr>
-        <w:t>7</w:t>
+        <w:t>Implementaçã</w:t>
+      </w:r>
+      <w:bookmarkStart w:id="0" w:name="_GoBack"/>
+      <w:bookmarkEnd w:id="0"/>
+      <w:r>
+        <w:rPr>
+          <w:sz w:val="36"/>
+          <w:szCs w:val="36"/>
+        </w:rPr>
+        <w:t>o</w:t>
       </w:r>
       <w:proofErr w:type="gramEnd"/>
       <w:r>
@@ -5079,52 +4727,15 @@
           <w:sz w:val="36"/>
           <w:szCs w:val="36"/>
         </w:rPr>
-        <w:t xml:space="preserve">... - 20/04 </w:t>
-      </w:r>
-      <w:proofErr w:type="gramStart"/>
-      <w:r>
-        <w:rPr>
-          <w:sz w:val="36"/>
-          <w:szCs w:val="36"/>
-        </w:rPr>
-        <w:t>á ...</w:t>
-      </w:r>
-      <w:proofErr w:type="gramEnd"/>
-      <w:r>
-        <w:rPr>
-          <w:sz w:val="36"/>
-          <w:szCs w:val="36"/>
-        </w:rPr>
-        <w:t xml:space="preserve">* </w:t>
-      </w:r>
-    </w:p>
-    <w:p>
-      <w:pPr>
-        <w:rPr>
-          <w:rFonts w:cstheme="minorHAnsi"/>
-          <w:b/>
-          <w:bCs/>
-          <w:sz w:val="36"/>
-          <w:szCs w:val="36"/>
-        </w:rPr>
-      </w:pPr>
-      <w:r>
-        <w:rPr>
-          <w:sz w:val="36"/>
-          <w:szCs w:val="36"/>
-        </w:rPr>
-        <w:lastRenderedPageBreak/>
-        <w:t>- Implementação do sistema (Programação, testes de segurança e uso com o usuário</w:t>
-      </w:r>
-      <w:proofErr w:type="gramStart"/>
-      <w:r>
-        <w:rPr>
-          <w:sz w:val="36"/>
-          <w:szCs w:val="36"/>
-        </w:rPr>
-        <w:t>)</w:t>
-      </w:r>
-      <w:proofErr w:type="gramEnd"/>
+        <w:t xml:space="preserve"> do sistema (Programação, testes de segurança e com o usuário)</w:t>
+      </w:r>
+      <w:r>
+        <w:rPr>
+          <w:sz w:val="36"/>
+          <w:szCs w:val="36"/>
+        </w:rPr>
+        <w:t>.</w:t>
+      </w:r>
     </w:p>
     <w:sectPr>
       <w:headerReference w:type="default" r:id="rId11"/>
@@ -5248,7 +4859,7 @@
         <w:noProof/>
         <w:color w:val="4472C4" w:themeColor="accent1"/>
       </w:rPr>
-      <w:t>3</w:t>
+      <w:t>8</w:t>
     </w:r>
     <w:r>
       <w:rPr>
@@ -5285,7 +4896,7 @@
         <w:noProof/>
         <w:color w:val="4472C4" w:themeColor="accent1"/>
       </w:rPr>
-      <w:t>10</w:t>
+      <w:t>8</w:t>
     </w:r>
     <w:r>
       <w:rPr>
@@ -5806,9 +5417,9 @@
   <w:abstractNum w:abstractNumId="3">
     <w:nsid w:val="1A1D0AC6"/>
     <w:multiLevelType w:val="multilevel"/>
-    <w:tmpl w:val="72685B90"/>
+    <w:tmpl w:val="6772E1D2"/>
     <w:lvl w:ilvl="0">
-      <w:start w:val="5"/>
+      <w:start w:val="1"/>
       <w:numFmt w:val="decimal"/>
       <w:lvlText w:val="%1."/>
       <w:lvlJc w:val="left"/>
@@ -8479,7 +8090,7 @@
 </file>
 
 <file path=customXml/itemProps1.xml><?xml version="1.0" encoding="utf-8"?>
-<ds:datastoreItem xmlns:ds="http://schemas.openxmlformats.org/officeDocument/2006/customXml" ds:itemID="{7B1D7620-27FE-455A-BF0E-009DADECEFD5}">
+<ds:datastoreItem xmlns:ds="http://schemas.openxmlformats.org/officeDocument/2006/customXml" ds:itemID="{FA169AD2-0ECF-4889-B609-328C53875611}">
   <ds:schemaRefs>
     <ds:schemaRef ds:uri="http://schemas.openxmlformats.org/officeDocument/2006/bibliography"/>
   </ds:schemaRefs>

</xml_diff>

<commit_message>
Finalização da documentação da prototipação
</commit_message>
<xml_diff>
--- a/Projeto de Engenharia de Software (Documentação).docx
+++ b/Projeto de Engenharia de Software (Documentação).docx
@@ -2655,7 +2655,7 @@
           </mc:Choice>
           <mc:Fallback>
             <w:pict>
-              <v:rect w14:anchorId="0CA8725D" id="Retângulo 2" o:spid="_x0000_s1026" style="width:535.75pt;height:1.5pt;visibility:visible;mso-wrap-style:square;mso-left-percent:-10001;mso-top-percent:-10001;mso-position-horizontal:absolute;mso-position-horizontal-relative:char;mso-position-vertical:absolute;mso-position-vertical-relative:line;mso-left-percent:-10001;mso-top-percent:-10001;v-text-anchor:top" o:gfxdata="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" fillcolor="gray" stroked="f" strokeweight="0">
+              <v:rect w14:anchorId="753F30AB" id="Retângulo 2" o:spid="_x0000_s1026" style="width:535.75pt;height:1.5pt;visibility:visible;mso-wrap-style:square;mso-left-percent:-10001;mso-top-percent:-10001;mso-position-horizontal:absolute;mso-position-horizontal-relative:char;mso-position-vertical:absolute;mso-position-vertical-relative:line;mso-left-percent:-10001;mso-top-percent:-10001;v-text-anchor:top" o:gfxdata="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" fillcolor="gray" stroked="f" strokeweight="0">
                 <w10:anchorlock/>
               </v:rect>
             </w:pict>
@@ -3866,7 +3866,7 @@
           </mc:Choice>
           <mc:Fallback>
             <w:pict>
-              <v:rect w14:anchorId="2157DDE8" id="Retângulo 3" o:spid="_x0000_s1026" style="width:524.4pt;height:1.5pt;visibility:visible;mso-wrap-style:square;mso-left-percent:-10001;mso-top-percent:-10001;mso-position-horizontal:absolute;mso-position-horizontal-relative:char;mso-position-vertical:absolute;mso-position-vertical-relative:line;mso-left-percent:-10001;mso-top-percent:-10001;v-text-anchor:top" o:gfxdata="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" fillcolor="gray" stroked="f" strokeweight="0">
+              <v:rect w14:anchorId="02E2458E" id="Retângulo 3" o:spid="_x0000_s1026" style="width:524.4pt;height:1.5pt;visibility:visible;mso-wrap-style:square;mso-left-percent:-10001;mso-top-percent:-10001;mso-position-horizontal:absolute;mso-position-horizontal-relative:char;mso-position-vertical:absolute;mso-position-vertical-relative:line;mso-left-percent:-10001;mso-top-percent:-10001;v-text-anchor:top" o:gfxdata="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" fillcolor="gray" stroked="f" strokeweight="0">
                 <w10:anchorlock/>
               </v:rect>
             </w:pict>
@@ -4382,7 +4382,6 @@
         </w:rPr>
         <w:t xml:space="preserve">versão visual do sistema utilizando a ferramenta </w:t>
       </w:r>
-      <w:proofErr w:type="spellStart"/>
       <w:r>
         <w:rPr>
           <w:b/>
@@ -4392,7 +4391,6 @@
         </w:rPr>
         <w:t>Figma</w:t>
       </w:r>
-      <w:proofErr w:type="spellEnd"/>
       <w:r>
         <w:rPr>
           <w:sz w:val="36"/>
@@ -4564,55 +4562,7 @@
           <w:szCs w:val="36"/>
         </w:rPr>
         <w:lastRenderedPageBreak/>
-        <w:t>(#f97316) para botões de ação (</w:t>
-      </w:r>
-      <w:proofErr w:type="spellStart"/>
-      <w:r>
-        <w:rPr>
-          <w:sz w:val="36"/>
-          <w:szCs w:val="36"/>
-        </w:rPr>
-        <w:t>Call</w:t>
-      </w:r>
-      <w:proofErr w:type="spellEnd"/>
-      <w:r>
-        <w:rPr>
-          <w:sz w:val="36"/>
-          <w:szCs w:val="36"/>
-        </w:rPr>
-        <w:t xml:space="preserve"> </w:t>
-      </w:r>
-      <w:proofErr w:type="spellStart"/>
-      <w:r>
-        <w:rPr>
-          <w:sz w:val="36"/>
-          <w:szCs w:val="36"/>
-        </w:rPr>
-        <w:t>to</w:t>
-      </w:r>
-      <w:proofErr w:type="spellEnd"/>
-      <w:r>
-        <w:rPr>
-          <w:sz w:val="36"/>
-          <w:szCs w:val="36"/>
-        </w:rPr>
-        <w:t xml:space="preserve"> </w:t>
-      </w:r>
-      <w:proofErr w:type="spellStart"/>
-      <w:r>
-        <w:rPr>
-          <w:sz w:val="36"/>
-          <w:szCs w:val="36"/>
-        </w:rPr>
-        <w:t>Action</w:t>
-      </w:r>
-      <w:proofErr w:type="spellEnd"/>
-      <w:r>
-        <w:rPr>
-          <w:sz w:val="36"/>
-          <w:szCs w:val="36"/>
-        </w:rPr>
-        <w:t>), facilitando a navegação do usuário.</w:t>
+        <w:t>(#f97316) para botões de ação (Call to Action), facilitando a navegação do usuário.</w:t>
       </w:r>
     </w:p>
     <w:p>
@@ -4632,46 +4582,14 @@
           <w:sz w:val="36"/>
           <w:szCs w:val="36"/>
         </w:rPr>
-        <w:t xml:space="preserve">Responsividade: O layout foi concebido utilizando o framework </w:t>
-      </w:r>
-      <w:proofErr w:type="spellStart"/>
-      <w:r>
-        <w:rPr>
-          <w:sz w:val="36"/>
-          <w:szCs w:val="36"/>
-        </w:rPr>
-        <w:t>Tailwind</w:t>
-      </w:r>
-      <w:proofErr w:type="spellEnd"/>
-      <w:r>
-        <w:rPr>
-          <w:sz w:val="36"/>
-          <w:szCs w:val="36"/>
-        </w:rPr>
-        <w:t xml:space="preserve"> CSS</w:t>
-      </w:r>
-      <w:r>
-        <w:rPr>
-          <w:sz w:val="36"/>
-          <w:szCs w:val="36"/>
-        </w:rPr>
-        <w:t xml:space="preserve"> (através do </w:t>
-      </w:r>
-      <w:proofErr w:type="spellStart"/>
-      <w:r>
-        <w:rPr>
-          <w:sz w:val="36"/>
-          <w:szCs w:val="36"/>
-        </w:rPr>
-        <w:t>Figma</w:t>
-      </w:r>
-      <w:proofErr w:type="spellEnd"/>
-      <w:r>
-        <w:rPr>
-          <w:sz w:val="36"/>
-          <w:szCs w:val="36"/>
-        </w:rPr>
-        <w:t>)</w:t>
+        <w:t>Responsividade: O layout foi concebido utilizando o framework Tailwind CSS</w:t>
+      </w:r>
+      <w:r>
+        <w:rPr>
+          <w:sz w:val="36"/>
+          <w:szCs w:val="36"/>
+        </w:rPr>
+        <w:t xml:space="preserve"> (através do Figma)</w:t>
       </w:r>
       <w:r>
         <w:rPr>
@@ -4698,39 +4616,14 @@
           <w:sz w:val="36"/>
           <w:szCs w:val="36"/>
         </w:rPr>
-        <w:t xml:space="preserve">Acessibilidade: Uso de ícones da biblioteca Lucide </w:t>
-      </w:r>
-      <w:proofErr w:type="spellStart"/>
-      <w:r>
-        <w:rPr>
-          <w:sz w:val="36"/>
-          <w:szCs w:val="36"/>
-        </w:rPr>
-        <w:t>React</w:t>
-      </w:r>
-      <w:proofErr w:type="spellEnd"/>
-      <w:r>
-        <w:rPr>
-          <w:sz w:val="36"/>
-          <w:szCs w:val="36"/>
-        </w:rPr>
-        <w:t xml:space="preserve"> (através do </w:t>
-      </w:r>
-      <w:proofErr w:type="spellStart"/>
-      <w:r>
-        <w:rPr>
-          <w:sz w:val="36"/>
-          <w:szCs w:val="36"/>
-        </w:rPr>
-        <w:t>Figma</w:t>
-      </w:r>
-      <w:proofErr w:type="spellEnd"/>
-      <w:r>
-        <w:rPr>
-          <w:sz w:val="36"/>
-          <w:szCs w:val="36"/>
-        </w:rPr>
-        <w:t>)</w:t>
+        <w:t>Acessibilidade: Uso de ícones da biblioteca Lucide React</w:t>
+      </w:r>
+      <w:r>
+        <w:rPr>
+          <w:sz w:val="36"/>
+          <w:szCs w:val="36"/>
+        </w:rPr>
+        <w:t xml:space="preserve"> (através do Figma)</w:t>
       </w:r>
       <w:r>
         <w:rPr>
@@ -4936,27 +4829,7 @@
           <w:szCs w:val="36"/>
         </w:rPr>
         <w:lastRenderedPageBreak/>
-        <w:t>3.3 Evidências Visuais (</w:t>
-      </w:r>
-      <w:proofErr w:type="spellStart"/>
-      <w:r>
-        <w:rPr>
-          <w:b/>
-          <w:bCs/>
-          <w:sz w:val="36"/>
-          <w:szCs w:val="36"/>
-        </w:rPr>
-        <w:t>Screenshots</w:t>
-      </w:r>
-      <w:proofErr w:type="spellEnd"/>
-      <w:r>
-        <w:rPr>
-          <w:b/>
-          <w:bCs/>
-          <w:sz w:val="36"/>
-          <w:szCs w:val="36"/>
-        </w:rPr>
-        <w:t>)</w:t>
+        <w:t>3.3 Evidências Visuais (Screenshots)</w:t>
       </w:r>
     </w:p>
     <w:p>
@@ -6713,6 +6586,47 @@
           <w:szCs w:val="36"/>
         </w:rPr>
       </w:pPr>
+      <w:r>
+        <w:rPr>
+          <w:sz w:val="36"/>
+          <w:szCs w:val="36"/>
+        </w:rPr>
+        <w:drawing>
+          <wp:inline distT="0" distB="0" distL="0" distR="0" wp14:anchorId="75474061" wp14:editId="4E0DDFBD">
+            <wp:extent cx="6645910" cy="3490595"/>
+            <wp:effectExtent l="0" t="0" r="2540" b="0"/>
+            <wp:docPr id="862722835" name="Imagem 1"/>
+            <wp:cNvGraphicFramePr>
+              <a:graphicFrameLocks xmlns:a="http://schemas.openxmlformats.org/drawingml/2006/main" noChangeAspect="1"/>
+            </wp:cNvGraphicFramePr>
+            <a:graphic xmlns:a="http://schemas.openxmlformats.org/drawingml/2006/main">
+              <a:graphicData uri="http://schemas.openxmlformats.org/drawingml/2006/picture">
+                <pic:pic xmlns:pic="http://schemas.openxmlformats.org/drawingml/2006/picture">
+                  <pic:nvPicPr>
+                    <pic:cNvPr id="862722835" name=""/>
+                    <pic:cNvPicPr/>
+                  </pic:nvPicPr>
+                  <pic:blipFill>
+                    <a:blip r:embed="rId35"/>
+                    <a:stretch>
+                      <a:fillRect/>
+                    </a:stretch>
+                  </pic:blipFill>
+                  <pic:spPr>
+                    <a:xfrm>
+                      <a:off x="0" y="0"/>
+                      <a:ext cx="6645910" cy="3490595"/>
+                    </a:xfrm>
+                    <a:prstGeom prst="rect">
+                      <a:avLst/>
+                    </a:prstGeom>
+                  </pic:spPr>
+                </pic:pic>
+              </a:graphicData>
+            </a:graphic>
+          </wp:inline>
+        </w:drawing>
+      </w:r>
     </w:p>
     <w:p>
       <w:pPr>
@@ -6722,6 +6636,34 @@
           <w:szCs w:val="36"/>
         </w:rPr>
       </w:pPr>
+      <w:r>
+        <w:rPr>
+          <w:sz w:val="36"/>
+          <w:szCs w:val="36"/>
+        </w:rPr>
+        <w:t xml:space="preserve">Legenda: </w:t>
+      </w:r>
+      <w:r>
+        <w:rPr>
+          <w:sz w:val="36"/>
+          <w:szCs w:val="36"/>
+        </w:rPr>
+        <w:t xml:space="preserve">Visão </w:t>
+      </w:r>
+      <w:r>
+        <w:rPr>
+          <w:sz w:val="36"/>
+          <w:szCs w:val="36"/>
+        </w:rPr>
+        <w:t>dos valores a receber de clientes</w:t>
+      </w:r>
+      <w:r>
+        <w:rPr>
+          <w:sz w:val="36"/>
+          <w:szCs w:val="36"/>
+        </w:rPr>
+        <w:t>.</w:t>
+      </w:r>
     </w:p>
     <w:p>
       <w:pPr>
@@ -6731,6 +6673,48 @@
           <w:szCs w:val="36"/>
         </w:rPr>
       </w:pPr>
+      <w:r>
+        <w:rPr>
+          <w:sz w:val="36"/>
+          <w:szCs w:val="36"/>
+        </w:rPr>
+        <w:lastRenderedPageBreak/>
+        <w:drawing>
+          <wp:inline distT="0" distB="0" distL="0" distR="0" wp14:anchorId="334BA7ED" wp14:editId="2465A4BB">
+            <wp:extent cx="6645910" cy="1820545"/>
+            <wp:effectExtent l="0" t="0" r="2540" b="8255"/>
+            <wp:docPr id="2037972491" name="Imagem 1"/>
+            <wp:cNvGraphicFramePr>
+              <a:graphicFrameLocks xmlns:a="http://schemas.openxmlformats.org/drawingml/2006/main" noChangeAspect="1"/>
+            </wp:cNvGraphicFramePr>
+            <a:graphic xmlns:a="http://schemas.openxmlformats.org/drawingml/2006/main">
+              <a:graphicData uri="http://schemas.openxmlformats.org/drawingml/2006/picture">
+                <pic:pic xmlns:pic="http://schemas.openxmlformats.org/drawingml/2006/picture">
+                  <pic:nvPicPr>
+                    <pic:cNvPr id="2037972491" name=""/>
+                    <pic:cNvPicPr/>
+                  </pic:nvPicPr>
+                  <pic:blipFill>
+                    <a:blip r:embed="rId36"/>
+                    <a:stretch>
+                      <a:fillRect/>
+                    </a:stretch>
+                  </pic:blipFill>
+                  <pic:spPr>
+                    <a:xfrm>
+                      <a:off x="0" y="0"/>
+                      <a:ext cx="6645910" cy="1820545"/>
+                    </a:xfrm>
+                    <a:prstGeom prst="rect">
+                      <a:avLst/>
+                    </a:prstGeom>
+                  </pic:spPr>
+                </pic:pic>
+              </a:graphicData>
+            </a:graphic>
+          </wp:inline>
+        </w:drawing>
+      </w:r>
     </w:p>
     <w:p>
       <w:pPr>
@@ -6740,6 +6724,34 @@
           <w:szCs w:val="36"/>
         </w:rPr>
       </w:pPr>
+      <w:r>
+        <w:rPr>
+          <w:sz w:val="36"/>
+          <w:szCs w:val="36"/>
+        </w:rPr>
+        <w:t xml:space="preserve">Legenda: </w:t>
+      </w:r>
+      <w:r>
+        <w:rPr>
+          <w:sz w:val="36"/>
+          <w:szCs w:val="36"/>
+        </w:rPr>
+        <w:t xml:space="preserve">Visão </w:t>
+      </w:r>
+      <w:r>
+        <w:rPr>
+          <w:sz w:val="36"/>
+          <w:szCs w:val="36"/>
+        </w:rPr>
+        <w:t>dos pagamentos em haver aos fornecedores</w:t>
+      </w:r>
+      <w:r>
+        <w:rPr>
+          <w:sz w:val="36"/>
+          <w:szCs w:val="36"/>
+        </w:rPr>
+        <w:t>.</w:t>
+      </w:r>
     </w:p>
     <w:p>
       <w:pPr>
@@ -6749,6 +6761,47 @@
           <w:szCs w:val="36"/>
         </w:rPr>
       </w:pPr>
+      <w:r>
+        <w:rPr>
+          <w:sz w:val="36"/>
+          <w:szCs w:val="36"/>
+        </w:rPr>
+        <w:drawing>
+          <wp:inline distT="0" distB="0" distL="0" distR="0" wp14:anchorId="6BD761DA" wp14:editId="07D653BA">
+            <wp:extent cx="6645910" cy="2200275"/>
+            <wp:effectExtent l="0" t="0" r="2540" b="9525"/>
+            <wp:docPr id="320964071" name="Imagem 1"/>
+            <wp:cNvGraphicFramePr>
+              <a:graphicFrameLocks xmlns:a="http://schemas.openxmlformats.org/drawingml/2006/main" noChangeAspect="1"/>
+            </wp:cNvGraphicFramePr>
+            <a:graphic xmlns:a="http://schemas.openxmlformats.org/drawingml/2006/main">
+              <a:graphicData uri="http://schemas.openxmlformats.org/drawingml/2006/picture">
+                <pic:pic xmlns:pic="http://schemas.openxmlformats.org/drawingml/2006/picture">
+                  <pic:nvPicPr>
+                    <pic:cNvPr id="320964071" name=""/>
+                    <pic:cNvPicPr/>
+                  </pic:nvPicPr>
+                  <pic:blipFill>
+                    <a:blip r:embed="rId37"/>
+                    <a:stretch>
+                      <a:fillRect/>
+                    </a:stretch>
+                  </pic:blipFill>
+                  <pic:spPr>
+                    <a:xfrm>
+                      <a:off x="0" y="0"/>
+                      <a:ext cx="6645910" cy="2200275"/>
+                    </a:xfrm>
+                    <a:prstGeom prst="rect">
+                      <a:avLst/>
+                    </a:prstGeom>
+                  </pic:spPr>
+                </pic:pic>
+              </a:graphicData>
+            </a:graphic>
+          </wp:inline>
+        </w:drawing>
+      </w:r>
     </w:p>
     <w:p>
       <w:pPr>
@@ -6758,6 +6811,34 @@
           <w:szCs w:val="36"/>
         </w:rPr>
       </w:pPr>
+      <w:r>
+        <w:rPr>
+          <w:sz w:val="36"/>
+          <w:szCs w:val="36"/>
+        </w:rPr>
+        <w:t xml:space="preserve">Legenda: </w:t>
+      </w:r>
+      <w:r>
+        <w:rPr>
+          <w:sz w:val="36"/>
+          <w:szCs w:val="36"/>
+        </w:rPr>
+        <w:t xml:space="preserve">Visão </w:t>
+      </w:r>
+      <w:r>
+        <w:rPr>
+          <w:sz w:val="36"/>
+          <w:szCs w:val="36"/>
+        </w:rPr>
+        <w:t>da margem de lucro atual de cada produto</w:t>
+      </w:r>
+      <w:r>
+        <w:rPr>
+          <w:sz w:val="36"/>
+          <w:szCs w:val="36"/>
+        </w:rPr>
+        <w:t>.</w:t>
+      </w:r>
     </w:p>
     <w:p>
       <w:pPr>
@@ -6770,14 +6851,2307 @@
     </w:p>
     <w:p>
       <w:pPr>
-        <w:jc w:val="both"/>
-        <w:rPr>
-          <w:b/>
-          <w:bCs/>
-          <w:sz w:val="36"/>
-          <w:szCs w:val="36"/>
-        </w:rPr>
-      </w:pPr>
+        <w:jc w:val="center"/>
+        <w:rPr>
+          <w:sz w:val="36"/>
+          <w:szCs w:val="36"/>
+        </w:rPr>
+      </w:pPr>
+      <w:r>
+        <w:rPr>
+          <w:sz w:val="36"/>
+          <w:szCs w:val="36"/>
+        </w:rPr>
+        <w:drawing>
+          <wp:inline distT="0" distB="0" distL="0" distR="0" wp14:anchorId="34E1760D" wp14:editId="2ED630BE">
+            <wp:extent cx="6645910" cy="2507615"/>
+            <wp:effectExtent l="0" t="0" r="2540" b="6985"/>
+            <wp:docPr id="40308752" name="Imagem 1"/>
+            <wp:cNvGraphicFramePr>
+              <a:graphicFrameLocks xmlns:a="http://schemas.openxmlformats.org/drawingml/2006/main" noChangeAspect="1"/>
+            </wp:cNvGraphicFramePr>
+            <a:graphic xmlns:a="http://schemas.openxmlformats.org/drawingml/2006/main">
+              <a:graphicData uri="http://schemas.openxmlformats.org/drawingml/2006/picture">
+                <pic:pic xmlns:pic="http://schemas.openxmlformats.org/drawingml/2006/picture">
+                  <pic:nvPicPr>
+                    <pic:cNvPr id="40308752" name=""/>
+                    <pic:cNvPicPr/>
+                  </pic:nvPicPr>
+                  <pic:blipFill>
+                    <a:blip r:embed="rId38"/>
+                    <a:stretch>
+                      <a:fillRect/>
+                    </a:stretch>
+                  </pic:blipFill>
+                  <pic:spPr>
+                    <a:xfrm>
+                      <a:off x="0" y="0"/>
+                      <a:ext cx="6645910" cy="2507615"/>
+                    </a:xfrm>
+                    <a:prstGeom prst="rect">
+                      <a:avLst/>
+                    </a:prstGeom>
+                  </pic:spPr>
+                </pic:pic>
+              </a:graphicData>
+            </a:graphic>
+          </wp:inline>
+        </w:drawing>
+      </w:r>
+    </w:p>
+    <w:p>
+      <w:pPr>
+        <w:jc w:val="center"/>
+        <w:rPr>
+          <w:sz w:val="36"/>
+          <w:szCs w:val="36"/>
+        </w:rPr>
+      </w:pPr>
+      <w:r>
+        <w:rPr>
+          <w:sz w:val="36"/>
+          <w:szCs w:val="36"/>
+        </w:rPr>
+        <w:t xml:space="preserve">Legenda: </w:t>
+      </w:r>
+      <w:r>
+        <w:rPr>
+          <w:sz w:val="36"/>
+          <w:szCs w:val="36"/>
+        </w:rPr>
+        <w:t xml:space="preserve">Visão </w:t>
+      </w:r>
+      <w:r>
+        <w:rPr>
+          <w:sz w:val="36"/>
+          <w:szCs w:val="36"/>
+        </w:rPr>
+        <w:t>geral do campo de relatórios, que demonstra os tipos disponíveis.</w:t>
+      </w:r>
+    </w:p>
+    <w:p>
+      <w:pPr>
+        <w:spacing w:after="0"/>
+        <w:jc w:val="center"/>
+        <w:rPr>
+          <w:sz w:val="36"/>
+          <w:szCs w:val="36"/>
+        </w:rPr>
+      </w:pPr>
+      <w:r>
+        <w:rPr>
+          <w:sz w:val="36"/>
+          <w:szCs w:val="36"/>
+        </w:rPr>
+        <w:lastRenderedPageBreak/>
+        <w:drawing>
+          <wp:inline distT="0" distB="0" distL="0" distR="0" wp14:anchorId="6D00216F" wp14:editId="7402207B">
+            <wp:extent cx="6645910" cy="3121025"/>
+            <wp:effectExtent l="0" t="0" r="2540" b="3175"/>
+            <wp:docPr id="2027471047" name="Imagem 1"/>
+            <wp:cNvGraphicFramePr>
+              <a:graphicFrameLocks xmlns:a="http://schemas.openxmlformats.org/drawingml/2006/main" noChangeAspect="1"/>
+            </wp:cNvGraphicFramePr>
+            <a:graphic xmlns:a="http://schemas.openxmlformats.org/drawingml/2006/main">
+              <a:graphicData uri="http://schemas.openxmlformats.org/drawingml/2006/picture">
+                <pic:pic xmlns:pic="http://schemas.openxmlformats.org/drawingml/2006/picture">
+                  <pic:nvPicPr>
+                    <pic:cNvPr id="2027471047" name=""/>
+                    <pic:cNvPicPr/>
+                  </pic:nvPicPr>
+                  <pic:blipFill>
+                    <a:blip r:embed="rId39"/>
+                    <a:stretch>
+                      <a:fillRect/>
+                    </a:stretch>
+                  </pic:blipFill>
+                  <pic:spPr>
+                    <a:xfrm>
+                      <a:off x="0" y="0"/>
+                      <a:ext cx="6645910" cy="3121025"/>
+                    </a:xfrm>
+                    <a:prstGeom prst="rect">
+                      <a:avLst/>
+                    </a:prstGeom>
+                  </pic:spPr>
+                </pic:pic>
+              </a:graphicData>
+            </a:graphic>
+          </wp:inline>
+        </w:drawing>
+      </w:r>
+    </w:p>
+    <w:p>
+      <w:pPr>
+        <w:jc w:val="center"/>
+        <w:rPr>
+          <w:sz w:val="36"/>
+          <w:szCs w:val="36"/>
+        </w:rPr>
+      </w:pPr>
+      <w:r>
+        <w:rPr>
+          <w:sz w:val="36"/>
+          <w:szCs w:val="36"/>
+        </w:rPr>
+        <w:drawing>
+          <wp:inline distT="0" distB="0" distL="0" distR="0" wp14:anchorId="5909378F" wp14:editId="3D841E9A">
+            <wp:extent cx="6645910" cy="2771775"/>
+            <wp:effectExtent l="0" t="0" r="2540" b="9525"/>
+            <wp:docPr id="151328014" name="Imagem 1"/>
+            <wp:cNvGraphicFramePr>
+              <a:graphicFrameLocks xmlns:a="http://schemas.openxmlformats.org/drawingml/2006/main" noChangeAspect="1"/>
+            </wp:cNvGraphicFramePr>
+            <a:graphic xmlns:a="http://schemas.openxmlformats.org/drawingml/2006/main">
+              <a:graphicData uri="http://schemas.openxmlformats.org/drawingml/2006/picture">
+                <pic:pic xmlns:pic="http://schemas.openxmlformats.org/drawingml/2006/picture">
+                  <pic:nvPicPr>
+                    <pic:cNvPr id="151328014" name=""/>
+                    <pic:cNvPicPr/>
+                  </pic:nvPicPr>
+                  <pic:blipFill rotWithShape="1">
+                    <a:blip r:embed="rId40"/>
+                    <a:srcRect b="7892"/>
+                    <a:stretch>
+                      <a:fillRect/>
+                    </a:stretch>
+                  </pic:blipFill>
+                  <pic:spPr bwMode="auto">
+                    <a:xfrm>
+                      <a:off x="0" y="0"/>
+                      <a:ext cx="6645910" cy="2771775"/>
+                    </a:xfrm>
+                    <a:prstGeom prst="rect">
+                      <a:avLst/>
+                    </a:prstGeom>
+                    <a:ln>
+                      <a:noFill/>
+                    </a:ln>
+                    <a:extLst>
+                      <a:ext uri="{53640926-AAD7-44D8-BBD7-CCE9431645EC}">
+                        <a14:shadowObscured xmlns:a14="http://schemas.microsoft.com/office/drawing/2010/main"/>
+                      </a:ext>
+                    </a:extLst>
+                  </pic:spPr>
+                </pic:pic>
+              </a:graphicData>
+            </a:graphic>
+          </wp:inline>
+        </w:drawing>
+      </w:r>
+    </w:p>
+    <w:p>
+      <w:pPr>
+        <w:jc w:val="center"/>
+        <w:rPr>
+          <w:sz w:val="36"/>
+          <w:szCs w:val="36"/>
+        </w:rPr>
+      </w:pPr>
+      <w:r>
+        <w:rPr>
+          <w:sz w:val="36"/>
+          <w:szCs w:val="36"/>
+        </w:rPr>
+        <w:drawing>
+          <wp:inline distT="0" distB="0" distL="0" distR="0" wp14:anchorId="3FA1D9F4" wp14:editId="47CC661C">
+            <wp:extent cx="6645910" cy="2078990"/>
+            <wp:effectExtent l="0" t="0" r="2540" b="0"/>
+            <wp:docPr id="1927074844" name="Imagem 1"/>
+            <wp:cNvGraphicFramePr>
+              <a:graphicFrameLocks xmlns:a="http://schemas.openxmlformats.org/drawingml/2006/main" noChangeAspect="1"/>
+            </wp:cNvGraphicFramePr>
+            <a:graphic xmlns:a="http://schemas.openxmlformats.org/drawingml/2006/main">
+              <a:graphicData uri="http://schemas.openxmlformats.org/drawingml/2006/picture">
+                <pic:pic xmlns:pic="http://schemas.openxmlformats.org/drawingml/2006/picture">
+                  <pic:nvPicPr>
+                    <pic:cNvPr id="1927074844" name=""/>
+                    <pic:cNvPicPr/>
+                  </pic:nvPicPr>
+                  <pic:blipFill>
+                    <a:blip r:embed="rId41"/>
+                    <a:stretch>
+                      <a:fillRect/>
+                    </a:stretch>
+                  </pic:blipFill>
+                  <pic:spPr>
+                    <a:xfrm>
+                      <a:off x="0" y="0"/>
+                      <a:ext cx="6645910" cy="2078990"/>
+                    </a:xfrm>
+                    <a:prstGeom prst="rect">
+                      <a:avLst/>
+                    </a:prstGeom>
+                  </pic:spPr>
+                </pic:pic>
+              </a:graphicData>
+            </a:graphic>
+          </wp:inline>
+        </w:drawing>
+      </w:r>
+    </w:p>
+    <w:p>
+      <w:pPr>
+        <w:jc w:val="center"/>
+        <w:rPr>
+          <w:sz w:val="36"/>
+          <w:szCs w:val="36"/>
+        </w:rPr>
+      </w:pPr>
+      <w:r>
+        <w:rPr>
+          <w:sz w:val="36"/>
+          <w:szCs w:val="36"/>
+        </w:rPr>
+        <w:t xml:space="preserve">Legenda: </w:t>
+      </w:r>
+      <w:r>
+        <w:rPr>
+          <w:sz w:val="36"/>
+          <w:szCs w:val="36"/>
+        </w:rPr>
+        <w:t>Relatórios de venda por período, com botão para exportação em pdf/excel e visualização em gráfico/tabela</w:t>
+      </w:r>
+      <w:r>
+        <w:rPr>
+          <w:sz w:val="36"/>
+          <w:szCs w:val="36"/>
+        </w:rPr>
+        <w:t>.</w:t>
+      </w:r>
+    </w:p>
+    <w:p>
+      <w:pPr>
+        <w:jc w:val="center"/>
+        <w:rPr>
+          <w:sz w:val="36"/>
+          <w:szCs w:val="36"/>
+        </w:rPr>
+      </w:pPr>
+      <w:r>
+        <w:rPr>
+          <w:sz w:val="36"/>
+          <w:szCs w:val="36"/>
+        </w:rPr>
+        <w:lastRenderedPageBreak/>
+        <w:drawing>
+          <wp:inline distT="0" distB="0" distL="0" distR="0" wp14:anchorId="07BCC782" wp14:editId="1A99BA91">
+            <wp:extent cx="6645910" cy="3471545"/>
+            <wp:effectExtent l="0" t="0" r="2540" b="0"/>
+            <wp:docPr id="1617711044" name="Imagem 1"/>
+            <wp:cNvGraphicFramePr>
+              <a:graphicFrameLocks xmlns:a="http://schemas.openxmlformats.org/drawingml/2006/main" noChangeAspect="1"/>
+            </wp:cNvGraphicFramePr>
+            <a:graphic xmlns:a="http://schemas.openxmlformats.org/drawingml/2006/main">
+              <a:graphicData uri="http://schemas.openxmlformats.org/drawingml/2006/picture">
+                <pic:pic xmlns:pic="http://schemas.openxmlformats.org/drawingml/2006/picture">
+                  <pic:nvPicPr>
+                    <pic:cNvPr id="1617711044" name=""/>
+                    <pic:cNvPicPr/>
+                  </pic:nvPicPr>
+                  <pic:blipFill>
+                    <a:blip r:embed="rId42"/>
+                    <a:stretch>
+                      <a:fillRect/>
+                    </a:stretch>
+                  </pic:blipFill>
+                  <pic:spPr>
+                    <a:xfrm>
+                      <a:off x="0" y="0"/>
+                      <a:ext cx="6645910" cy="3471545"/>
+                    </a:xfrm>
+                    <a:prstGeom prst="rect">
+                      <a:avLst/>
+                    </a:prstGeom>
+                  </pic:spPr>
+                </pic:pic>
+              </a:graphicData>
+            </a:graphic>
+          </wp:inline>
+        </w:drawing>
+      </w:r>
+    </w:p>
+    <w:p>
+      <w:pPr>
+        <w:jc w:val="center"/>
+        <w:rPr>
+          <w:sz w:val="36"/>
+          <w:szCs w:val="36"/>
+        </w:rPr>
+      </w:pPr>
+      <w:r>
+        <w:rPr>
+          <w:sz w:val="36"/>
+          <w:szCs w:val="36"/>
+        </w:rPr>
+        <w:t xml:space="preserve">Legenda: </w:t>
+      </w:r>
+      <w:r>
+        <w:rPr>
+          <w:sz w:val="36"/>
+          <w:szCs w:val="36"/>
+        </w:rPr>
+        <w:t>Relatório de lucro por produto</w:t>
+      </w:r>
+      <w:r>
+        <w:rPr>
+          <w:sz w:val="36"/>
+          <w:szCs w:val="36"/>
+        </w:rPr>
+        <w:t>.</w:t>
+      </w:r>
+    </w:p>
+    <w:p>
+      <w:pPr>
+        <w:jc w:val="center"/>
+        <w:rPr>
+          <w:sz w:val="36"/>
+          <w:szCs w:val="36"/>
+        </w:rPr>
+      </w:pPr>
+      <w:r>
+        <w:rPr>
+          <w:sz w:val="36"/>
+          <w:szCs w:val="36"/>
+        </w:rPr>
+        <w:drawing>
+          <wp:inline distT="0" distB="0" distL="0" distR="0" wp14:anchorId="6A5A43D4" wp14:editId="5790E2ED">
+            <wp:extent cx="6645910" cy="2440940"/>
+            <wp:effectExtent l="0" t="0" r="2540" b="0"/>
+            <wp:docPr id="148712530" name="Imagem 1"/>
+            <wp:cNvGraphicFramePr>
+              <a:graphicFrameLocks xmlns:a="http://schemas.openxmlformats.org/drawingml/2006/main" noChangeAspect="1"/>
+            </wp:cNvGraphicFramePr>
+            <a:graphic xmlns:a="http://schemas.openxmlformats.org/drawingml/2006/main">
+              <a:graphicData uri="http://schemas.openxmlformats.org/drawingml/2006/picture">
+                <pic:pic xmlns:pic="http://schemas.openxmlformats.org/drawingml/2006/picture">
+                  <pic:nvPicPr>
+                    <pic:cNvPr id="148712530" name=""/>
+                    <pic:cNvPicPr/>
+                  </pic:nvPicPr>
+                  <pic:blipFill>
+                    <a:blip r:embed="rId43"/>
+                    <a:stretch>
+                      <a:fillRect/>
+                    </a:stretch>
+                  </pic:blipFill>
+                  <pic:spPr>
+                    <a:xfrm>
+                      <a:off x="0" y="0"/>
+                      <a:ext cx="6645910" cy="2440940"/>
+                    </a:xfrm>
+                    <a:prstGeom prst="rect">
+                      <a:avLst/>
+                    </a:prstGeom>
+                  </pic:spPr>
+                </pic:pic>
+              </a:graphicData>
+            </a:graphic>
+          </wp:inline>
+        </w:drawing>
+      </w:r>
+    </w:p>
+    <w:p>
+      <w:pPr>
+        <w:jc w:val="center"/>
+        <w:rPr>
+          <w:sz w:val="36"/>
+          <w:szCs w:val="36"/>
+        </w:rPr>
+      </w:pPr>
+      <w:r>
+        <w:rPr>
+          <w:sz w:val="36"/>
+          <w:szCs w:val="36"/>
+        </w:rPr>
+        <w:t xml:space="preserve">Legenda: </w:t>
+      </w:r>
+      <w:r>
+        <w:rPr>
+          <w:sz w:val="36"/>
+          <w:szCs w:val="36"/>
+        </w:rPr>
+        <w:t>Relatório d</w:t>
+      </w:r>
+      <w:r>
+        <w:rPr>
+          <w:sz w:val="36"/>
+          <w:szCs w:val="36"/>
+        </w:rPr>
+        <w:t>e produtos mais vendidos</w:t>
+      </w:r>
+      <w:r>
+        <w:rPr>
+          <w:sz w:val="36"/>
+          <w:szCs w:val="36"/>
+        </w:rPr>
+        <w:t>.</w:t>
+      </w:r>
+    </w:p>
+    <w:p>
+      <w:pPr>
+        <w:jc w:val="center"/>
+        <w:rPr>
+          <w:sz w:val="36"/>
+          <w:szCs w:val="36"/>
+        </w:rPr>
+      </w:pPr>
+      <w:r>
+        <w:rPr>
+          <w:sz w:val="36"/>
+          <w:szCs w:val="36"/>
+        </w:rPr>
+        <w:drawing>
+          <wp:inline distT="0" distB="0" distL="0" distR="0" wp14:anchorId="6517D4E0" wp14:editId="07348164">
+            <wp:extent cx="6645910" cy="1703705"/>
+            <wp:effectExtent l="0" t="0" r="2540" b="0"/>
+            <wp:docPr id="93859017" name="Imagem 1"/>
+            <wp:cNvGraphicFramePr>
+              <a:graphicFrameLocks xmlns:a="http://schemas.openxmlformats.org/drawingml/2006/main" noChangeAspect="1"/>
+            </wp:cNvGraphicFramePr>
+            <a:graphic xmlns:a="http://schemas.openxmlformats.org/drawingml/2006/main">
+              <a:graphicData uri="http://schemas.openxmlformats.org/drawingml/2006/picture">
+                <pic:pic xmlns:pic="http://schemas.openxmlformats.org/drawingml/2006/picture">
+                  <pic:nvPicPr>
+                    <pic:cNvPr id="93859017" name=""/>
+                    <pic:cNvPicPr/>
+                  </pic:nvPicPr>
+                  <pic:blipFill>
+                    <a:blip r:embed="rId44"/>
+                    <a:stretch>
+                      <a:fillRect/>
+                    </a:stretch>
+                  </pic:blipFill>
+                  <pic:spPr>
+                    <a:xfrm>
+                      <a:off x="0" y="0"/>
+                      <a:ext cx="6645910" cy="1703705"/>
+                    </a:xfrm>
+                    <a:prstGeom prst="rect">
+                      <a:avLst/>
+                    </a:prstGeom>
+                  </pic:spPr>
+                </pic:pic>
+              </a:graphicData>
+            </a:graphic>
+          </wp:inline>
+        </w:drawing>
+      </w:r>
+    </w:p>
+    <w:p>
+      <w:pPr>
+        <w:jc w:val="center"/>
+        <w:rPr>
+          <w:sz w:val="36"/>
+          <w:szCs w:val="36"/>
+        </w:rPr>
+      </w:pPr>
+      <w:r>
+        <w:rPr>
+          <w:sz w:val="36"/>
+          <w:szCs w:val="36"/>
+        </w:rPr>
+        <w:t xml:space="preserve">Legenda: </w:t>
+      </w:r>
+      <w:r>
+        <w:rPr>
+          <w:sz w:val="36"/>
+          <w:szCs w:val="36"/>
+        </w:rPr>
+        <w:t xml:space="preserve">Relatório de </w:t>
+      </w:r>
+      <w:r>
+        <w:rPr>
+          <w:sz w:val="36"/>
+          <w:szCs w:val="36"/>
+        </w:rPr>
+        <w:t>vendas por cliente</w:t>
+      </w:r>
+      <w:r>
+        <w:rPr>
+          <w:sz w:val="36"/>
+          <w:szCs w:val="36"/>
+        </w:rPr>
+        <w:t>.</w:t>
+      </w:r>
+    </w:p>
+    <w:p>
+      <w:pPr>
+        <w:jc w:val="center"/>
+        <w:rPr>
+          <w:sz w:val="36"/>
+          <w:szCs w:val="36"/>
+        </w:rPr>
+      </w:pPr>
+      <w:r>
+        <w:rPr>
+          <w:sz w:val="36"/>
+          <w:szCs w:val="36"/>
+        </w:rPr>
+        <w:lastRenderedPageBreak/>
+        <w:drawing>
+          <wp:inline distT="0" distB="0" distL="0" distR="0" wp14:anchorId="2D312918" wp14:editId="7790D90E">
+            <wp:extent cx="6645910" cy="2726690"/>
+            <wp:effectExtent l="0" t="0" r="2540" b="0"/>
+            <wp:docPr id="1191275899" name="Imagem 1"/>
+            <wp:cNvGraphicFramePr>
+              <a:graphicFrameLocks xmlns:a="http://schemas.openxmlformats.org/drawingml/2006/main" noChangeAspect="1"/>
+            </wp:cNvGraphicFramePr>
+            <a:graphic xmlns:a="http://schemas.openxmlformats.org/drawingml/2006/main">
+              <a:graphicData uri="http://schemas.openxmlformats.org/drawingml/2006/picture">
+                <pic:pic xmlns:pic="http://schemas.openxmlformats.org/drawingml/2006/picture">
+                  <pic:nvPicPr>
+                    <pic:cNvPr id="1191275899" name=""/>
+                    <pic:cNvPicPr/>
+                  </pic:nvPicPr>
+                  <pic:blipFill>
+                    <a:blip r:embed="rId45"/>
+                    <a:stretch>
+                      <a:fillRect/>
+                    </a:stretch>
+                  </pic:blipFill>
+                  <pic:spPr>
+                    <a:xfrm>
+                      <a:off x="0" y="0"/>
+                      <a:ext cx="6645910" cy="2726690"/>
+                    </a:xfrm>
+                    <a:prstGeom prst="rect">
+                      <a:avLst/>
+                    </a:prstGeom>
+                  </pic:spPr>
+                </pic:pic>
+              </a:graphicData>
+            </a:graphic>
+          </wp:inline>
+        </w:drawing>
+      </w:r>
+    </w:p>
+    <w:p>
+      <w:pPr>
+        <w:jc w:val="center"/>
+        <w:rPr>
+          <w:sz w:val="36"/>
+          <w:szCs w:val="36"/>
+        </w:rPr>
+      </w:pPr>
+      <w:r>
+        <w:rPr>
+          <w:sz w:val="36"/>
+          <w:szCs w:val="36"/>
+        </w:rPr>
+        <w:t xml:space="preserve">Legenda: </w:t>
+      </w:r>
+      <w:r>
+        <w:rPr>
+          <w:sz w:val="36"/>
+          <w:szCs w:val="36"/>
+        </w:rPr>
+        <w:t xml:space="preserve">Relatório </w:t>
+      </w:r>
+      <w:r>
+        <w:rPr>
+          <w:sz w:val="36"/>
+          <w:szCs w:val="36"/>
+        </w:rPr>
+        <w:t>de clientes aniversariantes</w:t>
+      </w:r>
+      <w:r>
+        <w:rPr>
+          <w:sz w:val="36"/>
+          <w:szCs w:val="36"/>
+        </w:rPr>
+        <w:t>.</w:t>
+      </w:r>
+    </w:p>
+    <w:p>
+      <w:pPr>
+        <w:jc w:val="center"/>
+        <w:rPr>
+          <w:sz w:val="36"/>
+          <w:szCs w:val="36"/>
+        </w:rPr>
+      </w:pPr>
+      <w:r>
+        <w:rPr>
+          <w:sz w:val="36"/>
+          <w:szCs w:val="36"/>
+        </w:rPr>
+        <w:drawing>
+          <wp:inline distT="0" distB="0" distL="0" distR="0" wp14:anchorId="49F1AC57" wp14:editId="25DE9668">
+            <wp:extent cx="6645910" cy="2834005"/>
+            <wp:effectExtent l="0" t="0" r="2540" b="4445"/>
+            <wp:docPr id="438601909" name="Imagem 1"/>
+            <wp:cNvGraphicFramePr>
+              <a:graphicFrameLocks xmlns:a="http://schemas.openxmlformats.org/drawingml/2006/main" noChangeAspect="1"/>
+            </wp:cNvGraphicFramePr>
+            <a:graphic xmlns:a="http://schemas.openxmlformats.org/drawingml/2006/main">
+              <a:graphicData uri="http://schemas.openxmlformats.org/drawingml/2006/picture">
+                <pic:pic xmlns:pic="http://schemas.openxmlformats.org/drawingml/2006/picture">
+                  <pic:nvPicPr>
+                    <pic:cNvPr id="438601909" name=""/>
+                    <pic:cNvPicPr/>
+                  </pic:nvPicPr>
+                  <pic:blipFill>
+                    <a:blip r:embed="rId46"/>
+                    <a:stretch>
+                      <a:fillRect/>
+                    </a:stretch>
+                  </pic:blipFill>
+                  <pic:spPr>
+                    <a:xfrm>
+                      <a:off x="0" y="0"/>
+                      <a:ext cx="6645910" cy="2834005"/>
+                    </a:xfrm>
+                    <a:prstGeom prst="rect">
+                      <a:avLst/>
+                    </a:prstGeom>
+                  </pic:spPr>
+                </pic:pic>
+              </a:graphicData>
+            </a:graphic>
+          </wp:inline>
+        </w:drawing>
+      </w:r>
+    </w:p>
+    <w:p>
+      <w:pPr>
+        <w:jc w:val="center"/>
+        <w:rPr>
+          <w:sz w:val="36"/>
+          <w:szCs w:val="36"/>
+        </w:rPr>
+      </w:pPr>
+      <w:r>
+        <w:rPr>
+          <w:sz w:val="36"/>
+          <w:szCs w:val="36"/>
+        </w:rPr>
+        <w:t xml:space="preserve">Legenda: </w:t>
+      </w:r>
+      <w:r>
+        <w:rPr>
+          <w:sz w:val="36"/>
+          <w:szCs w:val="36"/>
+        </w:rPr>
+        <w:t>Visão do módulo de cadastros</w:t>
+      </w:r>
+      <w:r>
+        <w:rPr>
+          <w:sz w:val="36"/>
+          <w:szCs w:val="36"/>
+        </w:rPr>
+        <w:t>.</w:t>
+      </w:r>
+    </w:p>
+    <w:p>
+      <w:pPr>
+        <w:spacing w:after="0"/>
+        <w:jc w:val="center"/>
+        <w:rPr>
+          <w:sz w:val="36"/>
+          <w:szCs w:val="36"/>
+        </w:rPr>
+      </w:pPr>
+      <w:r>
+        <w:rPr>
+          <w:sz w:val="36"/>
+          <w:szCs w:val="36"/>
+        </w:rPr>
+        <w:drawing>
+          <wp:inline distT="0" distB="0" distL="0" distR="0" wp14:anchorId="16701354" wp14:editId="221136EC">
+            <wp:extent cx="6645910" cy="2183130"/>
+            <wp:effectExtent l="0" t="0" r="2540" b="7620"/>
+            <wp:docPr id="1054723628" name="Imagem 1"/>
+            <wp:cNvGraphicFramePr>
+              <a:graphicFrameLocks xmlns:a="http://schemas.openxmlformats.org/drawingml/2006/main" noChangeAspect="1"/>
+            </wp:cNvGraphicFramePr>
+            <a:graphic xmlns:a="http://schemas.openxmlformats.org/drawingml/2006/main">
+              <a:graphicData uri="http://schemas.openxmlformats.org/drawingml/2006/picture">
+                <pic:pic xmlns:pic="http://schemas.openxmlformats.org/drawingml/2006/picture">
+                  <pic:nvPicPr>
+                    <pic:cNvPr id="1054723628" name=""/>
+                    <pic:cNvPicPr/>
+                  </pic:nvPicPr>
+                  <pic:blipFill rotWithShape="1">
+                    <a:blip r:embed="rId47"/>
+                    <a:srcRect t="4580"/>
+                    <a:stretch>
+                      <a:fillRect/>
+                    </a:stretch>
+                  </pic:blipFill>
+                  <pic:spPr bwMode="auto">
+                    <a:xfrm>
+                      <a:off x="0" y="0"/>
+                      <a:ext cx="6645910" cy="2183130"/>
+                    </a:xfrm>
+                    <a:prstGeom prst="rect">
+                      <a:avLst/>
+                    </a:prstGeom>
+                    <a:ln>
+                      <a:noFill/>
+                    </a:ln>
+                    <a:extLst>
+                      <a:ext uri="{53640926-AAD7-44D8-BBD7-CCE9431645EC}">
+                        <a14:shadowObscured xmlns:a14="http://schemas.microsoft.com/office/drawing/2010/main"/>
+                      </a:ext>
+                    </a:extLst>
+                  </pic:spPr>
+                </pic:pic>
+              </a:graphicData>
+            </a:graphic>
+          </wp:inline>
+        </w:drawing>
+      </w:r>
+    </w:p>
+    <w:p>
+      <w:pPr>
+        <w:jc w:val="center"/>
+        <w:rPr>
+          <w:sz w:val="36"/>
+          <w:szCs w:val="36"/>
+        </w:rPr>
+      </w:pPr>
+      <w:r>
+        <w:rPr>
+          <w:sz w:val="36"/>
+          <w:szCs w:val="36"/>
+        </w:rPr>
+        <w:t xml:space="preserve">Legenda: </w:t>
+      </w:r>
+      <w:r>
+        <w:rPr>
+          <w:sz w:val="36"/>
+          <w:szCs w:val="36"/>
+        </w:rPr>
+        <w:t>Visão do cadastro</w:t>
+      </w:r>
+      <w:r>
+        <w:rPr>
+          <w:sz w:val="36"/>
+          <w:szCs w:val="36"/>
+        </w:rPr>
+        <w:t xml:space="preserve"> de clientes</w:t>
+      </w:r>
+      <w:r>
+        <w:rPr>
+          <w:sz w:val="36"/>
+          <w:szCs w:val="36"/>
+        </w:rPr>
+        <w:t>.</w:t>
+      </w:r>
+    </w:p>
+    <w:p>
+      <w:pPr>
+        <w:jc w:val="center"/>
+        <w:rPr>
+          <w:sz w:val="36"/>
+          <w:szCs w:val="36"/>
+        </w:rPr>
+      </w:pPr>
+      <w:r>
+        <w:rPr>
+          <w:sz w:val="36"/>
+          <w:szCs w:val="36"/>
+        </w:rPr>
+        <w:lastRenderedPageBreak/>
+        <w:drawing>
+          <wp:inline distT="0" distB="0" distL="0" distR="0" wp14:anchorId="6EDBA288" wp14:editId="42090116">
+            <wp:extent cx="6645910" cy="1838325"/>
+            <wp:effectExtent l="0" t="0" r="2540" b="9525"/>
+            <wp:docPr id="1066277872" name="Imagem 1"/>
+            <wp:cNvGraphicFramePr>
+              <a:graphicFrameLocks xmlns:a="http://schemas.openxmlformats.org/drawingml/2006/main" noChangeAspect="1"/>
+            </wp:cNvGraphicFramePr>
+            <a:graphic xmlns:a="http://schemas.openxmlformats.org/drawingml/2006/main">
+              <a:graphicData uri="http://schemas.openxmlformats.org/drawingml/2006/picture">
+                <pic:pic xmlns:pic="http://schemas.openxmlformats.org/drawingml/2006/picture">
+                  <pic:nvPicPr>
+                    <pic:cNvPr id="1066277872" name=""/>
+                    <pic:cNvPicPr/>
+                  </pic:nvPicPr>
+                  <pic:blipFill rotWithShape="1">
+                    <a:blip r:embed="rId48"/>
+                    <a:srcRect t="7559" b="6612"/>
+                    <a:stretch>
+                      <a:fillRect/>
+                    </a:stretch>
+                  </pic:blipFill>
+                  <pic:spPr bwMode="auto">
+                    <a:xfrm>
+                      <a:off x="0" y="0"/>
+                      <a:ext cx="6645910" cy="1838325"/>
+                    </a:xfrm>
+                    <a:prstGeom prst="rect">
+                      <a:avLst/>
+                    </a:prstGeom>
+                    <a:ln>
+                      <a:noFill/>
+                    </a:ln>
+                    <a:extLst>
+                      <a:ext uri="{53640926-AAD7-44D8-BBD7-CCE9431645EC}">
+                        <a14:shadowObscured xmlns:a14="http://schemas.microsoft.com/office/drawing/2010/main"/>
+                      </a:ext>
+                    </a:extLst>
+                  </pic:spPr>
+                </pic:pic>
+              </a:graphicData>
+            </a:graphic>
+          </wp:inline>
+        </w:drawing>
+      </w:r>
+    </w:p>
+    <w:p>
+      <w:pPr>
+        <w:jc w:val="center"/>
+        <w:rPr>
+          <w:sz w:val="36"/>
+          <w:szCs w:val="36"/>
+        </w:rPr>
+      </w:pPr>
+      <w:r>
+        <w:rPr>
+          <w:sz w:val="36"/>
+          <w:szCs w:val="36"/>
+        </w:rPr>
+        <w:t xml:space="preserve">Legenda: </w:t>
+      </w:r>
+      <w:r>
+        <w:rPr>
+          <w:sz w:val="36"/>
+          <w:szCs w:val="36"/>
+        </w:rPr>
+        <w:t xml:space="preserve">Visão do cadastro de </w:t>
+      </w:r>
+      <w:r>
+        <w:rPr>
+          <w:sz w:val="36"/>
+          <w:szCs w:val="36"/>
+        </w:rPr>
+        <w:t>fornecedores</w:t>
+      </w:r>
+      <w:r>
+        <w:rPr>
+          <w:sz w:val="36"/>
+          <w:szCs w:val="36"/>
+        </w:rPr>
+        <w:t>.</w:t>
+      </w:r>
+    </w:p>
+    <w:p>
+      <w:pPr>
+        <w:jc w:val="center"/>
+        <w:rPr>
+          <w:sz w:val="36"/>
+          <w:szCs w:val="36"/>
+        </w:rPr>
+      </w:pPr>
+      <w:r>
+        <w:rPr>
+          <w:sz w:val="36"/>
+          <w:szCs w:val="36"/>
+        </w:rPr>
+        <w:drawing>
+          <wp:inline distT="0" distB="0" distL="0" distR="0" wp14:anchorId="4F816595" wp14:editId="1832EE9F">
+            <wp:extent cx="6645910" cy="1470025"/>
+            <wp:effectExtent l="0" t="0" r="2540" b="0"/>
+            <wp:docPr id="1311442771" name="Imagem 1"/>
+            <wp:cNvGraphicFramePr>
+              <a:graphicFrameLocks xmlns:a="http://schemas.openxmlformats.org/drawingml/2006/main" noChangeAspect="1"/>
+            </wp:cNvGraphicFramePr>
+            <a:graphic xmlns:a="http://schemas.openxmlformats.org/drawingml/2006/main">
+              <a:graphicData uri="http://schemas.openxmlformats.org/drawingml/2006/picture">
+                <pic:pic xmlns:pic="http://schemas.openxmlformats.org/drawingml/2006/picture">
+                  <pic:nvPicPr>
+                    <pic:cNvPr id="1311442771" name=""/>
+                    <pic:cNvPicPr/>
+                  </pic:nvPicPr>
+                  <pic:blipFill>
+                    <a:blip r:embed="rId49"/>
+                    <a:stretch>
+                      <a:fillRect/>
+                    </a:stretch>
+                  </pic:blipFill>
+                  <pic:spPr>
+                    <a:xfrm>
+                      <a:off x="0" y="0"/>
+                      <a:ext cx="6645910" cy="1470025"/>
+                    </a:xfrm>
+                    <a:prstGeom prst="rect">
+                      <a:avLst/>
+                    </a:prstGeom>
+                  </pic:spPr>
+                </pic:pic>
+              </a:graphicData>
+            </a:graphic>
+          </wp:inline>
+        </w:drawing>
+      </w:r>
+    </w:p>
+    <w:p>
+      <w:pPr>
+        <w:jc w:val="center"/>
+        <w:rPr>
+          <w:sz w:val="36"/>
+          <w:szCs w:val="36"/>
+        </w:rPr>
+      </w:pPr>
+      <w:r>
+        <w:rPr>
+          <w:sz w:val="36"/>
+          <w:szCs w:val="36"/>
+        </w:rPr>
+        <w:t xml:space="preserve">Legenda: </w:t>
+      </w:r>
+      <w:r>
+        <w:rPr>
+          <w:sz w:val="36"/>
+          <w:szCs w:val="36"/>
+        </w:rPr>
+        <w:t xml:space="preserve">Visão do cadastro de </w:t>
+      </w:r>
+      <w:r>
+        <w:rPr>
+          <w:sz w:val="36"/>
+          <w:szCs w:val="36"/>
+        </w:rPr>
+        <w:t>produtos</w:t>
+      </w:r>
+      <w:r>
+        <w:rPr>
+          <w:sz w:val="36"/>
+          <w:szCs w:val="36"/>
+        </w:rPr>
+        <w:t>.</w:t>
+      </w:r>
+    </w:p>
+    <w:p>
+      <w:pPr>
+        <w:jc w:val="center"/>
+        <w:rPr>
+          <w:sz w:val="36"/>
+          <w:szCs w:val="36"/>
+        </w:rPr>
+      </w:pPr>
+      <w:r>
+        <w:rPr>
+          <w:sz w:val="36"/>
+          <w:szCs w:val="36"/>
+        </w:rPr>
+        <w:drawing>
+          <wp:inline distT="0" distB="0" distL="0" distR="0" wp14:anchorId="1B2EFDFF" wp14:editId="0FE6946F">
+            <wp:extent cx="6645910" cy="1606550"/>
+            <wp:effectExtent l="0" t="0" r="2540" b="0"/>
+            <wp:docPr id="1701466478" name="Imagem 1"/>
+            <wp:cNvGraphicFramePr>
+              <a:graphicFrameLocks xmlns:a="http://schemas.openxmlformats.org/drawingml/2006/main" noChangeAspect="1"/>
+            </wp:cNvGraphicFramePr>
+            <a:graphic xmlns:a="http://schemas.openxmlformats.org/drawingml/2006/main">
+              <a:graphicData uri="http://schemas.openxmlformats.org/drawingml/2006/picture">
+                <pic:pic xmlns:pic="http://schemas.openxmlformats.org/drawingml/2006/picture">
+                  <pic:nvPicPr>
+                    <pic:cNvPr id="1701466478" name=""/>
+                    <pic:cNvPicPr/>
+                  </pic:nvPicPr>
+                  <pic:blipFill rotWithShape="1">
+                    <a:blip r:embed="rId50"/>
+                    <a:srcRect t="7664"/>
+                    <a:stretch>
+                      <a:fillRect/>
+                    </a:stretch>
+                  </pic:blipFill>
+                  <pic:spPr bwMode="auto">
+                    <a:xfrm>
+                      <a:off x="0" y="0"/>
+                      <a:ext cx="6645910" cy="1606550"/>
+                    </a:xfrm>
+                    <a:prstGeom prst="rect">
+                      <a:avLst/>
+                    </a:prstGeom>
+                    <a:ln>
+                      <a:noFill/>
+                    </a:ln>
+                    <a:extLst>
+                      <a:ext uri="{53640926-AAD7-44D8-BBD7-CCE9431645EC}">
+                        <a14:shadowObscured xmlns:a14="http://schemas.microsoft.com/office/drawing/2010/main"/>
+                      </a:ext>
+                    </a:extLst>
+                  </pic:spPr>
+                </pic:pic>
+              </a:graphicData>
+            </a:graphic>
+          </wp:inline>
+        </w:drawing>
+      </w:r>
+    </w:p>
+    <w:p>
+      <w:pPr>
+        <w:jc w:val="center"/>
+        <w:rPr>
+          <w:sz w:val="36"/>
+          <w:szCs w:val="36"/>
+        </w:rPr>
+      </w:pPr>
+      <w:r>
+        <w:rPr>
+          <w:sz w:val="36"/>
+          <w:szCs w:val="36"/>
+        </w:rPr>
+        <w:t xml:space="preserve">Legenda: </w:t>
+      </w:r>
+      <w:r>
+        <w:rPr>
+          <w:sz w:val="36"/>
+          <w:szCs w:val="36"/>
+        </w:rPr>
+        <w:t xml:space="preserve">Visão do cadastro de </w:t>
+      </w:r>
+      <w:r>
+        <w:rPr>
+          <w:sz w:val="36"/>
+          <w:szCs w:val="36"/>
+        </w:rPr>
+        <w:t>funcionários</w:t>
+      </w:r>
+      <w:r>
+        <w:rPr>
+          <w:sz w:val="36"/>
+          <w:szCs w:val="36"/>
+        </w:rPr>
+        <w:t>.</w:t>
+      </w:r>
+    </w:p>
+    <w:p>
+      <w:pPr>
+        <w:jc w:val="center"/>
+        <w:rPr>
+          <w:sz w:val="36"/>
+          <w:szCs w:val="36"/>
+        </w:rPr>
+      </w:pPr>
+      <w:r>
+        <w:rPr>
+          <w:sz w:val="36"/>
+          <w:szCs w:val="36"/>
+        </w:rPr>
+        <w:drawing>
+          <wp:inline distT="0" distB="0" distL="0" distR="0" wp14:anchorId="46665FFF" wp14:editId="39E7BA82">
+            <wp:extent cx="6645910" cy="2219325"/>
+            <wp:effectExtent l="0" t="0" r="2540" b="9525"/>
+            <wp:docPr id="1636376845" name="Imagem 1"/>
+            <wp:cNvGraphicFramePr>
+              <a:graphicFrameLocks xmlns:a="http://schemas.openxmlformats.org/drawingml/2006/main" noChangeAspect="1"/>
+            </wp:cNvGraphicFramePr>
+            <a:graphic xmlns:a="http://schemas.openxmlformats.org/drawingml/2006/main">
+              <a:graphicData uri="http://schemas.openxmlformats.org/drawingml/2006/picture">
+                <pic:pic xmlns:pic="http://schemas.openxmlformats.org/drawingml/2006/picture">
+                  <pic:nvPicPr>
+                    <pic:cNvPr id="1636376845" name=""/>
+                    <pic:cNvPicPr/>
+                  </pic:nvPicPr>
+                  <pic:blipFill rotWithShape="1">
+                    <a:blip r:embed="rId51"/>
+                    <a:srcRect t="6800"/>
+                    <a:stretch>
+                      <a:fillRect/>
+                    </a:stretch>
+                  </pic:blipFill>
+                  <pic:spPr bwMode="auto">
+                    <a:xfrm>
+                      <a:off x="0" y="0"/>
+                      <a:ext cx="6645910" cy="2219325"/>
+                    </a:xfrm>
+                    <a:prstGeom prst="rect">
+                      <a:avLst/>
+                    </a:prstGeom>
+                    <a:ln>
+                      <a:noFill/>
+                    </a:ln>
+                    <a:extLst>
+                      <a:ext uri="{53640926-AAD7-44D8-BBD7-CCE9431645EC}">
+                        <a14:shadowObscured xmlns:a14="http://schemas.microsoft.com/office/drawing/2010/main"/>
+                      </a:ext>
+                    </a:extLst>
+                  </pic:spPr>
+                </pic:pic>
+              </a:graphicData>
+            </a:graphic>
+          </wp:inline>
+        </w:drawing>
+      </w:r>
+    </w:p>
+    <w:p>
+      <w:pPr>
+        <w:spacing w:after="0"/>
+        <w:jc w:val="center"/>
+        <w:rPr>
+          <w:sz w:val="36"/>
+          <w:szCs w:val="36"/>
+        </w:rPr>
+      </w:pPr>
+      <w:r>
+        <w:rPr>
+          <w:sz w:val="36"/>
+          <w:szCs w:val="36"/>
+        </w:rPr>
+        <w:t xml:space="preserve">Legenda: </w:t>
+      </w:r>
+      <w:r>
+        <w:rPr>
+          <w:sz w:val="36"/>
+          <w:szCs w:val="36"/>
+        </w:rPr>
+        <w:t>Visão do</w:t>
+      </w:r>
+      <w:r>
+        <w:rPr>
+          <w:sz w:val="36"/>
+          <w:szCs w:val="36"/>
+        </w:rPr>
+        <w:t>s</w:t>
+      </w:r>
+      <w:r>
+        <w:rPr>
+          <w:sz w:val="36"/>
+          <w:szCs w:val="36"/>
+        </w:rPr>
+        <w:t xml:space="preserve"> </w:t>
+      </w:r>
+      <w:r>
+        <w:rPr>
+          <w:sz w:val="36"/>
+          <w:szCs w:val="36"/>
+        </w:rPr>
+        <w:t>tipos de produtos</w:t>
+      </w:r>
+      <w:r>
+        <w:rPr>
+          <w:sz w:val="36"/>
+          <w:szCs w:val="36"/>
+        </w:rPr>
+        <w:t>.</w:t>
+      </w:r>
+    </w:p>
+    <w:p>
+      <w:pPr>
+        <w:spacing w:after="0"/>
+        <w:jc w:val="center"/>
+        <w:rPr>
+          <w:sz w:val="36"/>
+          <w:szCs w:val="36"/>
+        </w:rPr>
+      </w:pPr>
+      <w:r>
+        <w:rPr>
+          <w:sz w:val="36"/>
+          <w:szCs w:val="36"/>
+        </w:rPr>
+        <w:lastRenderedPageBreak/>
+        <w:drawing>
+          <wp:inline distT="0" distB="0" distL="0" distR="0" wp14:anchorId="6DACBCF6" wp14:editId="5EB68CEB">
+            <wp:extent cx="6645910" cy="2867660"/>
+            <wp:effectExtent l="0" t="0" r="2540" b="8890"/>
+            <wp:docPr id="2066387250" name="Imagem 1"/>
+            <wp:cNvGraphicFramePr>
+              <a:graphicFrameLocks xmlns:a="http://schemas.openxmlformats.org/drawingml/2006/main" noChangeAspect="1"/>
+            </wp:cNvGraphicFramePr>
+            <a:graphic xmlns:a="http://schemas.openxmlformats.org/drawingml/2006/main">
+              <a:graphicData uri="http://schemas.openxmlformats.org/drawingml/2006/picture">
+                <pic:pic xmlns:pic="http://schemas.openxmlformats.org/drawingml/2006/picture">
+                  <pic:nvPicPr>
+                    <pic:cNvPr id="2066387250" name=""/>
+                    <pic:cNvPicPr/>
+                  </pic:nvPicPr>
+                  <pic:blipFill>
+                    <a:blip r:embed="rId52"/>
+                    <a:stretch>
+                      <a:fillRect/>
+                    </a:stretch>
+                  </pic:blipFill>
+                  <pic:spPr>
+                    <a:xfrm>
+                      <a:off x="0" y="0"/>
+                      <a:ext cx="6645910" cy="2867660"/>
+                    </a:xfrm>
+                    <a:prstGeom prst="rect">
+                      <a:avLst/>
+                    </a:prstGeom>
+                  </pic:spPr>
+                </pic:pic>
+              </a:graphicData>
+            </a:graphic>
+          </wp:inline>
+        </w:drawing>
+      </w:r>
+    </w:p>
+    <w:p>
+      <w:pPr>
+        <w:spacing w:after="0"/>
+        <w:jc w:val="center"/>
+        <w:rPr>
+          <w:sz w:val="36"/>
+          <w:szCs w:val="36"/>
+        </w:rPr>
+      </w:pPr>
+      <w:r>
+        <w:rPr>
+          <w:sz w:val="36"/>
+          <w:szCs w:val="36"/>
+        </w:rPr>
+        <w:t xml:space="preserve">Legenda: </w:t>
+      </w:r>
+      <w:r>
+        <w:rPr>
+          <w:sz w:val="36"/>
+          <w:szCs w:val="36"/>
+        </w:rPr>
+        <w:t xml:space="preserve">Visão </w:t>
+      </w:r>
+      <w:r>
+        <w:rPr>
+          <w:sz w:val="36"/>
+          <w:szCs w:val="36"/>
+        </w:rPr>
+        <w:t>geral das vendas e encomendas</w:t>
+      </w:r>
+      <w:r>
+        <w:rPr>
+          <w:sz w:val="36"/>
+          <w:szCs w:val="36"/>
+        </w:rPr>
+        <w:t>.</w:t>
+      </w:r>
+    </w:p>
+    <w:p>
+      <w:pPr>
+        <w:spacing w:after="0"/>
+        <w:jc w:val="center"/>
+        <w:rPr>
+          <w:sz w:val="36"/>
+          <w:szCs w:val="36"/>
+        </w:rPr>
+      </w:pPr>
+      <w:r>
+        <w:rPr>
+          <w:sz w:val="36"/>
+          <w:szCs w:val="36"/>
+        </w:rPr>
+        <w:drawing>
+          <wp:inline distT="0" distB="0" distL="0" distR="0" wp14:anchorId="191B70B3" wp14:editId="5E5E7C6D">
+            <wp:extent cx="6645910" cy="2213610"/>
+            <wp:effectExtent l="0" t="0" r="2540" b="0"/>
+            <wp:docPr id="817711908" name="Imagem 1"/>
+            <wp:cNvGraphicFramePr>
+              <a:graphicFrameLocks xmlns:a="http://schemas.openxmlformats.org/drawingml/2006/main" noChangeAspect="1"/>
+            </wp:cNvGraphicFramePr>
+            <a:graphic xmlns:a="http://schemas.openxmlformats.org/drawingml/2006/main">
+              <a:graphicData uri="http://schemas.openxmlformats.org/drawingml/2006/picture">
+                <pic:pic xmlns:pic="http://schemas.openxmlformats.org/drawingml/2006/picture">
+                  <pic:nvPicPr>
+                    <pic:cNvPr id="817711908" name=""/>
+                    <pic:cNvPicPr/>
+                  </pic:nvPicPr>
+                  <pic:blipFill>
+                    <a:blip r:embed="rId53"/>
+                    <a:stretch>
+                      <a:fillRect/>
+                    </a:stretch>
+                  </pic:blipFill>
+                  <pic:spPr>
+                    <a:xfrm>
+                      <a:off x="0" y="0"/>
+                      <a:ext cx="6645910" cy="2213610"/>
+                    </a:xfrm>
+                    <a:prstGeom prst="rect">
+                      <a:avLst/>
+                    </a:prstGeom>
+                  </pic:spPr>
+                </pic:pic>
+              </a:graphicData>
+            </a:graphic>
+          </wp:inline>
+        </w:drawing>
+      </w:r>
+    </w:p>
+    <w:p>
+      <w:pPr>
+        <w:spacing w:after="0"/>
+        <w:jc w:val="center"/>
+        <w:rPr>
+          <w:sz w:val="36"/>
+          <w:szCs w:val="36"/>
+        </w:rPr>
+      </w:pPr>
+      <w:r>
+        <w:rPr>
+          <w:sz w:val="36"/>
+          <w:szCs w:val="36"/>
+        </w:rPr>
+        <w:t xml:space="preserve">Legenda: </w:t>
+      </w:r>
+      <w:r>
+        <w:rPr>
+          <w:sz w:val="36"/>
+          <w:szCs w:val="36"/>
+        </w:rPr>
+        <w:t xml:space="preserve">Visão </w:t>
+      </w:r>
+      <w:r>
+        <w:rPr>
+          <w:sz w:val="36"/>
+          <w:szCs w:val="36"/>
+        </w:rPr>
+        <w:t>dos status dos pedidos</w:t>
+      </w:r>
+      <w:r>
+        <w:rPr>
+          <w:sz w:val="36"/>
+          <w:szCs w:val="36"/>
+        </w:rPr>
+        <w:t>.</w:t>
+      </w:r>
+    </w:p>
+    <w:p>
+      <w:pPr>
+        <w:spacing w:after="0"/>
+        <w:jc w:val="center"/>
+        <w:rPr>
+          <w:sz w:val="36"/>
+          <w:szCs w:val="36"/>
+        </w:rPr>
+      </w:pPr>
+      <w:r>
+        <w:rPr>
+          <w:sz w:val="36"/>
+          <w:szCs w:val="36"/>
+        </w:rPr>
+        <w:drawing>
+          <wp:inline distT="0" distB="0" distL="0" distR="0" wp14:anchorId="2BCFE728" wp14:editId="63C547DD">
+            <wp:extent cx="6645910" cy="1870075"/>
+            <wp:effectExtent l="0" t="0" r="2540" b="0"/>
+            <wp:docPr id="674421766" name="Imagem 1"/>
+            <wp:cNvGraphicFramePr>
+              <a:graphicFrameLocks xmlns:a="http://schemas.openxmlformats.org/drawingml/2006/main" noChangeAspect="1"/>
+            </wp:cNvGraphicFramePr>
+            <a:graphic xmlns:a="http://schemas.openxmlformats.org/drawingml/2006/main">
+              <a:graphicData uri="http://schemas.openxmlformats.org/drawingml/2006/picture">
+                <pic:pic xmlns:pic="http://schemas.openxmlformats.org/drawingml/2006/picture">
+                  <pic:nvPicPr>
+                    <pic:cNvPr id="674421766" name=""/>
+                    <pic:cNvPicPr/>
+                  </pic:nvPicPr>
+                  <pic:blipFill>
+                    <a:blip r:embed="rId54"/>
+                    <a:stretch>
+                      <a:fillRect/>
+                    </a:stretch>
+                  </pic:blipFill>
+                  <pic:spPr>
+                    <a:xfrm>
+                      <a:off x="0" y="0"/>
+                      <a:ext cx="6645910" cy="1870075"/>
+                    </a:xfrm>
+                    <a:prstGeom prst="rect">
+                      <a:avLst/>
+                    </a:prstGeom>
+                  </pic:spPr>
+                </pic:pic>
+              </a:graphicData>
+            </a:graphic>
+          </wp:inline>
+        </w:drawing>
+      </w:r>
+    </w:p>
+    <w:p>
+      <w:pPr>
+        <w:spacing w:after="0"/>
+        <w:jc w:val="center"/>
+        <w:rPr>
+          <w:sz w:val="36"/>
+          <w:szCs w:val="36"/>
+        </w:rPr>
+      </w:pPr>
+      <w:r>
+        <w:rPr>
+          <w:sz w:val="36"/>
+          <w:szCs w:val="36"/>
+        </w:rPr>
+        <w:t xml:space="preserve">Legenda: </w:t>
+      </w:r>
+      <w:r>
+        <w:rPr>
+          <w:sz w:val="36"/>
+          <w:szCs w:val="36"/>
+        </w:rPr>
+        <w:t xml:space="preserve">Visão </w:t>
+      </w:r>
+      <w:r>
+        <w:rPr>
+          <w:sz w:val="36"/>
+          <w:szCs w:val="36"/>
+        </w:rPr>
+        <w:t>de pagamentos parciais.</w:t>
+      </w:r>
+    </w:p>
+    <w:p>
+      <w:pPr>
+        <w:spacing w:after="0"/>
+        <w:jc w:val="center"/>
+        <w:rPr>
+          <w:sz w:val="36"/>
+          <w:szCs w:val="36"/>
+        </w:rPr>
+      </w:pPr>
+      <w:r>
+        <w:rPr>
+          <w:sz w:val="36"/>
+          <w:szCs w:val="36"/>
+        </w:rPr>
+        <w:lastRenderedPageBreak/>
+        <w:drawing>
+          <wp:inline distT="0" distB="0" distL="0" distR="0" wp14:anchorId="591AD2E0" wp14:editId="713137A0">
+            <wp:extent cx="6645910" cy="2438400"/>
+            <wp:effectExtent l="0" t="0" r="2540" b="0"/>
+            <wp:docPr id="837134117" name="Imagem 1"/>
+            <wp:cNvGraphicFramePr>
+              <a:graphicFrameLocks xmlns:a="http://schemas.openxmlformats.org/drawingml/2006/main" noChangeAspect="1"/>
+            </wp:cNvGraphicFramePr>
+            <a:graphic xmlns:a="http://schemas.openxmlformats.org/drawingml/2006/main">
+              <a:graphicData uri="http://schemas.openxmlformats.org/drawingml/2006/picture">
+                <pic:pic xmlns:pic="http://schemas.openxmlformats.org/drawingml/2006/picture">
+                  <pic:nvPicPr>
+                    <pic:cNvPr id="837134117" name=""/>
+                    <pic:cNvPicPr/>
+                  </pic:nvPicPr>
+                  <pic:blipFill rotWithShape="1">
+                    <a:blip r:embed="rId55"/>
+                    <a:srcRect b="9284"/>
+                    <a:stretch>
+                      <a:fillRect/>
+                    </a:stretch>
+                  </pic:blipFill>
+                  <pic:spPr bwMode="auto">
+                    <a:xfrm>
+                      <a:off x="0" y="0"/>
+                      <a:ext cx="6645910" cy="2438400"/>
+                    </a:xfrm>
+                    <a:prstGeom prst="rect">
+                      <a:avLst/>
+                    </a:prstGeom>
+                    <a:ln>
+                      <a:noFill/>
+                    </a:ln>
+                    <a:extLst>
+                      <a:ext uri="{53640926-AAD7-44D8-BBD7-CCE9431645EC}">
+                        <a14:shadowObscured xmlns:a14="http://schemas.microsoft.com/office/drawing/2010/main"/>
+                      </a:ext>
+                    </a:extLst>
+                  </pic:spPr>
+                </pic:pic>
+              </a:graphicData>
+            </a:graphic>
+          </wp:inline>
+        </w:drawing>
+      </w:r>
+    </w:p>
+    <w:p>
+      <w:pPr>
+        <w:spacing w:after="0"/>
+        <w:jc w:val="center"/>
+        <w:rPr>
+          <w:sz w:val="36"/>
+          <w:szCs w:val="36"/>
+        </w:rPr>
+      </w:pPr>
+      <w:r>
+        <w:rPr>
+          <w:sz w:val="36"/>
+          <w:szCs w:val="36"/>
+        </w:rPr>
+        <w:t xml:space="preserve">Legenda: </w:t>
+      </w:r>
+      <w:r>
+        <w:rPr>
+          <w:sz w:val="36"/>
+          <w:szCs w:val="36"/>
+        </w:rPr>
+        <w:t xml:space="preserve">Visão </w:t>
+      </w:r>
+      <w:r>
+        <w:rPr>
+          <w:sz w:val="36"/>
+          <w:szCs w:val="36"/>
+        </w:rPr>
+        <w:t>de direcionamento ao portfólio de serviços/produtos</w:t>
+      </w:r>
+      <w:r>
+        <w:rPr>
+          <w:sz w:val="36"/>
+          <w:szCs w:val="36"/>
+        </w:rPr>
+        <w:t>.</w:t>
+      </w:r>
+    </w:p>
+    <w:p>
+      <w:pPr>
+        <w:spacing w:after="0"/>
+        <w:jc w:val="center"/>
+        <w:rPr>
+          <w:sz w:val="36"/>
+          <w:szCs w:val="36"/>
+        </w:rPr>
+      </w:pPr>
+      <w:r>
+        <w:rPr>
+          <w:sz w:val="36"/>
+          <w:szCs w:val="36"/>
+        </w:rPr>
+        <w:drawing>
+          <wp:inline distT="0" distB="0" distL="0" distR="0" wp14:anchorId="58D7D0B7" wp14:editId="2219AB98">
+            <wp:extent cx="6645910" cy="2378710"/>
+            <wp:effectExtent l="0" t="0" r="2540" b="2540"/>
+            <wp:docPr id="1607647512" name="Imagem 1"/>
+            <wp:cNvGraphicFramePr>
+              <a:graphicFrameLocks xmlns:a="http://schemas.openxmlformats.org/drawingml/2006/main" noChangeAspect="1"/>
+            </wp:cNvGraphicFramePr>
+            <a:graphic xmlns:a="http://schemas.openxmlformats.org/drawingml/2006/main">
+              <a:graphicData uri="http://schemas.openxmlformats.org/drawingml/2006/picture">
+                <pic:pic xmlns:pic="http://schemas.openxmlformats.org/drawingml/2006/picture">
+                  <pic:nvPicPr>
+                    <pic:cNvPr id="1607647512" name=""/>
+                    <pic:cNvPicPr/>
+                  </pic:nvPicPr>
+                  <pic:blipFill>
+                    <a:blip r:embed="rId56"/>
+                    <a:stretch>
+                      <a:fillRect/>
+                    </a:stretch>
+                  </pic:blipFill>
+                  <pic:spPr>
+                    <a:xfrm>
+                      <a:off x="0" y="0"/>
+                      <a:ext cx="6645910" cy="2378710"/>
+                    </a:xfrm>
+                    <a:prstGeom prst="rect">
+                      <a:avLst/>
+                    </a:prstGeom>
+                  </pic:spPr>
+                </pic:pic>
+              </a:graphicData>
+            </a:graphic>
+          </wp:inline>
+        </w:drawing>
+      </w:r>
+    </w:p>
+    <w:p>
+      <w:pPr>
+        <w:spacing w:after="0"/>
+        <w:jc w:val="center"/>
+        <w:rPr>
+          <w:sz w:val="36"/>
+          <w:szCs w:val="36"/>
+        </w:rPr>
+      </w:pPr>
+      <w:r>
+        <w:rPr>
+          <w:sz w:val="36"/>
+          <w:szCs w:val="36"/>
+        </w:rPr>
+        <w:t xml:space="preserve">Legenda: </w:t>
+      </w:r>
+      <w:r>
+        <w:rPr>
+          <w:sz w:val="36"/>
+          <w:szCs w:val="36"/>
+        </w:rPr>
+        <w:t xml:space="preserve">Visão geral das </w:t>
+      </w:r>
+      <w:r>
+        <w:rPr>
+          <w:sz w:val="36"/>
+          <w:szCs w:val="36"/>
+        </w:rPr>
+        <w:t>movimentações</w:t>
+      </w:r>
+      <w:r>
+        <w:rPr>
+          <w:sz w:val="36"/>
+          <w:szCs w:val="36"/>
+        </w:rPr>
+        <w:t>.</w:t>
+      </w:r>
+    </w:p>
+    <w:p>
+      <w:pPr>
+        <w:spacing w:after="0"/>
+        <w:jc w:val="center"/>
+        <w:rPr>
+          <w:sz w:val="36"/>
+          <w:szCs w:val="36"/>
+        </w:rPr>
+      </w:pPr>
+      <w:r>
+        <w:rPr>
+          <w:sz w:val="36"/>
+          <w:szCs w:val="36"/>
+        </w:rPr>
+        <w:drawing>
+          <wp:inline distT="0" distB="0" distL="0" distR="0" wp14:anchorId="4BC9C4DC" wp14:editId="0925D8DF">
+            <wp:extent cx="6645910" cy="1762760"/>
+            <wp:effectExtent l="0" t="0" r="2540" b="8890"/>
+            <wp:docPr id="2001880133" name="Imagem 1"/>
+            <wp:cNvGraphicFramePr>
+              <a:graphicFrameLocks xmlns:a="http://schemas.openxmlformats.org/drawingml/2006/main" noChangeAspect="1"/>
+            </wp:cNvGraphicFramePr>
+            <a:graphic xmlns:a="http://schemas.openxmlformats.org/drawingml/2006/main">
+              <a:graphicData uri="http://schemas.openxmlformats.org/drawingml/2006/picture">
+                <pic:pic xmlns:pic="http://schemas.openxmlformats.org/drawingml/2006/picture">
+                  <pic:nvPicPr>
+                    <pic:cNvPr id="2001880133" name=""/>
+                    <pic:cNvPicPr/>
+                  </pic:nvPicPr>
+                  <pic:blipFill>
+                    <a:blip r:embed="rId57"/>
+                    <a:stretch>
+                      <a:fillRect/>
+                    </a:stretch>
+                  </pic:blipFill>
+                  <pic:spPr>
+                    <a:xfrm>
+                      <a:off x="0" y="0"/>
+                      <a:ext cx="6645910" cy="1762760"/>
+                    </a:xfrm>
+                    <a:prstGeom prst="rect">
+                      <a:avLst/>
+                    </a:prstGeom>
+                  </pic:spPr>
+                </pic:pic>
+              </a:graphicData>
+            </a:graphic>
+          </wp:inline>
+        </w:drawing>
+      </w:r>
+    </w:p>
+    <w:p>
+      <w:pPr>
+        <w:spacing w:after="0"/>
+        <w:jc w:val="center"/>
+        <w:rPr>
+          <w:sz w:val="36"/>
+          <w:szCs w:val="36"/>
+        </w:rPr>
+      </w:pPr>
+      <w:r>
+        <w:rPr>
+          <w:sz w:val="36"/>
+          <w:szCs w:val="36"/>
+        </w:rPr>
+        <w:t xml:space="preserve">Legenda: </w:t>
+      </w:r>
+      <w:r>
+        <w:rPr>
+          <w:sz w:val="36"/>
+          <w:szCs w:val="36"/>
+        </w:rPr>
+        <w:t xml:space="preserve">Visão </w:t>
+      </w:r>
+      <w:r>
+        <w:rPr>
+          <w:sz w:val="36"/>
+          <w:szCs w:val="36"/>
+        </w:rPr>
+        <w:t>de cadastro de compras dos insumos para produção</w:t>
+      </w:r>
+      <w:r>
+        <w:rPr>
+          <w:sz w:val="36"/>
+          <w:szCs w:val="36"/>
+        </w:rPr>
+        <w:t>.</w:t>
+      </w:r>
+    </w:p>
+    <w:p>
+      <w:pPr>
+        <w:spacing w:after="0"/>
+        <w:jc w:val="center"/>
+        <w:rPr>
+          <w:sz w:val="36"/>
+          <w:szCs w:val="36"/>
+        </w:rPr>
+      </w:pPr>
+      <w:r>
+        <w:rPr>
+          <w:sz w:val="36"/>
+          <w:szCs w:val="36"/>
+        </w:rPr>
+        <w:lastRenderedPageBreak/>
+        <w:drawing>
+          <wp:inline distT="0" distB="0" distL="0" distR="0" wp14:anchorId="7F2910F6" wp14:editId="222E5277">
+            <wp:extent cx="6645910" cy="1776730"/>
+            <wp:effectExtent l="0" t="0" r="2540" b="0"/>
+            <wp:docPr id="1290662307" name="Imagem 1"/>
+            <wp:cNvGraphicFramePr>
+              <a:graphicFrameLocks xmlns:a="http://schemas.openxmlformats.org/drawingml/2006/main" noChangeAspect="1"/>
+            </wp:cNvGraphicFramePr>
+            <a:graphic xmlns:a="http://schemas.openxmlformats.org/drawingml/2006/main">
+              <a:graphicData uri="http://schemas.openxmlformats.org/drawingml/2006/picture">
+                <pic:pic xmlns:pic="http://schemas.openxmlformats.org/drawingml/2006/picture">
+                  <pic:nvPicPr>
+                    <pic:cNvPr id="1290662307" name=""/>
+                    <pic:cNvPicPr/>
+                  </pic:nvPicPr>
+                  <pic:blipFill>
+                    <a:blip r:embed="rId58"/>
+                    <a:stretch>
+                      <a:fillRect/>
+                    </a:stretch>
+                  </pic:blipFill>
+                  <pic:spPr>
+                    <a:xfrm>
+                      <a:off x="0" y="0"/>
+                      <a:ext cx="6645910" cy="1776730"/>
+                    </a:xfrm>
+                    <a:prstGeom prst="rect">
+                      <a:avLst/>
+                    </a:prstGeom>
+                  </pic:spPr>
+                </pic:pic>
+              </a:graphicData>
+            </a:graphic>
+          </wp:inline>
+        </w:drawing>
+      </w:r>
+    </w:p>
+    <w:p>
+      <w:pPr>
+        <w:spacing w:after="0"/>
+        <w:jc w:val="center"/>
+        <w:rPr>
+          <w:sz w:val="36"/>
+          <w:szCs w:val="36"/>
+        </w:rPr>
+      </w:pPr>
+      <w:r>
+        <w:rPr>
+          <w:sz w:val="36"/>
+          <w:szCs w:val="36"/>
+        </w:rPr>
+        <w:t xml:space="preserve">Legenda: </w:t>
+      </w:r>
+      <w:r>
+        <w:rPr>
+          <w:sz w:val="36"/>
+          <w:szCs w:val="36"/>
+        </w:rPr>
+        <w:t xml:space="preserve">Visão </w:t>
+      </w:r>
+      <w:r>
+        <w:rPr>
+          <w:sz w:val="36"/>
+          <w:szCs w:val="36"/>
+        </w:rPr>
+        <w:t>de cadastro de novas vendas</w:t>
+      </w:r>
+      <w:r>
+        <w:rPr>
+          <w:sz w:val="36"/>
+          <w:szCs w:val="36"/>
+        </w:rPr>
+        <w:t>.</w:t>
+      </w:r>
+    </w:p>
+    <w:p>
+      <w:pPr>
+        <w:spacing w:after="0"/>
+        <w:jc w:val="center"/>
+        <w:rPr>
+          <w:sz w:val="36"/>
+          <w:szCs w:val="36"/>
+        </w:rPr>
+      </w:pPr>
+      <w:r>
+        <w:rPr>
+          <w:sz w:val="36"/>
+          <w:szCs w:val="36"/>
+        </w:rPr>
+        <w:drawing>
+          <wp:inline distT="0" distB="0" distL="0" distR="0" wp14:anchorId="0E864189" wp14:editId="35427578">
+            <wp:extent cx="6645910" cy="1401445"/>
+            <wp:effectExtent l="0" t="0" r="2540" b="8255"/>
+            <wp:docPr id="1356306219" name="Imagem 1"/>
+            <wp:cNvGraphicFramePr>
+              <a:graphicFrameLocks xmlns:a="http://schemas.openxmlformats.org/drawingml/2006/main" noChangeAspect="1"/>
+            </wp:cNvGraphicFramePr>
+            <a:graphic xmlns:a="http://schemas.openxmlformats.org/drawingml/2006/main">
+              <a:graphicData uri="http://schemas.openxmlformats.org/drawingml/2006/picture">
+                <pic:pic xmlns:pic="http://schemas.openxmlformats.org/drawingml/2006/picture">
+                  <pic:nvPicPr>
+                    <pic:cNvPr id="1356306219" name=""/>
+                    <pic:cNvPicPr/>
+                  </pic:nvPicPr>
+                  <pic:blipFill>
+                    <a:blip r:embed="rId59"/>
+                    <a:stretch>
+                      <a:fillRect/>
+                    </a:stretch>
+                  </pic:blipFill>
+                  <pic:spPr>
+                    <a:xfrm>
+                      <a:off x="0" y="0"/>
+                      <a:ext cx="6645910" cy="1401445"/>
+                    </a:xfrm>
+                    <a:prstGeom prst="rect">
+                      <a:avLst/>
+                    </a:prstGeom>
+                  </pic:spPr>
+                </pic:pic>
+              </a:graphicData>
+            </a:graphic>
+          </wp:inline>
+        </w:drawing>
+      </w:r>
+    </w:p>
+    <w:p>
+      <w:pPr>
+        <w:spacing w:after="0"/>
+        <w:jc w:val="center"/>
+        <w:rPr>
+          <w:sz w:val="36"/>
+          <w:szCs w:val="36"/>
+        </w:rPr>
+      </w:pPr>
+      <w:r>
+        <w:rPr>
+          <w:sz w:val="36"/>
+          <w:szCs w:val="36"/>
+        </w:rPr>
+        <w:t xml:space="preserve">Legenda: </w:t>
+      </w:r>
+      <w:r>
+        <w:rPr>
+          <w:sz w:val="36"/>
+          <w:szCs w:val="36"/>
+        </w:rPr>
+        <w:t xml:space="preserve">Visão </w:t>
+      </w:r>
+      <w:r>
+        <w:rPr>
+          <w:sz w:val="36"/>
+          <w:szCs w:val="36"/>
+        </w:rPr>
+        <w:t>das devoluções efetuadas</w:t>
+      </w:r>
+      <w:r>
+        <w:rPr>
+          <w:sz w:val="36"/>
+          <w:szCs w:val="36"/>
+        </w:rPr>
+        <w:t>.</w:t>
+      </w:r>
+    </w:p>
+    <w:p>
+      <w:pPr>
+        <w:spacing w:after="0"/>
+        <w:jc w:val="center"/>
+        <w:rPr>
+          <w:sz w:val="36"/>
+          <w:szCs w:val="36"/>
+        </w:rPr>
+      </w:pPr>
+      <w:r>
+        <w:rPr>
+          <w:sz w:val="36"/>
+          <w:szCs w:val="36"/>
+        </w:rPr>
+        <w:drawing>
+          <wp:inline distT="0" distB="0" distL="0" distR="0" wp14:anchorId="3D69C127" wp14:editId="3205142D">
+            <wp:extent cx="6645910" cy="1367790"/>
+            <wp:effectExtent l="0" t="0" r="2540" b="3810"/>
+            <wp:docPr id="299551747" name="Imagem 1"/>
+            <wp:cNvGraphicFramePr>
+              <a:graphicFrameLocks xmlns:a="http://schemas.openxmlformats.org/drawingml/2006/main" noChangeAspect="1"/>
+            </wp:cNvGraphicFramePr>
+            <a:graphic xmlns:a="http://schemas.openxmlformats.org/drawingml/2006/main">
+              <a:graphicData uri="http://schemas.openxmlformats.org/drawingml/2006/picture">
+                <pic:pic xmlns:pic="http://schemas.openxmlformats.org/drawingml/2006/picture">
+                  <pic:nvPicPr>
+                    <pic:cNvPr id="299551747" name=""/>
+                    <pic:cNvPicPr/>
+                  </pic:nvPicPr>
+                  <pic:blipFill>
+                    <a:blip r:embed="rId60"/>
+                    <a:stretch>
+                      <a:fillRect/>
+                    </a:stretch>
+                  </pic:blipFill>
+                  <pic:spPr>
+                    <a:xfrm>
+                      <a:off x="0" y="0"/>
+                      <a:ext cx="6645910" cy="1367790"/>
+                    </a:xfrm>
+                    <a:prstGeom prst="rect">
+                      <a:avLst/>
+                    </a:prstGeom>
+                  </pic:spPr>
+                </pic:pic>
+              </a:graphicData>
+            </a:graphic>
+          </wp:inline>
+        </w:drawing>
+      </w:r>
+    </w:p>
+    <w:p>
+      <w:pPr>
+        <w:spacing w:after="0"/>
+        <w:jc w:val="center"/>
+        <w:rPr>
+          <w:sz w:val="36"/>
+          <w:szCs w:val="36"/>
+        </w:rPr>
+      </w:pPr>
+      <w:r>
+        <w:rPr>
+          <w:sz w:val="36"/>
+          <w:szCs w:val="36"/>
+        </w:rPr>
+        <w:t xml:space="preserve">Legenda: </w:t>
+      </w:r>
+      <w:r>
+        <w:rPr>
+          <w:sz w:val="36"/>
+          <w:szCs w:val="36"/>
+        </w:rPr>
+        <w:t xml:space="preserve">Visão geral das </w:t>
+      </w:r>
+      <w:r>
+        <w:rPr>
+          <w:sz w:val="36"/>
+          <w:szCs w:val="36"/>
+        </w:rPr>
+        <w:t>configurações</w:t>
+      </w:r>
+      <w:r>
+        <w:rPr>
+          <w:sz w:val="36"/>
+          <w:szCs w:val="36"/>
+        </w:rPr>
+        <w:t>.</w:t>
+      </w:r>
+    </w:p>
+    <w:p>
+      <w:pPr>
+        <w:spacing w:after="0"/>
+        <w:jc w:val="center"/>
+        <w:rPr>
+          <w:sz w:val="36"/>
+          <w:szCs w:val="36"/>
+        </w:rPr>
+      </w:pPr>
+      <w:r>
+        <w:rPr>
+          <w:sz w:val="36"/>
+          <w:szCs w:val="36"/>
+        </w:rPr>
+        <w:lastRenderedPageBreak/>
+        <w:drawing>
+          <wp:inline distT="0" distB="0" distL="0" distR="0" wp14:anchorId="2EC9D00B" wp14:editId="08F2761C">
+            <wp:extent cx="6645910" cy="3150235"/>
+            <wp:effectExtent l="0" t="0" r="2540" b="0"/>
+            <wp:docPr id="1376046819" name="Imagem 1"/>
+            <wp:cNvGraphicFramePr>
+              <a:graphicFrameLocks xmlns:a="http://schemas.openxmlformats.org/drawingml/2006/main" noChangeAspect="1"/>
+            </wp:cNvGraphicFramePr>
+            <a:graphic xmlns:a="http://schemas.openxmlformats.org/drawingml/2006/main">
+              <a:graphicData uri="http://schemas.openxmlformats.org/drawingml/2006/picture">
+                <pic:pic xmlns:pic="http://schemas.openxmlformats.org/drawingml/2006/picture">
+                  <pic:nvPicPr>
+                    <pic:cNvPr id="1376046819" name=""/>
+                    <pic:cNvPicPr/>
+                  </pic:nvPicPr>
+                  <pic:blipFill>
+                    <a:blip r:embed="rId61"/>
+                    <a:stretch>
+                      <a:fillRect/>
+                    </a:stretch>
+                  </pic:blipFill>
+                  <pic:spPr>
+                    <a:xfrm>
+                      <a:off x="0" y="0"/>
+                      <a:ext cx="6645910" cy="3150235"/>
+                    </a:xfrm>
+                    <a:prstGeom prst="rect">
+                      <a:avLst/>
+                    </a:prstGeom>
+                  </pic:spPr>
+                </pic:pic>
+              </a:graphicData>
+            </a:graphic>
+          </wp:inline>
+        </w:drawing>
+      </w:r>
+      <w:r>
+        <w:rPr>
+          <w:sz w:val="36"/>
+          <w:szCs w:val="36"/>
+        </w:rPr>
+        <w:drawing>
+          <wp:inline distT="0" distB="0" distL="0" distR="0" wp14:anchorId="4D46AA1B" wp14:editId="7E5DC1C8">
+            <wp:extent cx="6645910" cy="1561465"/>
+            <wp:effectExtent l="0" t="0" r="2540" b="635"/>
+            <wp:docPr id="405861720" name="Imagem 1"/>
+            <wp:cNvGraphicFramePr>
+              <a:graphicFrameLocks xmlns:a="http://schemas.openxmlformats.org/drawingml/2006/main" noChangeAspect="1"/>
+            </wp:cNvGraphicFramePr>
+            <a:graphic xmlns:a="http://schemas.openxmlformats.org/drawingml/2006/main">
+              <a:graphicData uri="http://schemas.openxmlformats.org/drawingml/2006/picture">
+                <pic:pic xmlns:pic="http://schemas.openxmlformats.org/drawingml/2006/picture">
+                  <pic:nvPicPr>
+                    <pic:cNvPr id="405861720" name=""/>
+                    <pic:cNvPicPr/>
+                  </pic:nvPicPr>
+                  <pic:blipFill rotWithShape="1">
+                    <a:blip r:embed="rId62"/>
+                    <a:srcRect t="39493"/>
+                    <a:stretch>
+                      <a:fillRect/>
+                    </a:stretch>
+                  </pic:blipFill>
+                  <pic:spPr bwMode="auto">
+                    <a:xfrm>
+                      <a:off x="0" y="0"/>
+                      <a:ext cx="6645910" cy="1561465"/>
+                    </a:xfrm>
+                    <a:prstGeom prst="rect">
+                      <a:avLst/>
+                    </a:prstGeom>
+                    <a:ln>
+                      <a:noFill/>
+                    </a:ln>
+                    <a:extLst>
+                      <a:ext uri="{53640926-AAD7-44D8-BBD7-CCE9431645EC}">
+                        <a14:shadowObscured xmlns:a14="http://schemas.microsoft.com/office/drawing/2010/main"/>
+                      </a:ext>
+                    </a:extLst>
+                  </pic:spPr>
+                </pic:pic>
+              </a:graphicData>
+            </a:graphic>
+          </wp:inline>
+        </w:drawing>
+      </w:r>
+    </w:p>
+    <w:p>
+      <w:pPr>
+        <w:spacing w:after="0"/>
+        <w:jc w:val="center"/>
+        <w:rPr>
+          <w:sz w:val="36"/>
+          <w:szCs w:val="36"/>
+        </w:rPr>
+      </w:pPr>
+      <w:r>
+        <w:rPr>
+          <w:sz w:val="36"/>
+          <w:szCs w:val="36"/>
+        </w:rPr>
+        <w:t xml:space="preserve">Legenda: </w:t>
+      </w:r>
+      <w:r>
+        <w:rPr>
+          <w:sz w:val="36"/>
+          <w:szCs w:val="36"/>
+        </w:rPr>
+        <w:t xml:space="preserve">Visão </w:t>
+      </w:r>
+      <w:r>
+        <w:rPr>
+          <w:sz w:val="36"/>
+          <w:szCs w:val="36"/>
+        </w:rPr>
+        <w:t>dos níveis de usuários, com possibilidade de edição/exclusão, caso o usuário solicite</w:t>
+      </w:r>
+      <w:r>
+        <w:rPr>
+          <w:sz w:val="36"/>
+          <w:szCs w:val="36"/>
+        </w:rPr>
+        <w:t>.</w:t>
+      </w:r>
+    </w:p>
+    <w:p>
+      <w:pPr>
+        <w:spacing w:after="0"/>
+        <w:jc w:val="center"/>
+        <w:rPr>
+          <w:sz w:val="36"/>
+          <w:szCs w:val="36"/>
+        </w:rPr>
+      </w:pPr>
+    </w:p>
+    <w:p>
+      <w:pPr>
+        <w:spacing w:after="0"/>
+        <w:jc w:val="center"/>
+        <w:rPr>
+          <w:sz w:val="36"/>
+          <w:szCs w:val="36"/>
+        </w:rPr>
+      </w:pPr>
+      <w:r>
+        <w:rPr>
+          <w:sz w:val="36"/>
+          <w:szCs w:val="36"/>
+        </w:rPr>
+        <w:lastRenderedPageBreak/>
+        <w:drawing>
+          <wp:inline distT="0" distB="0" distL="0" distR="0" wp14:anchorId="0CF2678E" wp14:editId="2E6053CF">
+            <wp:extent cx="6645910" cy="3155315"/>
+            <wp:effectExtent l="0" t="0" r="2540" b="6985"/>
+            <wp:docPr id="84969935" name="Imagem 1"/>
+            <wp:cNvGraphicFramePr>
+              <a:graphicFrameLocks xmlns:a="http://schemas.openxmlformats.org/drawingml/2006/main" noChangeAspect="1"/>
+            </wp:cNvGraphicFramePr>
+            <a:graphic xmlns:a="http://schemas.openxmlformats.org/drawingml/2006/main">
+              <a:graphicData uri="http://schemas.openxmlformats.org/drawingml/2006/picture">
+                <pic:pic xmlns:pic="http://schemas.openxmlformats.org/drawingml/2006/picture">
+                  <pic:nvPicPr>
+                    <pic:cNvPr id="84969935" name=""/>
+                    <pic:cNvPicPr/>
+                  </pic:nvPicPr>
+                  <pic:blipFill>
+                    <a:blip r:embed="rId63"/>
+                    <a:stretch>
+                      <a:fillRect/>
+                    </a:stretch>
+                  </pic:blipFill>
+                  <pic:spPr>
+                    <a:xfrm>
+                      <a:off x="0" y="0"/>
+                      <a:ext cx="6645910" cy="3155315"/>
+                    </a:xfrm>
+                    <a:prstGeom prst="rect">
+                      <a:avLst/>
+                    </a:prstGeom>
+                  </pic:spPr>
+                </pic:pic>
+              </a:graphicData>
+            </a:graphic>
+          </wp:inline>
+        </w:drawing>
+      </w:r>
+      <w:r>
+        <w:rPr>
+          <w:sz w:val="36"/>
+          <w:szCs w:val="36"/>
+        </w:rPr>
+        <w:drawing>
+          <wp:inline distT="0" distB="0" distL="0" distR="0" wp14:anchorId="4ADCDD04" wp14:editId="5403E706">
+            <wp:extent cx="6645910" cy="2901950"/>
+            <wp:effectExtent l="0" t="0" r="2540" b="0"/>
+            <wp:docPr id="1410312219" name="Imagem 1"/>
+            <wp:cNvGraphicFramePr>
+              <a:graphicFrameLocks xmlns:a="http://schemas.openxmlformats.org/drawingml/2006/main" noChangeAspect="1"/>
+            </wp:cNvGraphicFramePr>
+            <a:graphic xmlns:a="http://schemas.openxmlformats.org/drawingml/2006/main">
+              <a:graphicData uri="http://schemas.openxmlformats.org/drawingml/2006/picture">
+                <pic:pic xmlns:pic="http://schemas.openxmlformats.org/drawingml/2006/picture">
+                  <pic:nvPicPr>
+                    <pic:cNvPr id="1410312219" name=""/>
+                    <pic:cNvPicPr/>
+                  </pic:nvPicPr>
+                  <pic:blipFill rotWithShape="1">
+                    <a:blip r:embed="rId64"/>
+                    <a:srcRect t="7302"/>
+                    <a:stretch>
+                      <a:fillRect/>
+                    </a:stretch>
+                  </pic:blipFill>
+                  <pic:spPr bwMode="auto">
+                    <a:xfrm>
+                      <a:off x="0" y="0"/>
+                      <a:ext cx="6645910" cy="2901950"/>
+                    </a:xfrm>
+                    <a:prstGeom prst="rect">
+                      <a:avLst/>
+                    </a:prstGeom>
+                    <a:ln>
+                      <a:noFill/>
+                    </a:ln>
+                    <a:extLst>
+                      <a:ext uri="{53640926-AAD7-44D8-BBD7-CCE9431645EC}">
+                        <a14:shadowObscured xmlns:a14="http://schemas.microsoft.com/office/drawing/2010/main"/>
+                      </a:ext>
+                    </a:extLst>
+                  </pic:spPr>
+                </pic:pic>
+              </a:graphicData>
+            </a:graphic>
+          </wp:inline>
+        </w:drawing>
+      </w:r>
+    </w:p>
+    <w:p>
+      <w:pPr>
+        <w:spacing w:after="0"/>
+        <w:jc w:val="center"/>
+        <w:rPr>
+          <w:sz w:val="36"/>
+          <w:szCs w:val="36"/>
+        </w:rPr>
+      </w:pPr>
+      <w:r>
+        <w:rPr>
+          <w:sz w:val="36"/>
+          <w:szCs w:val="36"/>
+        </w:rPr>
+        <w:t xml:space="preserve">Legenda: </w:t>
+      </w:r>
+      <w:r>
+        <w:rPr>
+          <w:sz w:val="36"/>
+          <w:szCs w:val="36"/>
+        </w:rPr>
+        <w:t>Visão do</w:t>
+      </w:r>
+      <w:r>
+        <w:rPr>
+          <w:sz w:val="36"/>
+          <w:szCs w:val="36"/>
+        </w:rPr>
+        <w:t xml:space="preserve"> histórico de movimentações/ações realizadas no sistema (log) para análise do que foi feito e possibilidade de auditoria, se necessário</w:t>
+      </w:r>
+      <w:r>
+        <w:rPr>
+          <w:sz w:val="36"/>
+          <w:szCs w:val="36"/>
+        </w:rPr>
+        <w:t>.</w:t>
+      </w:r>
+    </w:p>
+    <w:p>
+      <w:pPr>
+        <w:spacing w:after="0"/>
+        <w:jc w:val="center"/>
+        <w:rPr>
+          <w:sz w:val="36"/>
+          <w:szCs w:val="36"/>
+        </w:rPr>
+      </w:pPr>
+    </w:p>
+    <w:p>
+      <w:pPr>
+        <w:spacing w:after="0"/>
+        <w:rPr>
+          <w:sz w:val="36"/>
+          <w:szCs w:val="36"/>
+        </w:rPr>
+      </w:pPr>
+      <w:r>
+        <w:rPr>
+          <w:sz w:val="36"/>
+          <w:szCs w:val="36"/>
+        </w:rPr>
+        <w:t>Finalizado a elaboração dos protótipos de interface, foi encaminhado para análise do requisitante, no qual expressou aprovação e satisfação com a projeção do software.</w:t>
+      </w:r>
     </w:p>
     <w:p>
       <w:pPr>
@@ -6984,6 +9358,7 @@
           <w:szCs w:val="36"/>
           <w:lang w:eastAsia="pt-BR"/>
         </w:rPr>
+        <w:lastRenderedPageBreak/>
         <w:t>Com este documento pronto, estamos aptos a avançar para:</w:t>
       </w:r>
     </w:p>
@@ -7014,7 +9389,6 @@
           <w:bdr w:val="none" w:sz="0" w:space="0" w:color="auto" w:frame="1"/>
           <w:lang w:eastAsia="pt-BR"/>
         </w:rPr>
-        <w:lastRenderedPageBreak/>
         <w:t xml:space="preserve">Modelagem do banco de dados: </w:t>
       </w:r>
       <w:r>
@@ -7245,8 +9619,8 @@
       </w:r>
     </w:p>
     <w:sectPr>
-      <w:headerReference w:type="default" r:id="rId35"/>
-      <w:footerReference w:type="default" r:id="rId36"/>
+      <w:headerReference w:type="default" r:id="rId65"/>
+      <w:footerReference w:type="default" r:id="rId66"/>
       <w:pgSz w:w="11906" w:h="16838"/>
       <w:pgMar w:top="1560" w:right="720" w:bottom="720" w:left="720" w:header="283" w:footer="0" w:gutter="0"/>
       <w:cols w:space="708"/>

</xml_diff>